<commit_message>
Enhance Wasswa Wilson CV with updated content and design specifications
This commit updates the Wasswa Wilson CV by revising the professional profile, career highlights, and technical skills sections for clarity and impact. Key changes include a refined narrative of professional experience, the addition of new achievements, and adjustments to formatting for improved readability. The design notes in the build script have also been expanded to detail the visual elements of the CV, ensuring consistency with the overall branding of FairBanks documents.
</commit_message>
<xml_diff>
--- a/wilson/cv-2026/Wasswa_Wilson_CV_2026.docx
+++ b/wilson/cv-2026/Wasswa_Wilson_CV_2026.docx
@@ -2,44 +2,80 @@
 <file path=word/document.xml><?xml version="1.0" encoding="utf-8"?>
 <w:document xmlns:wpc="http://schemas.microsoft.com/office/word/2010/wordprocessingCanvas" xmlns:mo="http://schemas.microsoft.com/office/mac/office/2008/main" xmlns:mc="http://schemas.openxmlformats.org/markup-compatibility/2006" xmlns:mv="urn:schemas-microsoft-com:mac:vml" xmlns:o="urn:schemas-microsoft-com:office:office" xmlns:r="http://schemas.openxmlformats.org/officeDocument/2006/relationships" xmlns:m="http://schemas.openxmlformats.org/officeDocument/2006/math" xmlns:v="urn:schemas-microsoft-com:vml" xmlns:wp14="http://schemas.microsoft.com/office/word/2010/wordprocessingDrawing" xmlns:wp="http://schemas.openxmlformats.org/drawingml/2006/wordprocessingDrawing" xmlns:w10="urn:schemas-microsoft-com:office:word" xmlns:w="http://schemas.openxmlformats.org/wordprocessingml/2006/main" xmlns:w14="http://schemas.microsoft.com/office/word/2010/wordml" xmlns:wpg="http://schemas.microsoft.com/office/word/2010/wordprocessingGroup" xmlns:wpi="http://schemas.microsoft.com/office/word/2010/wordprocessingInk" xmlns:wne="http://schemas.microsoft.com/office/word/2006/wordml" xmlns:wps="http://schemas.microsoft.com/office/word/2010/wordprocessingShape" mc:Ignorable="w14 wp14">
   <w:body>
+    <w:tbl>
+      <w:tblPr>
+        <w:tblW w:type="auto" w:w="0"/>
+        <w:jc w:val="left"/>
+        <w:tblLayout w:type="fixed"/>
+        <w:tblLook w:firstColumn="1" w:firstRow="1" w:lastColumn="0" w:lastRow="0" w:noHBand="0" w:noVBand="1" w:val="04A0"/>
+        <w:tblBorders>
+          <w:top w:val="none" w:sz="0"/>
+          <w:left w:val="none" w:sz="0"/>
+          <w:bottom w:val="none" w:sz="0"/>
+          <w:right w:val="none" w:sz="0"/>
+          <w:insideH w:val="none" w:sz="0"/>
+          <w:insideV w:val="none" w:sz="0"/>
+        </w:tblBorders>
+        <w:tblCellMar>
+          <w:top w:w="170" w:type="dxa"/>
+          <w:left w:w="120" w:type="dxa"/>
+          <w:bottom w:w="170" w:type="dxa"/>
+          <w:right w:w="120" w:type="dxa"/>
+        </w:tblCellMar>
+      </w:tblPr>
+      <w:tblGrid>
+        <w:gridCol w:w="10239"/>
+      </w:tblGrid>
+      <w:tr>
+        <w:tc>
+          <w:tcPr>
+            <w:tcW w:type="dxa" w:w="10238"/>
+            <w:shd w:val="clear" w:color="auto" w:fill="0F2C4C"/>
+            <w:tcBorders>
+              <w:bottom w:val="single" w:sz="26" w:space="0" w:color="1A6B5C"/>
+            </w:tcBorders>
+          </w:tcPr>
+          <w:p>
+            <w:pPr>
+              <w:spacing w:after="60" w:line="240" w:lineRule="auto"/>
+              <w:jc w:val="center"/>
+            </w:pPr>
+            <w:r>
+              <w:rPr>
+                <w:rFonts w:ascii="Calibri" w:hAnsi="Calibri"/>
+                <w:b/>
+                <w:i w:val="0"/>
+                <w:color w:val="FFFFFF"/>
+                <w:sz w:val="46"/>
+                <w:rFonts w:ascii="Calibri" w:hAnsi="Calibri" w:cs="Calibri"/>
+                <w:spacing w:val="48"/>
+              </w:rPr>
+              <w:t>WASSWA WILSON</w:t>
+            </w:r>
+          </w:p>
+          <w:p>
+            <w:pPr>
+              <w:spacing w:after="0" w:line="240" w:lineRule="auto"/>
+              <w:jc w:val="center"/>
+            </w:pPr>
+            <w:r>
+              <w:rPr>
+                <w:rFonts w:ascii="Calibri" w:hAnsi="Calibri"/>
+                <w:b/>
+                <w:i w:val="0"/>
+                <w:color w:val="9FD6C8"/>
+                <w:sz w:val="19"/>
+                <w:rFonts w:ascii="Calibri" w:hAnsi="Calibri" w:cs="Calibri"/>
+              </w:rPr>
+              <w:t>Biomedical Engineer  ·  Full-Stack Software Developer  ·  Health Technology Programme Lead</w:t>
+            </w:r>
+          </w:p>
+        </w:tc>
+      </w:tr>
+    </w:tbl>
     <w:p>
       <w:pPr>
-        <w:spacing w:before="0" w:after="20" w:line="254" w:lineRule="auto"/>
-        <w:jc w:val="center"/>
-      </w:pPr>
-      <w:r>
-        <w:rPr>
-          <w:rFonts w:ascii="Calibri" w:hAnsi="Calibri"/>
-          <w:b/>
-          <w:i w:val="0"/>
-          <w:color w:val="0F2C4C"/>
-          <w:sz w:val="46"/>
-          <w:rFonts w:ascii="Calibri" w:hAnsi="Calibri" w:cs="Calibri"/>
-          <w:spacing w:val="36"/>
-        </w:rPr>
-        <w:t>WASSWA WILSON</w:t>
-      </w:r>
-    </w:p>
-    <w:p>
-      <w:pPr>
-        <w:spacing w:before="0" w:after="100" w:line="254" w:lineRule="auto"/>
-        <w:jc w:val="center"/>
-      </w:pPr>
-      <w:r>
-        <w:rPr>
-          <w:rFonts w:ascii="Calibri" w:hAnsi="Calibri"/>
-          <w:b/>
-          <w:i w:val="0"/>
-          <w:color w:val="1A6B5C"/>
-          <w:sz w:val="20"/>
-          <w:rFonts w:ascii="Calibri" w:hAnsi="Calibri" w:cs="Calibri"/>
-        </w:rPr>
-        <w:t>Biomedical Engineer  ·  Full-Stack Software Developer  ·  Health Technology Programme Lead</w:t>
-      </w:r>
-    </w:p>
-    <w:p>
-      <w:pPr>
-        <w:spacing w:before="0" w:after="30" w:line="254" w:lineRule="auto"/>
+        <w:spacing w:before="120" w:after="30" w:line="245" w:lineRule="auto"/>
         <w:jc w:val="center"/>
       </w:pPr>
       <w:r>
@@ -51,33 +87,13 @@
           <w:sz w:val="18"/>
           <w:rFonts w:ascii="Calibri" w:hAnsi="Calibri" w:cs="Calibri"/>
         </w:rPr>
-        <w:t>Kampala, Uganda   ·   Available for regional and remote engagements</w:t>
+        <w:t>Kampala, Uganda   ·   wasswawilson0001@gmail.com   ·   +256 783 230 321</w:t>
       </w:r>
     </w:p>
     <w:p>
       <w:pPr>
-        <w:spacing w:before="0" w:after="30" w:line="254" w:lineRule="auto"/>
+        <w:spacing w:before="0" w:after="30" w:line="245" w:lineRule="auto"/>
         <w:jc w:val="center"/>
-      </w:pPr>
-      <w:r>
-        <w:rPr>
-          <w:rFonts w:ascii="Calibri" w:hAnsi="Calibri"/>
-          <w:b w:val="0"/>
-          <w:i w:val="0"/>
-          <w:color w:val="5A6472"/>
-          <w:sz w:val="18"/>
-          <w:rFonts w:ascii="Calibri" w:hAnsi="Calibri" w:cs="Calibri"/>
-        </w:rPr>
-        <w:t>wasswawilson0002@gmail.com   ·   +256 753 113 200   ·   +256 783 230 321</w:t>
-      </w:r>
-    </w:p>
-    <w:p>
-      <w:pPr>
-        <w:spacing w:before="0" w:after="0" w:line="254" w:lineRule="auto"/>
-        <w:jc w:val="center"/>
-        <w:pBdr>
-          <w:bottom w:val="single" w:sz="12" w:space="6" w:color="0F2C4C"/>
-        </w:pBdr>
       </w:pPr>
       <w:r>
         <w:rPr>
@@ -94,9 +110,11 @@
     <w:p>
       <w:pPr>
         <w:keepNext/>
-        <w:spacing w:before="220" w:after="100" w:line="254" w:lineRule="auto"/>
+        <w:spacing w:before="180" w:after="90" w:line="245" w:lineRule="auto"/>
+        <w:ind w:left="158"/>
         <w:pBdr>
-          <w:bottom w:val="single" w:sz="8" w:space="3" w:color="1A6B5C"/>
+          <w:left w:val="single" w:sz="22" w:space="6" w:color="1A6B5C"/>
+          <w:bottom w:val="single" w:sz="4" w:space="4" w:color="CFD8E3"/>
         </w:pBdr>
       </w:pPr>
       <w:r>
@@ -107,14 +125,14 @@
           <w:color w:val="0F2C4C"/>
           <w:sz w:val="21"/>
           <w:rFonts w:ascii="Calibri" w:hAnsi="Calibri" w:cs="Calibri"/>
-          <w:spacing w:val="24"/>
+          <w:spacing w:val="26"/>
         </w:rPr>
         <w:t>PROFESSIONAL PROFILE</w:t>
       </w:r>
     </w:p>
     <w:p>
       <w:pPr>
-        <w:spacing w:before="0" w:after="40" w:line="254" w:lineRule="auto"/>
+        <w:spacing w:before="0" w:after="40" w:line="245" w:lineRule="auto"/>
         <w:jc w:val="both"/>
       </w:pPr>
       <w:r>
@@ -126,15 +144,17 @@
           <w:sz w:val="19"/>
           <w:rFonts w:ascii="Calibri" w:hAnsi="Calibri" w:cs="Calibri"/>
         </w:rPr>
-        <w:t>Biomedical engineer and full-stack software developer with over nine years of professional experience spanning hospital technology, health information systems and applied software engineering. I currently lead development of the FairBanks Community Health Intelligence Platform (FCHIP), owning the data capture tools, database design, cloud data flows and management dashboards end to end. Before that I managed the Gould Family Foundation biomedical programme across East and Central Africa and ran the biomedical function at International Hospital Kampala through successful COHSASA accreditation. I build in Java, Python, JavaScript and TypeScript across React, Next.js, React Native, Node.js and Express, and I design AI agents and automation pipelines that are running in production today. I am equally comfortable commissioning equipment on a hospital floor, architecting a codebase, and writing the funding proposal that pays for both.</w:t>
+        <w:t>I am a biomedical engineer and full-stack software developer based in Kampala, with over nine years of work across hospital technology, health information systems and software engineering. I lead development of the FairBanks Community Health Intelligence Platform (FCHIP), where I handle the data capture tools, the database, the cloud data flows and the management dashboards. Alongside it I am building a cross-sector application that collects field data and generates finished reports in real time, for accounting, research, biology, agriculture, social media and other record-heavy work. Before FairBanks I managed the Gould Family Foundation biomedical programme across East and Central Africa, and ran the biomedical function at International Hospital Kampala through the COVID-19 response and through successful COHSASA accreditation. I write Java, Python, JavaScript and TypeScript, work across React, Next.js, React Native, Node.js and Express, and design AI agents and automations that are running in production today.</w:t>
       </w:r>
     </w:p>
     <w:p>
       <w:pPr>
         <w:keepNext/>
-        <w:spacing w:before="220" w:after="100" w:line="254" w:lineRule="auto"/>
+        <w:spacing w:before="180" w:after="90" w:line="245" w:lineRule="auto"/>
+        <w:ind w:left="158"/>
         <w:pBdr>
-          <w:bottom w:val="single" w:sz="8" w:space="3" w:color="1A6B5C"/>
+          <w:left w:val="single" w:sz="22" w:space="6" w:color="1A6B5C"/>
+          <w:bottom w:val="single" w:sz="4" w:space="4" w:color="CFD8E3"/>
         </w:pBdr>
       </w:pPr>
       <w:r>
@@ -145,191 +165,258 @@
           <w:color w:val="0F2C4C"/>
           <w:sz w:val="21"/>
           <w:rFonts w:ascii="Calibri" w:hAnsi="Calibri" w:cs="Calibri"/>
-          <w:spacing w:val="24"/>
+          <w:spacing w:val="26"/>
         </w:rPr>
-        <w:t>SIGNATURE ACHIEVEMENTS</w:t>
+        <w:t>CAREER HIGHLIGHTS</w:t>
       </w:r>
     </w:p>
-    <w:p>
-      <w:pPr>
-        <w:spacing w:before="0" w:after="50" w:line="254" w:lineRule="auto"/>
-        <w:ind w:left="288" w:hanging="230"/>
-        <w:jc w:val="both"/>
-      </w:pPr>
-      <w:r>
-        <w:rPr>
-          <w:rFonts w:ascii="Calibri" w:hAnsi="Calibri"/>
-          <w:b/>
-          <w:i w:val="0"/>
-          <w:color w:val="1A6B5C"/>
-          <w:sz w:val="19"/>
-          <w:rFonts w:ascii="Calibri" w:hAnsi="Calibri" w:cs="Calibri"/>
-        </w:rPr>
-        <w:t xml:space="preserve">•   </w:t>
-      </w:r>
-      <w:r>
-        <w:rPr>
-          <w:rFonts w:ascii="Calibri" w:hAnsi="Calibri"/>
-          <w:b w:val="0"/>
-          <w:i w:val="0"/>
-          <w:color w:val="23272B"/>
-          <w:sz w:val="19"/>
-          <w:rFonts w:ascii="Calibri" w:hAnsi="Calibri" w:cs="Calibri"/>
-        </w:rPr>
-        <w:t>Lead developer of FCHIP, the FairBanks Community Health Intelligence Platform — community screening, referral and follow-up data capture, database, cloud sync and reporting dashboards, delivered across web and mobile.</w:t>
-      </w:r>
-    </w:p>
-    <w:p>
-      <w:pPr>
-        <w:spacing w:before="0" w:after="50" w:line="254" w:lineRule="auto"/>
-        <w:ind w:left="288" w:hanging="230"/>
-        <w:jc w:val="both"/>
-      </w:pPr>
-      <w:r>
-        <w:rPr>
-          <w:rFonts w:ascii="Calibri" w:hAnsi="Calibri"/>
-          <w:b/>
-          <w:i w:val="0"/>
-          <w:color w:val="1A6B5C"/>
-          <w:sz w:val="19"/>
-          <w:rFonts w:ascii="Calibri" w:hAnsi="Calibri" w:cs="Calibri"/>
-        </w:rPr>
-        <w:t xml:space="preserve">•   </w:t>
-      </w:r>
-      <w:r>
-        <w:rPr>
-          <w:rFonts w:ascii="Calibri" w:hAnsi="Calibri"/>
-          <w:b w:val="0"/>
-          <w:i w:val="0"/>
-          <w:color w:val="23272B"/>
-          <w:sz w:val="19"/>
-          <w:rFonts w:ascii="Calibri" w:hAnsi="Calibri" w:cs="Calibri"/>
-        </w:rPr>
-        <w:t>Designed, built and deployed an AI reception agent for a law firm in Texas, USA — it handles live inbound client calls, books and reschedules appointments, and runs client follow-up. In active production use.</w:t>
-      </w:r>
-    </w:p>
-    <w:p>
-      <w:pPr>
-        <w:spacing w:before="0" w:after="50" w:line="254" w:lineRule="auto"/>
-        <w:ind w:left="288" w:hanging="230"/>
-        <w:jc w:val="both"/>
-      </w:pPr>
-      <w:r>
-        <w:rPr>
-          <w:rFonts w:ascii="Calibri" w:hAnsi="Calibri"/>
-          <w:b/>
-          <w:i w:val="0"/>
-          <w:color w:val="1A6B5C"/>
-          <w:sz w:val="19"/>
-          <w:rFonts w:ascii="Calibri" w:hAnsi="Calibri" w:cs="Calibri"/>
-        </w:rPr>
-        <w:t xml:space="preserve">•   </w:t>
-      </w:r>
-      <w:r>
-        <w:rPr>
-          <w:rFonts w:ascii="Calibri" w:hAnsi="Calibri"/>
-          <w:b w:val="0"/>
-          <w:i w:val="0"/>
-          <w:color w:val="23272B"/>
-          <w:sz w:val="19"/>
-          <w:rFonts w:ascii="Calibri" w:hAnsi="Calibri" w:cs="Calibri"/>
-        </w:rPr>
-        <w:t>Delivered hospital technology projects in five countries — Uganda, the Democratic Republic of Congo, Kenya, Tanzania and Somaliland — including laboratory, theatre and radiology installations at the hospital serving the Kibali Gold Mine, DR Congo.</w:t>
-      </w:r>
-    </w:p>
-    <w:p>
-      <w:pPr>
-        <w:spacing w:before="0" w:after="50" w:line="254" w:lineRule="auto"/>
-        <w:ind w:left="288" w:hanging="230"/>
-        <w:jc w:val="both"/>
-      </w:pPr>
-      <w:r>
-        <w:rPr>
-          <w:rFonts w:ascii="Calibri" w:hAnsi="Calibri"/>
-          <w:b/>
-          <w:i w:val="0"/>
-          <w:color w:val="1A6B5C"/>
-          <w:sz w:val="19"/>
-          <w:rFonts w:ascii="Calibri" w:hAnsi="Calibri" w:cs="Calibri"/>
-        </w:rPr>
-        <w:t xml:space="preserve">•   </w:t>
-      </w:r>
-      <w:r>
-        <w:rPr>
-          <w:rFonts w:ascii="Calibri" w:hAnsi="Calibri"/>
-          <w:b w:val="0"/>
-          <w:i w:val="0"/>
-          <w:color w:val="23272B"/>
-          <w:sz w:val="19"/>
-          <w:rFonts w:ascii="Calibri" w:hAnsi="Calibri" w:cs="Calibri"/>
-        </w:rPr>
-        <w:t>Prepared and maintained the biomedical compliance evidence that carried International Hospital Kampala through successful COHSASA accreditation, and cut equipment downtime with a documented preventive maintenance programme.</w:t>
-      </w:r>
-    </w:p>
-    <w:p>
-      <w:pPr>
-        <w:spacing w:before="0" w:after="50" w:line="254" w:lineRule="auto"/>
-        <w:ind w:left="288" w:hanging="230"/>
-        <w:jc w:val="both"/>
-      </w:pPr>
-      <w:r>
-        <w:rPr>
-          <w:rFonts w:ascii="Calibri" w:hAnsi="Calibri"/>
-          <w:b/>
-          <w:i w:val="0"/>
-          <w:color w:val="1A6B5C"/>
-          <w:sz w:val="19"/>
-          <w:rFonts w:ascii="Calibri" w:hAnsi="Calibri" w:cs="Calibri"/>
-        </w:rPr>
-        <w:t xml:space="preserve">•   </w:t>
-      </w:r>
-      <w:r>
-        <w:rPr>
-          <w:rFonts w:ascii="Calibri" w:hAnsi="Calibri"/>
-          <w:b w:val="0"/>
-          <w:i w:val="0"/>
-          <w:color w:val="23272B"/>
-          <w:sz w:val="19"/>
-          <w:rFonts w:ascii="Calibri" w:hAnsi="Calibri" w:cs="Calibri"/>
-        </w:rPr>
-        <w:t>Upgraded partner health facilities across East and Central Africa for the Gould Family Foundation, including the neonatal intensive care unit at Mama Lucy Kibaki Hospital, Nairobi.</w:t>
-      </w:r>
-    </w:p>
-    <w:p>
-      <w:pPr>
-        <w:spacing w:before="0" w:after="50" w:line="254" w:lineRule="auto"/>
-        <w:ind w:left="288" w:hanging="230"/>
-        <w:jc w:val="both"/>
-      </w:pPr>
-      <w:r>
-        <w:rPr>
-          <w:rFonts w:ascii="Calibri" w:hAnsi="Calibri"/>
-          <w:b/>
-          <w:i w:val="0"/>
-          <w:color w:val="1A6B5C"/>
-          <w:sz w:val="19"/>
-          <w:rFonts w:ascii="Calibri" w:hAnsi="Calibri" w:cs="Calibri"/>
-        </w:rPr>
-        <w:t xml:space="preserve">•   </w:t>
-      </w:r>
-      <w:r>
-        <w:rPr>
-          <w:rFonts w:ascii="Calibri" w:hAnsi="Calibri"/>
-          <w:b w:val="0"/>
-          <w:i w:val="0"/>
-          <w:color w:val="23272B"/>
-          <w:sz w:val="19"/>
-          <w:rFonts w:ascii="Calibri" w:hAnsi="Calibri" w:cs="Calibri"/>
-        </w:rPr>
-        <w:t>Author of institutional proposals, grant applications and partnership documents for FairBanks Medical Centre; chaired the FairBanks / Uganda Health Partners Cooperative meeting on cooperative health insurance in July 2026.</w:t>
-      </w:r>
-    </w:p>
+    <w:tbl>
+      <w:tblPr>
+        <w:tblW w:type="auto" w:w="0"/>
+        <w:jc w:val="left"/>
+        <w:tblLayout w:type="fixed"/>
+        <w:tblLook w:firstColumn="1" w:firstRow="1" w:lastColumn="0" w:lastRow="0" w:noHBand="0" w:noVBand="1" w:val="04A0"/>
+        <w:tblBorders>
+          <w:top w:val="none" w:sz="0"/>
+          <w:left w:val="none" w:sz="0"/>
+          <w:bottom w:val="none" w:sz="0"/>
+          <w:right w:val="none" w:sz="0"/>
+          <w:insideH w:val="none" w:sz="0"/>
+          <w:insideV w:val="none" w:sz="0"/>
+        </w:tblBorders>
+        <w:tblCellMar>
+          <w:top w:w="110" w:type="dxa"/>
+          <w:left w:w="150" w:type="dxa"/>
+          <w:bottom w:w="110" w:type="dxa"/>
+          <w:right w:w="130" w:type="dxa"/>
+        </w:tblCellMar>
+      </w:tblPr>
+      <w:tblGrid>
+        <w:gridCol w:w="10239"/>
+      </w:tblGrid>
+      <w:tr>
+        <w:tc>
+          <w:tcPr>
+            <w:tcW w:type="dxa" w:w="10238"/>
+            <w:shd w:val="clear" w:color="auto" w:fill="F3F6F9"/>
+            <w:tcBorders>
+              <w:left w:val="single" w:sz="26" w:space="0" w:color="1A6B5C"/>
+            </w:tcBorders>
+          </w:tcPr>
+          <w:p>
+            <w:pPr>
+              <w:spacing w:before="0" w:after="68" w:line="245" w:lineRule="auto"/>
+              <w:ind w:left="259" w:hanging="230"/>
+              <w:jc w:val="both"/>
+            </w:pPr>
+            <w:r>
+              <w:rPr>
+                <w:rFonts w:ascii="Calibri" w:hAnsi="Calibri"/>
+                <w:b/>
+                <w:i w:val="0"/>
+                <w:color w:val="1A6B5C"/>
+                <w:sz w:val="19"/>
+                <w:rFonts w:ascii="Calibri" w:hAnsi="Calibri" w:cs="Calibri"/>
+              </w:rPr>
+              <w:t xml:space="preserve">•   </w:t>
+            </w:r>
+            <w:r>
+              <w:rPr>
+                <w:rFonts w:ascii="Calibri" w:hAnsi="Calibri"/>
+                <w:b w:val="0"/>
+                <w:i w:val="0"/>
+                <w:color w:val="23272B"/>
+                <w:sz w:val="19"/>
+                <w:rFonts w:ascii="Calibri" w:hAnsi="Calibri" w:cs="Calibri"/>
+              </w:rPr>
+              <w:t>Lead developer of FCHIP, the FairBanks Community Health Intelligence Platform: community screening, referral and follow-up data capture, database, cloud sync and reporting dashboards, delivered across web and mobile.</w:t>
+            </w:r>
+          </w:p>
+          <w:p>
+            <w:pPr>
+              <w:spacing w:before="0" w:after="68" w:line="245" w:lineRule="auto"/>
+              <w:ind w:left="259" w:hanging="230"/>
+              <w:jc w:val="both"/>
+            </w:pPr>
+            <w:r>
+              <w:rPr>
+                <w:rFonts w:ascii="Calibri" w:hAnsi="Calibri"/>
+                <w:b/>
+                <w:i w:val="0"/>
+                <w:color w:val="1A6B5C"/>
+                <w:sz w:val="19"/>
+                <w:rFonts w:ascii="Calibri" w:hAnsi="Calibri" w:cs="Calibri"/>
+              </w:rPr>
+              <w:t xml:space="preserve">•   </w:t>
+            </w:r>
+            <w:r>
+              <w:rPr>
+                <w:rFonts w:ascii="Calibri" w:hAnsi="Calibri"/>
+                <w:b w:val="0"/>
+                <w:i w:val="0"/>
+                <w:color w:val="23272B"/>
+                <w:sz w:val="19"/>
+                <w:rFonts w:ascii="Calibri" w:hAnsi="Calibri" w:cs="Calibri"/>
+              </w:rPr>
+              <w:t>Building a cross-sector data collection and reporting application that writes the report as the user works, instead of leaving it to be compiled afterwards. Aimed at accounting, research, biology, agriculture, social media and similar fields.</w:t>
+            </w:r>
+          </w:p>
+          <w:p>
+            <w:pPr>
+              <w:spacing w:before="0" w:after="68" w:line="245" w:lineRule="auto"/>
+              <w:ind w:left="259" w:hanging="230"/>
+              <w:jc w:val="both"/>
+            </w:pPr>
+            <w:r>
+              <w:rPr>
+                <w:rFonts w:ascii="Calibri" w:hAnsi="Calibri"/>
+                <w:b/>
+                <w:i w:val="0"/>
+                <w:color w:val="1A6B5C"/>
+                <w:sz w:val="19"/>
+                <w:rFonts w:ascii="Calibri" w:hAnsi="Calibri" w:cs="Calibri"/>
+              </w:rPr>
+              <w:t xml:space="preserve">•   </w:t>
+            </w:r>
+            <w:r>
+              <w:rPr>
+                <w:rFonts w:ascii="Calibri" w:hAnsi="Calibri"/>
+                <w:b w:val="0"/>
+                <w:i w:val="0"/>
+                <w:color w:val="23272B"/>
+                <w:sz w:val="19"/>
+                <w:rFonts w:ascii="Calibri" w:hAnsi="Calibri" w:cs="Calibri"/>
+              </w:rPr>
+              <w:t>Developed the oxygen consumption formulas used to calculate patient demand during the COVID-19 response at International Hospital Kampala, and in support of Ministry of Health oxygen planning. The same method fed into capacity planning for later facility projects.</w:t>
+            </w:r>
+          </w:p>
+          <w:p>
+            <w:pPr>
+              <w:spacing w:before="0" w:after="68" w:line="245" w:lineRule="auto"/>
+              <w:ind w:left="259" w:hanging="230"/>
+              <w:jc w:val="both"/>
+            </w:pPr>
+            <w:r>
+              <w:rPr>
+                <w:rFonts w:ascii="Calibri" w:hAnsi="Calibri"/>
+                <w:b/>
+                <w:i w:val="0"/>
+                <w:color w:val="1A6B5C"/>
+                <w:sz w:val="19"/>
+                <w:rFonts w:ascii="Calibri" w:hAnsi="Calibri" w:cs="Calibri"/>
+              </w:rPr>
+              <w:t xml:space="preserve">•   </w:t>
+            </w:r>
+            <w:r>
+              <w:rPr>
+                <w:rFonts w:ascii="Calibri" w:hAnsi="Calibri"/>
+                <w:b w:val="0"/>
+                <w:i w:val="0"/>
+                <w:color w:val="23272B"/>
+                <w:sz w:val="19"/>
+                <w:rFonts w:ascii="Calibri" w:hAnsi="Calibri" w:cs="Calibri"/>
+              </w:rPr>
+              <w:t>Designed, built and deployed an AI reception agent for a law firm in Texas, USA. It handles live inbound client calls, books and reschedules appointments, and runs client follow-up. In active production use.</w:t>
+            </w:r>
+          </w:p>
+          <w:p>
+            <w:pPr>
+              <w:spacing w:before="0" w:after="68" w:line="245" w:lineRule="auto"/>
+              <w:ind w:left="259" w:hanging="230"/>
+              <w:jc w:val="both"/>
+            </w:pPr>
+            <w:r>
+              <w:rPr>
+                <w:rFonts w:ascii="Calibri" w:hAnsi="Calibri"/>
+                <w:b/>
+                <w:i w:val="0"/>
+                <w:color w:val="1A6B5C"/>
+                <w:sz w:val="19"/>
+                <w:rFonts w:ascii="Calibri" w:hAnsi="Calibri" w:cs="Calibri"/>
+              </w:rPr>
+              <w:t xml:space="preserve">•   </w:t>
+            </w:r>
+            <w:r>
+              <w:rPr>
+                <w:rFonts w:ascii="Calibri" w:hAnsi="Calibri"/>
+                <w:b w:val="0"/>
+                <w:i w:val="0"/>
+                <w:color w:val="23272B"/>
+                <w:sz w:val="19"/>
+                <w:rFonts w:ascii="Calibri" w:hAnsi="Calibri" w:cs="Calibri"/>
+              </w:rPr>
+              <w:t>Delivered hospital technology projects in five countries: Uganda, the Democratic Republic of Congo, Kenya, Tanzania and Somaliland. This included laboratory, theatre and radiology installations at the hospital serving the Kibali Gold Mine, DR Congo.</w:t>
+            </w:r>
+          </w:p>
+          <w:p>
+            <w:pPr>
+              <w:spacing w:before="0" w:after="68" w:line="245" w:lineRule="auto"/>
+              <w:ind w:left="259" w:hanging="230"/>
+              <w:jc w:val="both"/>
+            </w:pPr>
+            <w:r>
+              <w:rPr>
+                <w:rFonts w:ascii="Calibri" w:hAnsi="Calibri"/>
+                <w:b/>
+                <w:i w:val="0"/>
+                <w:color w:val="1A6B5C"/>
+                <w:sz w:val="19"/>
+                <w:rFonts w:ascii="Calibri" w:hAnsi="Calibri" w:cs="Calibri"/>
+              </w:rPr>
+              <w:t xml:space="preserve">•   </w:t>
+            </w:r>
+            <w:r>
+              <w:rPr>
+                <w:rFonts w:ascii="Calibri" w:hAnsi="Calibri"/>
+                <w:b w:val="0"/>
+                <w:i w:val="0"/>
+                <w:color w:val="23272B"/>
+                <w:sz w:val="19"/>
+                <w:rFonts w:ascii="Calibri" w:hAnsi="Calibri" w:cs="Calibri"/>
+              </w:rPr>
+              <w:t>Prepared and maintained the biomedical compliance evidence that carried International Hospital Kampala through successful COHSASA accreditation, and cut equipment downtime with a documented preventive maintenance programme.</w:t>
+            </w:r>
+          </w:p>
+          <w:p>
+            <w:pPr>
+              <w:spacing w:before="0" w:after="0" w:line="245" w:lineRule="auto"/>
+              <w:ind w:left="259" w:hanging="230"/>
+              <w:jc w:val="both"/>
+            </w:pPr>
+            <w:r>
+              <w:rPr>
+                <w:rFonts w:ascii="Calibri" w:hAnsi="Calibri"/>
+                <w:b/>
+                <w:i w:val="0"/>
+                <w:color w:val="1A6B5C"/>
+                <w:sz w:val="19"/>
+                <w:rFonts w:ascii="Calibri" w:hAnsi="Calibri" w:cs="Calibri"/>
+              </w:rPr>
+              <w:t xml:space="preserve">•   </w:t>
+            </w:r>
+            <w:r>
+              <w:rPr>
+                <w:rFonts w:ascii="Calibri" w:hAnsi="Calibri"/>
+                <w:b w:val="0"/>
+                <w:i w:val="0"/>
+                <w:color w:val="23272B"/>
+                <w:sz w:val="19"/>
+                <w:rFonts w:ascii="Calibri" w:hAnsi="Calibri" w:cs="Calibri"/>
+              </w:rPr>
+              <w:t>Upgraded partner health facilities across East and Central Africa for the Gould Family Foundation, including the neonatal intensive care unit at Mama Lucy Kibaki Hospital, Nairobi.</w:t>
+            </w:r>
+          </w:p>
+        </w:tc>
+      </w:tr>
+    </w:tbl>
     <w:p>
       <w:pPr>
         <w:keepNext/>
-        <w:spacing w:before="220" w:after="100" w:line="254" w:lineRule="auto"/>
+        <w:spacing w:before="180" w:after="90" w:line="245" w:lineRule="auto"/>
+        <w:ind w:left="158"/>
         <w:pBdr>
-          <w:bottom w:val="single" w:sz="8" w:space="3" w:color="1A6B5C"/>
+          <w:left w:val="single" w:sz="22" w:space="6" w:color="1A6B5C"/>
+          <w:bottom w:val="single" w:sz="4" w:space="4" w:color="CFD8E3"/>
         </w:pBdr>
       </w:pPr>
       <w:r>
@@ -340,7 +427,7 @@
           <w:color w:val="0F2C4C"/>
           <w:sz w:val="21"/>
           <w:rFonts w:ascii="Calibri" w:hAnsi="Calibri" w:cs="Calibri"/>
-          <w:spacing w:val="24"/>
+          <w:spacing w:val="26"/>
         </w:rPr>
         <w:t>TECHNICAL SKILLS</w:t>
       </w:r>
@@ -359,6 +446,12 @@
           <w:insideH w:val="none" w:sz="0"/>
           <w:insideV w:val="none" w:sz="0"/>
         </w:tblBorders>
+        <w:tblCellMar>
+          <w:top w:w="42" w:type="dxa"/>
+          <w:left w:w="85" w:type="dxa"/>
+          <w:bottom w:w="42" w:type="dxa"/>
+          <w:right w:w="85" w:type="dxa"/>
+        </w:tblCellMar>
       </w:tblPr>
       <w:tblGrid>
         <w:gridCol w:w="5119"/>
@@ -367,12 +460,12 @@
       <w:tr>
         <w:tc>
           <w:tcPr>
-            <w:tcW w:type="dxa" w:w="2332"/>
-            <w:shd w:val="clear" w:color="auto" w:fill="F2F5F8"/>
+            <w:tcW w:type="dxa" w:w="2390"/>
+            <w:shd w:val="clear" w:color="auto" w:fill="F3F6F9"/>
           </w:tcPr>
           <w:p>
             <w:pPr>
-              <w:spacing w:before="60" w:after="60" w:line="245" w:lineRule="auto"/>
+              <w:spacing w:after="0" w:line="250" w:lineRule="auto"/>
             </w:pPr>
             <w:r>
               <w:rPr>
@@ -389,12 +482,12 @@
         </w:tc>
         <w:tc>
           <w:tcPr>
-            <w:tcW w:type="dxa" w:w="8035"/>
-            <w:shd w:val="clear" w:color="auto" w:fill="F2F5F8"/>
+            <w:tcW w:type="dxa" w:w="7848"/>
+            <w:shd w:val="clear" w:color="auto" w:fill="F3F6F9"/>
           </w:tcPr>
           <w:p>
             <w:pPr>
-              <w:spacing w:before="60" w:after="60" w:line="254" w:lineRule="auto"/>
+              <w:spacing w:after="0" w:line="259" w:lineRule="auto"/>
             </w:pPr>
             <w:r>
               <w:rPr>
@@ -413,11 +506,11 @@
       <w:tr>
         <w:tc>
           <w:tcPr>
-            <w:tcW w:type="dxa" w:w="2332"/>
+            <w:tcW w:type="dxa" w:w="2390"/>
           </w:tcPr>
           <w:p>
             <w:pPr>
-              <w:spacing w:before="60" w:after="60" w:line="245" w:lineRule="auto"/>
+              <w:spacing w:after="0" w:line="250" w:lineRule="auto"/>
             </w:pPr>
             <w:r>
               <w:rPr>
@@ -428,17 +521,17 @@
                 <w:sz w:val="19"/>
                 <w:rFonts w:ascii="Calibri" w:hAnsi="Calibri" w:cs="Calibri"/>
               </w:rPr>
-              <w:t>Web &amp; mobile</w:t>
+              <w:t>Web and mobile</w:t>
             </w:r>
           </w:p>
         </w:tc>
         <w:tc>
           <w:tcPr>
-            <w:tcW w:type="dxa" w:w="8035"/>
+            <w:tcW w:type="dxa" w:w="7848"/>
           </w:tcPr>
           <w:p>
             <w:pPr>
-              <w:spacing w:before="60" w:after="60" w:line="254" w:lineRule="auto"/>
+              <w:spacing w:after="0" w:line="259" w:lineRule="auto"/>
             </w:pPr>
             <w:r>
               <w:rPr>
@@ -457,12 +550,12 @@
       <w:tr>
         <w:tc>
           <w:tcPr>
-            <w:tcW w:type="dxa" w:w="2332"/>
-            <w:shd w:val="clear" w:color="auto" w:fill="F2F5F8"/>
+            <w:tcW w:type="dxa" w:w="2390"/>
+            <w:shd w:val="clear" w:color="auto" w:fill="F3F6F9"/>
           </w:tcPr>
           <w:p>
             <w:pPr>
-              <w:spacing w:before="60" w:after="60" w:line="245" w:lineRule="auto"/>
+              <w:spacing w:after="0" w:line="250" w:lineRule="auto"/>
             </w:pPr>
             <w:r>
               <w:rPr>
@@ -473,18 +566,18 @@
                 <w:sz w:val="19"/>
                 <w:rFonts w:ascii="Calibri" w:hAnsi="Calibri" w:cs="Calibri"/>
               </w:rPr>
-              <w:t>Backend &amp; APIs</w:t>
+              <w:t>Backend and APIs</w:t>
             </w:r>
           </w:p>
         </w:tc>
         <w:tc>
           <w:tcPr>
-            <w:tcW w:type="dxa" w:w="8035"/>
-            <w:shd w:val="clear" w:color="auto" w:fill="F2F5F8"/>
+            <w:tcW w:type="dxa" w:w="7848"/>
+            <w:shd w:val="clear" w:color="auto" w:fill="F3F6F9"/>
           </w:tcPr>
           <w:p>
             <w:pPr>
-              <w:spacing w:before="60" w:after="60" w:line="254" w:lineRule="auto"/>
+              <w:spacing w:after="0" w:line="259" w:lineRule="auto"/>
             </w:pPr>
             <w:r>
               <w:rPr>
@@ -503,11 +596,11 @@
       <w:tr>
         <w:tc>
           <w:tcPr>
-            <w:tcW w:type="dxa" w:w="2332"/>
+            <w:tcW w:type="dxa" w:w="2390"/>
           </w:tcPr>
           <w:p>
             <w:pPr>
-              <w:spacing w:before="60" w:after="60" w:line="245" w:lineRule="auto"/>
+              <w:spacing w:after="0" w:line="250" w:lineRule="auto"/>
             </w:pPr>
             <w:r>
               <w:rPr>
@@ -518,17 +611,17 @@
                 <w:sz w:val="19"/>
                 <w:rFonts w:ascii="Calibri" w:hAnsi="Calibri" w:cs="Calibri"/>
               </w:rPr>
-              <w:t>Databases &amp; data</w:t>
+              <w:t>Databases and data</w:t>
             </w:r>
           </w:p>
         </w:tc>
         <w:tc>
           <w:tcPr>
-            <w:tcW w:type="dxa" w:w="8035"/>
+            <w:tcW w:type="dxa" w:w="7848"/>
           </w:tcPr>
           <w:p>
             <w:pPr>
-              <w:spacing w:before="60" w:after="60" w:line="254" w:lineRule="auto"/>
+              <w:spacing w:after="0" w:line="259" w:lineRule="auto"/>
             </w:pPr>
             <w:r>
               <w:rPr>
@@ -547,12 +640,12 @@
       <w:tr>
         <w:tc>
           <w:tcPr>
-            <w:tcW w:type="dxa" w:w="2332"/>
-            <w:shd w:val="clear" w:color="auto" w:fill="F2F5F8"/>
+            <w:tcW w:type="dxa" w:w="2390"/>
+            <w:shd w:val="clear" w:color="auto" w:fill="F3F6F9"/>
           </w:tcPr>
           <w:p>
             <w:pPr>
-              <w:spacing w:before="60" w:after="60" w:line="245" w:lineRule="auto"/>
+              <w:spacing w:after="0" w:line="250" w:lineRule="auto"/>
             </w:pPr>
             <w:r>
               <w:rPr>
@@ -563,18 +656,18 @@
                 <w:sz w:val="19"/>
                 <w:rFonts w:ascii="Calibri" w:hAnsi="Calibri" w:cs="Calibri"/>
               </w:rPr>
-              <w:t>Cloud &amp; DevOps</w:t>
+              <w:t>Cloud and DevOps</w:t>
             </w:r>
           </w:p>
         </w:tc>
         <w:tc>
           <w:tcPr>
-            <w:tcW w:type="dxa" w:w="8035"/>
-            <w:shd w:val="clear" w:color="auto" w:fill="F2F5F8"/>
+            <w:tcW w:type="dxa" w:w="7848"/>
+            <w:shd w:val="clear" w:color="auto" w:fill="F3F6F9"/>
           </w:tcPr>
           <w:p>
             <w:pPr>
-              <w:spacing w:before="60" w:after="60" w:line="254" w:lineRule="auto"/>
+              <w:spacing w:after="0" w:line="259" w:lineRule="auto"/>
             </w:pPr>
             <w:r>
               <w:rPr>
@@ -593,11 +686,11 @@
       <w:tr>
         <w:tc>
           <w:tcPr>
-            <w:tcW w:type="dxa" w:w="2332"/>
+            <w:tcW w:type="dxa" w:w="2390"/>
           </w:tcPr>
           <w:p>
             <w:pPr>
-              <w:spacing w:before="60" w:after="60" w:line="245" w:lineRule="auto"/>
+              <w:spacing w:after="0" w:line="250" w:lineRule="auto"/>
             </w:pPr>
             <w:r>
               <w:rPr>
@@ -608,17 +701,17 @@
                 <w:sz w:val="19"/>
                 <w:rFonts w:ascii="Calibri" w:hAnsi="Calibri" w:cs="Calibri"/>
               </w:rPr>
-              <w:t>AI, agents &amp; automation</w:t>
+              <w:t>AI, agents and automation</w:t>
             </w:r>
           </w:p>
         </w:tc>
         <w:tc>
           <w:tcPr>
-            <w:tcW w:type="dxa" w:w="8035"/>
+            <w:tcW w:type="dxa" w:w="7848"/>
           </w:tcPr>
           <w:p>
             <w:pPr>
-              <w:spacing w:before="60" w:after="60" w:line="254" w:lineRule="auto"/>
+              <w:spacing w:after="0" w:line="259" w:lineRule="auto"/>
             </w:pPr>
             <w:r>
               <w:rPr>
@@ -637,12 +730,12 @@
       <w:tr>
         <w:tc>
           <w:tcPr>
-            <w:tcW w:type="dxa" w:w="2332"/>
-            <w:shd w:val="clear" w:color="auto" w:fill="F2F5F8"/>
+            <w:tcW w:type="dxa" w:w="2390"/>
+            <w:shd w:val="clear" w:color="auto" w:fill="F3F6F9"/>
           </w:tcPr>
           <w:p>
             <w:pPr>
-              <w:spacing w:before="60" w:after="60" w:line="245" w:lineRule="auto"/>
+              <w:spacing w:after="0" w:line="250" w:lineRule="auto"/>
             </w:pPr>
             <w:r>
               <w:rPr>
@@ -659,12 +752,12 @@
         </w:tc>
         <w:tc>
           <w:tcPr>
-            <w:tcW w:type="dxa" w:w="8035"/>
-            <w:shd w:val="clear" w:color="auto" w:fill="F2F5F8"/>
+            <w:tcW w:type="dxa" w:w="7848"/>
+            <w:shd w:val="clear" w:color="auto" w:fill="F3F6F9"/>
           </w:tcPr>
           <w:p>
             <w:pPr>
-              <w:spacing w:before="60" w:after="60" w:line="254" w:lineRule="auto"/>
+              <w:spacing w:after="0" w:line="259" w:lineRule="auto"/>
             </w:pPr>
             <w:r>
               <w:rPr>
@@ -675,7 +768,7 @@
                 <w:sz w:val="19"/>
                 <w:rFonts w:ascii="Calibri" w:hAnsi="Calibri" w:cs="Calibri"/>
               </w:rPr>
-              <w:t>Windows  ·  Linux  ·  Android  —  administration, deployment and troubleshooting</w:t>
+              <w:t>Windows  ·  Linux  ·  Android.  Administration, deployment and troubleshooting on all three.</w:t>
             </w:r>
           </w:p>
         </w:tc>
@@ -683,11 +776,11 @@
       <w:tr>
         <w:tc>
           <w:tcPr>
-            <w:tcW w:type="dxa" w:w="2332"/>
+            <w:tcW w:type="dxa" w:w="2390"/>
           </w:tcPr>
           <w:p>
             <w:pPr>
-              <w:spacing w:before="60" w:after="60" w:line="245" w:lineRule="auto"/>
+              <w:spacing w:after="0" w:line="250" w:lineRule="auto"/>
             </w:pPr>
             <w:r>
               <w:rPr>
@@ -698,17 +791,17 @@
                 <w:sz w:val="19"/>
                 <w:rFonts w:ascii="Calibri" w:hAnsi="Calibri" w:cs="Calibri"/>
               </w:rPr>
-              <w:t>Engineering &amp; scientific</w:t>
+              <w:t>Engineering and scientific</w:t>
             </w:r>
           </w:p>
         </w:tc>
         <w:tc>
           <w:tcPr>
-            <w:tcW w:type="dxa" w:w="8035"/>
+            <w:tcW w:type="dxa" w:w="7848"/>
           </w:tcPr>
           <w:p>
             <w:pPr>
-              <w:spacing w:before="60" w:after="60" w:line="254" w:lineRule="auto"/>
+              <w:spacing w:after="0" w:line="259" w:lineRule="auto"/>
             </w:pPr>
             <w:r>
               <w:rPr>
@@ -727,12 +820,12 @@
       <w:tr>
         <w:tc>
           <w:tcPr>
-            <w:tcW w:type="dxa" w:w="2332"/>
-            <w:shd w:val="clear" w:color="auto" w:fill="F2F5F8"/>
+            <w:tcW w:type="dxa" w:w="2390"/>
+            <w:shd w:val="clear" w:color="auto" w:fill="F3F6F9"/>
           </w:tcPr>
           <w:p>
             <w:pPr>
-              <w:spacing w:before="60" w:after="60" w:line="245" w:lineRule="auto"/>
+              <w:spacing w:after="0" w:line="250" w:lineRule="auto"/>
             </w:pPr>
             <w:r>
               <w:rPr>
@@ -743,18 +836,18 @@
                 <w:sz w:val="19"/>
                 <w:rFonts w:ascii="Calibri" w:hAnsi="Calibri" w:cs="Calibri"/>
               </w:rPr>
-              <w:t>Documents &amp; productivity</w:t>
+              <w:t>Documents and productivity</w:t>
             </w:r>
           </w:p>
         </w:tc>
         <w:tc>
           <w:tcPr>
-            <w:tcW w:type="dxa" w:w="8035"/>
-            <w:shd w:val="clear" w:color="auto" w:fill="F2F5F8"/>
+            <w:tcW w:type="dxa" w:w="7848"/>
+            <w:shd w:val="clear" w:color="auto" w:fill="F3F6F9"/>
           </w:tcPr>
           <w:p>
             <w:pPr>
-              <w:spacing w:before="60" w:after="60" w:line="254" w:lineRule="auto"/>
+              <w:spacing w:after="0" w:line="259" w:lineRule="auto"/>
             </w:pPr>
             <w:r>
               <w:rPr>
@@ -774,9 +867,11 @@
     <w:p>
       <w:pPr>
         <w:keepNext/>
-        <w:spacing w:before="220" w:after="100" w:line="254" w:lineRule="auto"/>
+        <w:spacing w:before="180" w:after="90" w:line="245" w:lineRule="auto"/>
+        <w:ind w:left="158"/>
         <w:pBdr>
-          <w:bottom w:val="single" w:sz="8" w:space="3" w:color="1A6B5C"/>
+          <w:left w:val="single" w:sz="22" w:space="6" w:color="1A6B5C"/>
+          <w:bottom w:val="single" w:sz="4" w:space="4" w:color="CFD8E3"/>
         </w:pBdr>
       </w:pPr>
       <w:r>
@@ -787,7 +882,7 @@
           <w:color w:val="0F2C4C"/>
           <w:sz w:val="21"/>
           <w:rFonts w:ascii="Calibri" w:hAnsi="Calibri" w:cs="Calibri"/>
-          <w:spacing w:val="24"/>
+          <w:spacing w:val="26"/>
         </w:rPr>
         <w:t>PROFESSIONAL EXPERIENCE</w:t>
       </w:r>
@@ -798,7 +893,7 @@
         <w:tabs>
           <w:tab w:pos="10238" w:val="right"/>
         </w:tabs>
-        <w:spacing w:before="40" w:after="0" w:line="254" w:lineRule="auto"/>
+        <w:spacing w:before="0" w:after="0" w:line="245" w:lineRule="auto"/>
       </w:pPr>
       <w:r>
         <w:rPr>
@@ -809,7 +904,7 @@
           <w:sz w:val="20"/>
           <w:rFonts w:ascii="Calibri" w:hAnsi="Calibri" w:cs="Calibri"/>
         </w:rPr>
-        <w:t>Lead Software Developer — FCHIP and Health Information Systems</w:t>
+        <w:t>Lead Software Developer, FCHIP and Health Information Systems</w:t>
       </w:r>
       <w:r>
         <w:rPr>
@@ -821,13 +916,13 @@
           <w:rFonts w:ascii="Calibri" w:hAnsi="Calibri" w:cs="Calibri"/>
         </w:rPr>
         <w:tab/>
-        <w:t>2026 – Present</w:t>
+        <w:t>2026 to present</w:t>
       </w:r>
     </w:p>
     <w:p>
       <w:pPr>
         <w:keepNext/>
-        <w:spacing w:before="0" w:after="60" w:line="254" w:lineRule="auto"/>
+        <w:spacing w:before="0" w:after="60" w:line="245" w:lineRule="auto"/>
       </w:pPr>
       <w:r>
         <w:rPr>
@@ -843,7 +938,7 @@
     </w:p>
     <w:p>
       <w:pPr>
-        <w:spacing w:before="0" w:after="50" w:line="254" w:lineRule="auto"/>
+        <w:spacing w:before="0" w:after="44" w:line="245" w:lineRule="auto"/>
         <w:ind w:left="288" w:hanging="230"/>
         <w:jc w:val="both"/>
       </w:pPr>
@@ -872,7 +967,36 @@
     </w:p>
     <w:p>
       <w:pPr>
-        <w:spacing w:before="0" w:after="50" w:line="254" w:lineRule="auto"/>
+        <w:spacing w:before="0" w:after="44" w:line="245" w:lineRule="auto"/>
+        <w:ind w:left="288" w:hanging="230"/>
+        <w:jc w:val="both"/>
+      </w:pPr>
+      <w:r>
+        <w:rPr>
+          <w:rFonts w:ascii="Calibri" w:hAnsi="Calibri"/>
+          <w:b/>
+          <w:i w:val="0"/>
+          <w:color w:val="1A6B5C"/>
+          <w:sz w:val="19"/>
+          <w:rFonts w:ascii="Calibri" w:hAnsi="Calibri" w:cs="Calibri"/>
+        </w:rPr>
+        <w:t xml:space="preserve">•   </w:t>
+      </w:r>
+      <w:r>
+        <w:rPr>
+          <w:rFonts w:ascii="Calibri" w:hAnsi="Calibri"/>
+          <w:b w:val="0"/>
+          <w:i w:val="0"/>
+          <w:color w:val="23272B"/>
+          <w:sz w:val="19"/>
+          <w:rFonts w:ascii="Calibri" w:hAnsi="Calibri" w:cs="Calibri"/>
+        </w:rPr>
+        <w:t>Building a cross-sector data collection and reporting application that turns work already being done into finished reports in real time, for accounting, research and laboratory science, biology, agriculture, social media and similar record-heavy fields.</w:t>
+      </w:r>
+    </w:p>
+    <w:p>
+      <w:pPr>
+        <w:spacing w:before="0" w:after="44" w:line="245" w:lineRule="auto"/>
         <w:ind w:left="288" w:hanging="230"/>
         <w:jc w:val="both"/>
       </w:pPr>
@@ -901,7 +1025,7 @@
     </w:p>
     <w:p>
       <w:pPr>
-        <w:spacing w:before="0" w:after="50" w:line="254" w:lineRule="auto"/>
+        <w:spacing w:before="0" w:after="44" w:line="245" w:lineRule="auto"/>
         <w:ind w:left="288" w:hanging="230"/>
         <w:jc w:val="both"/>
       </w:pPr>
@@ -930,7 +1054,7 @@
     </w:p>
     <w:p>
       <w:pPr>
-        <w:spacing w:before="0" w:after="50" w:line="254" w:lineRule="auto"/>
+        <w:spacing w:before="0" w:after="44" w:line="245" w:lineRule="auto"/>
         <w:ind w:left="288" w:hanging="230"/>
         <w:jc w:val="both"/>
       </w:pPr>
@@ -959,7 +1083,7 @@
     </w:p>
     <w:p>
       <w:pPr>
-        <w:spacing w:before="0" w:after="50" w:line="254" w:lineRule="auto"/>
+        <w:spacing w:before="0" w:after="44" w:line="245" w:lineRule="auto"/>
         <w:ind w:left="288" w:hanging="230"/>
         <w:jc w:val="both"/>
       </w:pPr>
@@ -983,7 +1107,7 @@
           <w:sz w:val="19"/>
           <w:rFonts w:ascii="Calibri" w:hAnsi="Calibri" w:cs="Calibri"/>
         </w:rPr>
-        <w:t>Write and edit institutional proposals, grant applications, partnership documents and investment materials; chaired the FairBanks meeting with the Uganda Health Partners Cooperative on cooperative health insurance in July 2026.</w:t>
+        <w:t>Write and edit institutional proposals, grant applications, partnership documents and investment materials. Chaired the FairBanks meeting with the Uganda Health Partners Cooperative on cooperative health insurance in July 2026.</w:t>
       </w:r>
     </w:p>
     <w:p>
@@ -992,7 +1116,7 @@
         <w:tabs>
           <w:tab w:pos="10238" w:val="right"/>
         </w:tabs>
-        <w:spacing w:before="140" w:after="0" w:line="254" w:lineRule="auto"/>
+        <w:spacing w:before="120" w:after="0" w:line="245" w:lineRule="auto"/>
       </w:pPr>
       <w:r>
         <w:rPr>
@@ -1003,7 +1127,7 @@
           <w:sz w:val="20"/>
           <w:rFonts w:ascii="Calibri" w:hAnsi="Calibri" w:cs="Calibri"/>
         </w:rPr>
-        <w:t>Consultant Biomedical Engineer — Independent Practice</w:t>
+        <w:t>Consultant Biomedical Engineer, Independent Practice</w:t>
       </w:r>
       <w:r>
         <w:rPr>
@@ -1015,13 +1139,13 @@
           <w:rFonts w:ascii="Calibri" w:hAnsi="Calibri" w:cs="Calibri"/>
         </w:rPr>
         <w:tab/>
-        <w:t>Mar 2025 – Present</w:t>
+        <w:t>Mar 2025 to present</w:t>
       </w:r>
     </w:p>
     <w:p>
       <w:pPr>
         <w:keepNext/>
-        <w:spacing w:before="0" w:after="60" w:line="254" w:lineRule="auto"/>
+        <w:spacing w:before="0" w:after="60" w:line="245" w:lineRule="auto"/>
       </w:pPr>
       <w:r>
         <w:rPr>
@@ -1037,7 +1161,7 @@
     </w:p>
     <w:p>
       <w:pPr>
-        <w:spacing w:before="0" w:after="50" w:line="254" w:lineRule="auto"/>
+        <w:spacing w:before="0" w:after="44" w:line="245" w:lineRule="auto"/>
         <w:ind w:left="288" w:hanging="230"/>
         <w:jc w:val="both"/>
       </w:pPr>
@@ -1066,7 +1190,7 @@
     </w:p>
     <w:p>
       <w:pPr>
-        <w:spacing w:before="0" w:after="50" w:line="254" w:lineRule="auto"/>
+        <w:spacing w:before="0" w:after="44" w:line="245" w:lineRule="auto"/>
         <w:ind w:left="288" w:hanging="230"/>
         <w:jc w:val="both"/>
       </w:pPr>
@@ -1095,7 +1219,7 @@
     </w:p>
     <w:p>
       <w:pPr>
-        <w:spacing w:before="0" w:after="50" w:line="254" w:lineRule="auto"/>
+        <w:spacing w:before="0" w:after="44" w:line="245" w:lineRule="auto"/>
         <w:ind w:left="288" w:hanging="230"/>
         <w:jc w:val="both"/>
       </w:pPr>
@@ -1124,7 +1248,7 @@
     </w:p>
     <w:p>
       <w:pPr>
-        <w:spacing w:before="0" w:after="50" w:line="254" w:lineRule="auto"/>
+        <w:spacing w:before="0" w:after="44" w:line="245" w:lineRule="auto"/>
         <w:ind w:left="288" w:hanging="230"/>
         <w:jc w:val="both"/>
       </w:pPr>
@@ -1157,7 +1281,7 @@
         <w:tabs>
           <w:tab w:pos="10238" w:val="right"/>
         </w:tabs>
-        <w:spacing w:before="140" w:after="0" w:line="254" w:lineRule="auto"/>
+        <w:spacing w:before="120" w:after="0" w:line="245" w:lineRule="auto"/>
       </w:pPr>
       <w:r>
         <w:rPr>
@@ -1180,13 +1304,13 @@
           <w:rFonts w:ascii="Calibri" w:hAnsi="Calibri" w:cs="Calibri"/>
         </w:rPr>
         <w:tab/>
-        <w:t>Aug 2024 – Feb 2025</w:t>
+        <w:t>Aug 2024 to Feb 2025</w:t>
       </w:r>
     </w:p>
     <w:p>
       <w:pPr>
         <w:keepNext/>
-        <w:spacing w:before="0" w:after="60" w:line="254" w:lineRule="auto"/>
+        <w:spacing w:before="0" w:after="60" w:line="245" w:lineRule="auto"/>
       </w:pPr>
       <w:r>
         <w:rPr>
@@ -1197,12 +1321,12 @@
           <w:sz w:val="18"/>
           <w:rFonts w:ascii="Calibri" w:hAnsi="Calibri" w:cs="Calibri"/>
         </w:rPr>
-        <w:t>Gould Family Foundation (GFF) — East and Central Africa</w:t>
+        <w:t>Gould Family Foundation (GFF), East and Central Africa</w:t>
       </w:r>
     </w:p>
     <w:p>
       <w:pPr>
-        <w:spacing w:before="0" w:after="50" w:line="254" w:lineRule="auto"/>
+        <w:spacing w:before="0" w:after="44" w:line="245" w:lineRule="auto"/>
         <w:ind w:left="288" w:hanging="230"/>
         <w:jc w:val="both"/>
       </w:pPr>
@@ -1231,7 +1355,7 @@
     </w:p>
     <w:p>
       <w:pPr>
-        <w:spacing w:before="0" w:after="50" w:line="254" w:lineRule="auto"/>
+        <w:spacing w:before="0" w:after="44" w:line="245" w:lineRule="auto"/>
         <w:ind w:left="288" w:hanging="230"/>
         <w:jc w:val="both"/>
       </w:pPr>
@@ -1260,7 +1384,7 @@
     </w:p>
     <w:p>
       <w:pPr>
-        <w:spacing w:before="0" w:after="50" w:line="254" w:lineRule="auto"/>
+        <w:spacing w:before="0" w:after="44" w:line="245" w:lineRule="auto"/>
         <w:ind w:left="288" w:hanging="230"/>
         <w:jc w:val="both"/>
       </w:pPr>
@@ -1289,7 +1413,36 @@
     </w:p>
     <w:p>
       <w:pPr>
-        <w:spacing w:before="0" w:after="50" w:line="254" w:lineRule="auto"/>
+        <w:spacing w:before="0" w:after="44" w:line="245" w:lineRule="auto"/>
+        <w:ind w:left="288" w:hanging="230"/>
+        <w:jc w:val="both"/>
+      </w:pPr>
+      <w:r>
+        <w:rPr>
+          <w:rFonts w:ascii="Calibri" w:hAnsi="Calibri"/>
+          <w:b/>
+          <w:i w:val="0"/>
+          <w:color w:val="1A6B5C"/>
+          <w:sz w:val="19"/>
+          <w:rFonts w:ascii="Calibri" w:hAnsi="Calibri" w:cs="Calibri"/>
+        </w:rPr>
+        <w:t xml:space="preserve">•   </w:t>
+      </w:r>
+      <w:r>
+        <w:rPr>
+          <w:rFonts w:ascii="Calibri" w:hAnsi="Calibri"/>
+          <w:b w:val="0"/>
+          <w:i w:val="0"/>
+          <w:color w:val="23272B"/>
+          <w:sz w:val="19"/>
+          <w:rFonts w:ascii="Calibri" w:hAnsi="Calibri" w:cs="Calibri"/>
+        </w:rPr>
+        <w:t>Upgraded several facilities, including the neonatal intensive care unit at Mama Lucy Kibaki Hospital, Nairobi, where oxygen and equipment demand modelling informed the capacity plan.</w:t>
+      </w:r>
+    </w:p>
+    <w:p>
+      <w:pPr>
+        <w:spacing w:before="0" w:after="44" w:line="245" w:lineRule="auto"/>
         <w:ind w:left="288" w:hanging="230"/>
         <w:jc w:val="both"/>
       </w:pPr>
@@ -1318,40 +1471,11 @@
     </w:p>
     <w:p>
       <w:pPr>
-        <w:spacing w:before="0" w:after="50" w:line="254" w:lineRule="auto"/>
-        <w:ind w:left="288" w:hanging="230"/>
-        <w:jc w:val="both"/>
-      </w:pPr>
-      <w:r>
-        <w:rPr>
-          <w:rFonts w:ascii="Calibri" w:hAnsi="Calibri"/>
-          <w:b/>
-          <w:i w:val="0"/>
-          <w:color w:val="1A6B5C"/>
-          <w:sz w:val="19"/>
-          <w:rFonts w:ascii="Calibri" w:hAnsi="Calibri" w:cs="Calibri"/>
-        </w:rPr>
-        <w:t xml:space="preserve">•   </w:t>
-      </w:r>
-      <w:r>
-        <w:rPr>
-          <w:rFonts w:ascii="Calibri" w:hAnsi="Calibri"/>
-          <w:b w:val="0"/>
-          <w:i w:val="0"/>
-          <w:color w:val="23272B"/>
-          <w:sz w:val="19"/>
-          <w:rFonts w:ascii="Calibri" w:hAnsi="Calibri" w:cs="Calibri"/>
-        </w:rPr>
-        <w:t>Upgraded several facilities, including the neonatal intensive care unit at Mama Lucy Kibaki Hospital, Nairobi.</w:t>
-      </w:r>
-    </w:p>
-    <w:p>
-      <w:pPr>
         <w:keepNext/>
         <w:tabs>
           <w:tab w:pos="10238" w:val="right"/>
         </w:tabs>
-        <w:spacing w:before="140" w:after="0" w:line="254" w:lineRule="auto"/>
+        <w:spacing w:before="120" w:after="0" w:line="245" w:lineRule="auto"/>
       </w:pPr>
       <w:r>
         <w:rPr>
@@ -1374,13 +1498,13 @@
           <w:rFonts w:ascii="Calibri" w:hAnsi="Calibri" w:cs="Calibri"/>
         </w:rPr>
         <w:tab/>
-        <w:t>Jan 2020 – Jan 2024</w:t>
+        <w:t>Jan 2020 to Jan 2024</w:t>
       </w:r>
     </w:p>
     <w:p>
       <w:pPr>
         <w:keepNext/>
-        <w:spacing w:before="0" w:after="60" w:line="254" w:lineRule="auto"/>
+        <w:spacing w:before="0" w:after="60" w:line="245" w:lineRule="auto"/>
       </w:pPr>
       <w:r>
         <w:rPr>
@@ -1396,7 +1520,7 @@
     </w:p>
     <w:p>
       <w:pPr>
-        <w:spacing w:before="0" w:after="50" w:line="254" w:lineRule="auto"/>
+        <w:spacing w:before="0" w:after="44" w:line="245" w:lineRule="auto"/>
         <w:ind w:left="288" w:hanging="230"/>
         <w:jc w:val="both"/>
       </w:pPr>
@@ -1425,7 +1549,36 @@
     </w:p>
     <w:p>
       <w:pPr>
-        <w:spacing w:before="0" w:after="50" w:line="254" w:lineRule="auto"/>
+        <w:spacing w:before="0" w:after="44" w:line="245" w:lineRule="auto"/>
+        <w:ind w:left="288" w:hanging="230"/>
+        <w:jc w:val="both"/>
+      </w:pPr>
+      <w:r>
+        <w:rPr>
+          <w:rFonts w:ascii="Calibri" w:hAnsi="Calibri"/>
+          <w:b/>
+          <w:i w:val="0"/>
+          <w:color w:val="1A6B5C"/>
+          <w:sz w:val="19"/>
+          <w:rFonts w:ascii="Calibri" w:hAnsi="Calibri" w:cs="Calibri"/>
+        </w:rPr>
+        <w:t xml:space="preserve">•   </w:t>
+      </w:r>
+      <w:r>
+        <w:rPr>
+          <w:rFonts w:ascii="Calibri" w:hAnsi="Calibri"/>
+          <w:b w:val="0"/>
+          <w:i w:val="0"/>
+          <w:color w:val="23272B"/>
+          <w:sz w:val="19"/>
+          <w:rFonts w:ascii="Calibri" w:hAnsi="Calibri" w:cs="Calibri"/>
+        </w:rPr>
+        <w:t>Led oxygen therapy management through the COVID-19 response and supported Ministry of Health oxygen planning. Developed the formulas used to calculate patient oxygen consumption, which gave managers a dependable basis for sizing plant capacity, cylinder stock and flow requirements rather than estimating them.</w:t>
+      </w:r>
+    </w:p>
+    <w:p>
+      <w:pPr>
+        <w:spacing w:before="0" w:after="44" w:line="245" w:lineRule="auto"/>
         <w:ind w:left="288" w:hanging="230"/>
         <w:jc w:val="both"/>
       </w:pPr>
@@ -1454,7 +1607,7 @@
     </w:p>
     <w:p>
       <w:pPr>
-        <w:spacing w:before="0" w:after="50" w:line="254" w:lineRule="auto"/>
+        <w:spacing w:before="0" w:after="44" w:line="245" w:lineRule="auto"/>
         <w:ind w:left="288" w:hanging="230"/>
         <w:jc w:val="both"/>
       </w:pPr>
@@ -1483,7 +1636,7 @@
     </w:p>
     <w:p>
       <w:pPr>
-        <w:spacing w:before="0" w:after="50" w:line="254" w:lineRule="auto"/>
+        <w:spacing w:before="0" w:after="44" w:line="245" w:lineRule="auto"/>
         <w:ind w:left="288" w:hanging="230"/>
         <w:jc w:val="both"/>
       </w:pPr>
@@ -1512,7 +1665,7 @@
     </w:p>
     <w:p>
       <w:pPr>
-        <w:spacing w:before="0" w:after="50" w:line="254" w:lineRule="auto"/>
+        <w:spacing w:before="0" w:after="44" w:line="245" w:lineRule="auto"/>
         <w:ind w:left="288" w:hanging="230"/>
         <w:jc w:val="both"/>
       </w:pPr>
@@ -1545,7 +1698,7 @@
         <w:tabs>
           <w:tab w:pos="10238" w:val="right"/>
         </w:tabs>
-        <w:spacing w:before="140" w:after="0" w:line="254" w:lineRule="auto"/>
+        <w:spacing w:before="120" w:after="0" w:line="245" w:lineRule="auto"/>
       </w:pPr>
       <w:r>
         <w:rPr>
@@ -1568,13 +1721,13 @@
           <w:rFonts w:ascii="Calibri" w:hAnsi="Calibri" w:cs="Calibri"/>
         </w:rPr>
         <w:tab/>
-        <w:t>Apr 2019 – Jan 2020</w:t>
+        <w:t>Apr 2019 to Jan 2020</w:t>
       </w:r>
     </w:p>
     <w:p>
       <w:pPr>
         <w:keepNext/>
-        <w:spacing w:before="0" w:after="60" w:line="254" w:lineRule="auto"/>
+        <w:spacing w:before="0" w:after="60" w:line="245" w:lineRule="auto"/>
       </w:pPr>
       <w:r>
         <w:rPr>
@@ -1590,7 +1743,7 @@
     </w:p>
     <w:p>
       <w:pPr>
-        <w:spacing w:before="0" w:after="50" w:line="254" w:lineRule="auto"/>
+        <w:spacing w:before="0" w:after="44" w:line="245" w:lineRule="auto"/>
         <w:ind w:left="288" w:hanging="230"/>
         <w:jc w:val="both"/>
       </w:pPr>
@@ -1619,7 +1772,7 @@
     </w:p>
     <w:p>
       <w:pPr>
-        <w:spacing w:before="0" w:after="50" w:line="254" w:lineRule="auto"/>
+        <w:spacing w:before="0" w:after="44" w:line="245" w:lineRule="auto"/>
         <w:ind w:left="288" w:hanging="230"/>
         <w:jc w:val="both"/>
       </w:pPr>
@@ -1648,7 +1801,7 @@
     </w:p>
     <w:p>
       <w:pPr>
-        <w:spacing w:before="0" w:after="50" w:line="254" w:lineRule="auto"/>
+        <w:spacing w:before="0" w:after="44" w:line="245" w:lineRule="auto"/>
         <w:ind w:left="288" w:hanging="230"/>
         <w:jc w:val="both"/>
       </w:pPr>
@@ -1681,7 +1834,7 @@
         <w:tabs>
           <w:tab w:pos="10238" w:val="right"/>
         </w:tabs>
-        <w:spacing w:before="140" w:after="0" w:line="254" w:lineRule="auto"/>
+        <w:spacing w:before="120" w:after="0" w:line="245" w:lineRule="auto"/>
       </w:pPr>
       <w:r>
         <w:rPr>
@@ -1704,13 +1857,13 @@
           <w:rFonts w:ascii="Calibri" w:hAnsi="Calibri" w:cs="Calibri"/>
         </w:rPr>
         <w:tab/>
-        <w:t>Dec 2018 – Apr 2019</w:t>
+        <w:t>Dec 2018 to Apr 2019</w:t>
       </w:r>
     </w:p>
     <w:p>
       <w:pPr>
         <w:keepNext/>
-        <w:spacing w:before="0" w:after="60" w:line="254" w:lineRule="auto"/>
+        <w:spacing w:before="0" w:after="60" w:line="245" w:lineRule="auto"/>
       </w:pPr>
       <w:r>
         <w:rPr>
@@ -1726,7 +1879,7 @@
     </w:p>
     <w:p>
       <w:pPr>
-        <w:spacing w:before="0" w:after="50" w:line="254" w:lineRule="auto"/>
+        <w:spacing w:before="0" w:after="44" w:line="245" w:lineRule="auto"/>
         <w:ind w:left="288" w:hanging="230"/>
         <w:jc w:val="both"/>
       </w:pPr>
@@ -1755,7 +1908,7 @@
     </w:p>
     <w:p>
       <w:pPr>
-        <w:spacing w:before="0" w:after="50" w:line="254" w:lineRule="auto"/>
+        <w:spacing w:before="0" w:after="44" w:line="245" w:lineRule="auto"/>
         <w:ind w:left="288" w:hanging="230"/>
         <w:jc w:val="both"/>
       </w:pPr>
@@ -1788,7 +1941,7 @@
         <w:tabs>
           <w:tab w:pos="10238" w:val="right"/>
         </w:tabs>
-        <w:spacing w:before="140" w:after="0" w:line="254" w:lineRule="auto"/>
+        <w:spacing w:before="120" w:after="0" w:line="245" w:lineRule="auto"/>
       </w:pPr>
       <w:r>
         <w:rPr>
@@ -1811,13 +1964,13 @@
           <w:rFonts w:ascii="Calibri" w:hAnsi="Calibri" w:cs="Calibri"/>
         </w:rPr>
         <w:tab/>
-        <w:t>Mar 2016 – Aug 2017</w:t>
+        <w:t>Mar 2016 to Aug 2017</w:t>
       </w:r>
     </w:p>
     <w:p>
       <w:pPr>
         <w:keepNext/>
-        <w:spacing w:before="0" w:after="60" w:line="254" w:lineRule="auto"/>
+        <w:spacing w:before="0" w:after="60" w:line="245" w:lineRule="auto"/>
       </w:pPr>
       <w:r>
         <w:rPr>
@@ -1833,7 +1986,7 @@
     </w:p>
     <w:p>
       <w:pPr>
-        <w:spacing w:before="0" w:after="50" w:line="254" w:lineRule="auto"/>
+        <w:spacing w:before="0" w:after="44" w:line="245" w:lineRule="auto"/>
         <w:ind w:left="288" w:hanging="230"/>
         <w:jc w:val="both"/>
       </w:pPr>
@@ -1862,7 +2015,7 @@
     </w:p>
     <w:p>
       <w:pPr>
-        <w:spacing w:before="0" w:after="50" w:line="254" w:lineRule="auto"/>
+        <w:spacing w:before="0" w:after="44" w:line="245" w:lineRule="auto"/>
         <w:ind w:left="288" w:hanging="230"/>
         <w:jc w:val="both"/>
       </w:pPr>
@@ -1892,9 +2045,11 @@
     <w:p>
       <w:pPr>
         <w:keepNext/>
-        <w:spacing w:before="220" w:after="100" w:line="254" w:lineRule="auto"/>
+        <w:spacing w:before="180" w:after="90" w:line="245" w:lineRule="auto"/>
+        <w:ind w:left="158"/>
         <w:pBdr>
-          <w:bottom w:val="single" w:sz="8" w:space="3" w:color="1A6B5C"/>
+          <w:left w:val="single" w:sz="22" w:space="6" w:color="1A6B5C"/>
+          <w:bottom w:val="single" w:sz="4" w:space="4" w:color="CFD8E3"/>
         </w:pBdr>
       </w:pPr>
       <w:r>
@@ -1905,9 +2060,9 @@
           <w:color w:val="0F2C4C"/>
           <w:sz w:val="21"/>
           <w:rFonts w:ascii="Calibri" w:hAnsi="Calibri" w:cs="Calibri"/>
-          <w:spacing w:val="24"/>
+          <w:spacing w:val="26"/>
         </w:rPr>
-        <w:t>SELECTED PROJECTS AND SYSTEMS DELIVERED</w:t>
+        <w:t>SELECTED PROJECTS</w:t>
       </w:r>
     </w:p>
     <w:p>
@@ -1916,7 +2071,7 @@
         <w:tabs>
           <w:tab w:pos="10238" w:val="right"/>
         </w:tabs>
-        <w:spacing w:before="40" w:after="0" w:line="254" w:lineRule="auto"/>
+        <w:spacing w:before="0" w:after="0" w:line="245" w:lineRule="auto"/>
       </w:pPr>
       <w:r>
         <w:rPr>
@@ -1939,13 +2094,13 @@
           <w:rFonts w:ascii="Calibri" w:hAnsi="Calibri" w:cs="Calibri"/>
         </w:rPr>
         <w:tab/>
-        <w:t>2026 – present</w:t>
+        <w:t>2026 to present</w:t>
       </w:r>
     </w:p>
     <w:p>
       <w:pPr>
         <w:keepNext/>
-        <w:spacing w:before="0" w:after="40" w:line="254" w:lineRule="auto"/>
+        <w:spacing w:before="0" w:after="40" w:line="245" w:lineRule="auto"/>
       </w:pPr>
       <w:r>
         <w:rPr>
@@ -1956,12 +2111,12 @@
           <w:sz w:val="18"/>
           <w:rFonts w:ascii="Calibri" w:hAnsi="Calibri" w:cs="Calibri"/>
         </w:rPr>
-        <w:t>Lead Software Developer  —  FairBanks Medical Centre Limited</w:t>
+        <w:t>Lead Software Developer  ·  FairBanks Medical Centre Limited</w:t>
       </w:r>
     </w:p>
     <w:p>
       <w:pPr>
-        <w:spacing w:before="0" w:after="40" w:line="254" w:lineRule="auto"/>
+        <w:spacing w:before="0" w:after="40" w:line="245" w:lineRule="auto"/>
         <w:jc w:val="both"/>
       </w:pPr>
       <w:r>
@@ -1982,7 +2137,139 @@
         <w:tabs>
           <w:tab w:pos="10238" w:val="right"/>
         </w:tabs>
-        <w:spacing w:before="120" w:after="0" w:line="254" w:lineRule="auto"/>
+        <w:spacing w:before="120" w:after="0" w:line="245" w:lineRule="auto"/>
+      </w:pPr>
+      <w:r>
+        <w:rPr>
+          <w:rFonts w:ascii="Calibri" w:hAnsi="Calibri"/>
+          <w:b/>
+          <w:i w:val="0"/>
+          <w:color w:val="0F2C4C"/>
+          <w:sz w:val="20"/>
+          <w:rFonts w:ascii="Calibri" w:hAnsi="Calibri" w:cs="Calibri"/>
+        </w:rPr>
+        <w:t>Cross-sector data collection and reporting application</w:t>
+      </w:r>
+      <w:r>
+        <w:rPr>
+          <w:rFonts w:ascii="Calibri" w:hAnsi="Calibri"/>
+          <w:b/>
+          <w:i w:val="0"/>
+          <w:color w:val="1A6B5C"/>
+          <w:sz w:val="18"/>
+          <w:rFonts w:ascii="Calibri" w:hAnsi="Calibri" w:cs="Calibri"/>
+        </w:rPr>
+        <w:tab/>
+        <w:t>2026 to present</w:t>
+      </w:r>
+    </w:p>
+    <w:p>
+      <w:pPr>
+        <w:keepNext/>
+        <w:spacing w:before="0" w:after="40" w:line="245" w:lineRule="auto"/>
+      </w:pPr>
+      <w:r>
+        <w:rPr>
+          <w:rFonts w:ascii="Calibri" w:hAnsi="Calibri"/>
+          <w:b w:val="0"/>
+          <w:i/>
+          <w:color w:val="5A6472"/>
+          <w:sz w:val="18"/>
+          <w:rFonts w:ascii="Calibri" w:hAnsi="Calibri" w:cs="Calibri"/>
+        </w:rPr>
+        <w:t>Founder and Lead Developer  ·  In development</w:t>
+      </w:r>
+    </w:p>
+    <w:p>
+      <w:pPr>
+        <w:spacing w:before="0" w:after="40" w:line="245" w:lineRule="auto"/>
+        <w:jc w:val="both"/>
+      </w:pPr>
+      <w:r>
+        <w:rPr>
+          <w:rFonts w:ascii="Calibri" w:hAnsi="Calibri"/>
+          <w:b w:val="0"/>
+          <w:i w:val="0"/>
+          <w:color w:val="23272B"/>
+          <w:sz w:val="19"/>
+          <w:rFonts w:ascii="Calibri" w:hAnsi="Calibri" w:cs="Calibri"/>
+        </w:rPr>
+        <w:t>An application that simplifies data collection and reporting for professions that live on records: accounting, research, biology and laboratory science, agriculture and social media among them. Rather than collecting data now and writing the report later, the user works inside the app and the information and reports are generated in real time as they go.</w:t>
+      </w:r>
+    </w:p>
+    <w:p>
+      <w:pPr>
+        <w:keepNext/>
+        <w:tabs>
+          <w:tab w:pos="10238" w:val="right"/>
+        </w:tabs>
+        <w:spacing w:before="120" w:after="0" w:line="245" w:lineRule="auto"/>
+      </w:pPr>
+      <w:r>
+        <w:rPr>
+          <w:rFonts w:ascii="Calibri" w:hAnsi="Calibri"/>
+          <w:b/>
+          <w:i w:val="0"/>
+          <w:color w:val="0F2C4C"/>
+          <w:sz w:val="20"/>
+          <w:rFonts w:ascii="Calibri" w:hAnsi="Calibri" w:cs="Calibri"/>
+        </w:rPr>
+        <w:t>COVID-19 oxygen therapy management and demand modelling</w:t>
+      </w:r>
+      <w:r>
+        <w:rPr>
+          <w:rFonts w:ascii="Calibri" w:hAnsi="Calibri"/>
+          <w:b/>
+          <w:i w:val="0"/>
+          <w:color w:val="1A6B5C"/>
+          <w:sz w:val="18"/>
+          <w:rFonts w:ascii="Calibri" w:hAnsi="Calibri" w:cs="Calibri"/>
+        </w:rPr>
+        <w:tab/>
+        <w:t>2020 to 2022</w:t>
+      </w:r>
+    </w:p>
+    <w:p>
+      <w:pPr>
+        <w:keepNext/>
+        <w:spacing w:before="0" w:after="40" w:line="245" w:lineRule="auto"/>
+      </w:pPr>
+      <w:r>
+        <w:rPr>
+          <w:rFonts w:ascii="Calibri" w:hAnsi="Calibri"/>
+          <w:b w:val="0"/>
+          <w:i/>
+          <w:color w:val="5A6472"/>
+          <w:sz w:val="18"/>
+          <w:rFonts w:ascii="Calibri" w:hAnsi="Calibri" w:cs="Calibri"/>
+        </w:rPr>
+        <w:t>Biomedical Manager  ·  International Hospital Kampala, with Ministry of Health planning support</w:t>
+      </w:r>
+    </w:p>
+    <w:p>
+      <w:pPr>
+        <w:spacing w:before="0" w:after="40" w:line="245" w:lineRule="auto"/>
+        <w:jc w:val="both"/>
+      </w:pPr>
+      <w:r>
+        <w:rPr>
+          <w:rFonts w:ascii="Calibri" w:hAnsi="Calibri"/>
+          <w:b w:val="0"/>
+          <w:i w:val="0"/>
+          <w:color w:val="23272B"/>
+          <w:sz w:val="19"/>
+          <w:rFonts w:ascii="Calibri" w:hAnsi="Calibri" w:cs="Calibri"/>
+        </w:rPr>
+        <w:t>Ran oxygen therapy management for the hospital through the pandemic and developed the formulas for calculating patient oxygen consumption. The figures were used to size plant capacity, cylinder stock and flow requirements, and to support planning decisions at managerial and national level.</w:t>
+      </w:r>
+    </w:p>
+    <w:p>
+      <w:pPr>
+        <w:keepNext/>
+        <w:tabs>
+          <w:tab w:pos="10238" w:val="right"/>
+        </w:tabs>
+        <w:spacing w:before="120" w:after="0" w:line="245" w:lineRule="auto"/>
       </w:pPr>
       <w:r>
         <w:rPr>
@@ -2005,13 +2292,13 @@
           <w:rFonts w:ascii="Calibri" w:hAnsi="Calibri" w:cs="Calibri"/>
         </w:rPr>
         <w:tab/>
-        <w:t>2025 – present</w:t>
+        <w:t>2025 to present</w:t>
       </w:r>
     </w:p>
     <w:p>
       <w:pPr>
         <w:keepNext/>
-        <w:spacing w:before="0" w:after="40" w:line="254" w:lineRule="auto"/>
+        <w:spacing w:before="0" w:after="40" w:line="245" w:lineRule="auto"/>
       </w:pPr>
       <w:r>
         <w:rPr>
@@ -2022,12 +2309,12 @@
           <w:sz w:val="18"/>
           <w:rFonts w:ascii="Calibri" w:hAnsi="Calibri" w:cs="Calibri"/>
         </w:rPr>
-        <w:t>Designer and Developer  —  Law firm, Texas, USA</w:t>
+        <w:t>Designer and Developer  ·  Law firm, Texas, USA</w:t>
       </w:r>
     </w:p>
     <w:p>
       <w:pPr>
-        <w:spacing w:before="0" w:after="40" w:line="254" w:lineRule="auto"/>
+        <w:spacing w:before="0" w:after="40" w:line="245" w:lineRule="auto"/>
         <w:jc w:val="both"/>
       </w:pPr>
       <w:r>
@@ -2048,139 +2335,7 @@
         <w:tabs>
           <w:tab w:pos="10238" w:val="right"/>
         </w:tabs>
-        <w:spacing w:before="120" w:after="0" w:line="254" w:lineRule="auto"/>
-      </w:pPr>
-      <w:r>
-        <w:rPr>
-          <w:rFonts w:ascii="Calibri" w:hAnsi="Calibri"/>
-          <w:b/>
-          <w:i w:val="0"/>
-          <w:color w:val="0F2C4C"/>
-          <w:sz w:val="20"/>
-          <w:rFonts w:ascii="Calibri" w:hAnsi="Calibri" w:cs="Calibri"/>
-        </w:rPr>
-        <w:t>Hospital equipment installation and commissioning programme</w:t>
-      </w:r>
-      <w:r>
-        <w:rPr>
-          <w:rFonts w:ascii="Calibri" w:hAnsi="Calibri"/>
-          <w:b/>
-          <w:i w:val="0"/>
-          <w:color w:val="1A6B5C"/>
-          <w:sz w:val="18"/>
-          <w:rFonts w:ascii="Calibri" w:hAnsi="Calibri" w:cs="Calibri"/>
-        </w:rPr>
-        <w:tab/>
-        <w:t>2020 – 2024</w:t>
-      </w:r>
-    </w:p>
-    <w:p>
-      <w:pPr>
-        <w:keepNext/>
-        <w:spacing w:before="0" w:after="40" w:line="254" w:lineRule="auto"/>
-      </w:pPr>
-      <w:r>
-        <w:rPr>
-          <w:rFonts w:ascii="Calibri" w:hAnsi="Calibri"/>
-          <w:b w:val="0"/>
-          <w:i/>
-          <w:color w:val="5A6472"/>
-          <w:sz w:val="18"/>
-          <w:rFonts w:ascii="Calibri" w:hAnsi="Calibri" w:cs="Calibri"/>
-        </w:rPr>
-        <w:t>Biomedical Manager  —  International Hospital Kampala</w:t>
-      </w:r>
-    </w:p>
-    <w:p>
-      <w:pPr>
-        <w:spacing w:before="0" w:after="40" w:line="254" w:lineRule="auto"/>
-        <w:jc w:val="both"/>
-      </w:pPr>
-      <w:r>
-        <w:rPr>
-          <w:rFonts w:ascii="Calibri" w:hAnsi="Calibri"/>
-          <w:b w:val="0"/>
-          <w:i w:val="0"/>
-          <w:color w:val="23272B"/>
-          <w:sz w:val="19"/>
-          <w:rFonts w:ascii="Calibri" w:hAnsi="Calibri" w:cs="Calibri"/>
-        </w:rPr>
-        <w:t>CT, X-ray, oxygen plant, laboratory, theatre and ICU systems. Led installation, commissioning and handover, with preventive maintenance and service documentation that cut downtime.</w:t>
-      </w:r>
-    </w:p>
-    <w:p>
-      <w:pPr>
-        <w:keepNext/>
-        <w:tabs>
-          <w:tab w:pos="10238" w:val="right"/>
-        </w:tabs>
-        <w:spacing w:before="120" w:after="0" w:line="254" w:lineRule="auto"/>
-      </w:pPr>
-      <w:r>
-        <w:rPr>
-          <w:rFonts w:ascii="Calibri" w:hAnsi="Calibri"/>
-          <w:b/>
-          <w:i w:val="0"/>
-          <w:color w:val="0F2C4C"/>
-          <w:sz w:val="20"/>
-          <w:rFonts w:ascii="Calibri" w:hAnsi="Calibri" w:cs="Calibri"/>
-        </w:rPr>
-        <w:t>COHSASA hospital accreditation programme</w:t>
-      </w:r>
-      <w:r>
-        <w:rPr>
-          <w:rFonts w:ascii="Calibri" w:hAnsi="Calibri"/>
-          <w:b/>
-          <w:i w:val="0"/>
-          <w:color w:val="1A6B5C"/>
-          <w:sz w:val="18"/>
-          <w:rFonts w:ascii="Calibri" w:hAnsi="Calibri" w:cs="Calibri"/>
-        </w:rPr>
-        <w:tab/>
-        <w:t>2020 – 2024</w:t>
-      </w:r>
-    </w:p>
-    <w:p>
-      <w:pPr>
-        <w:keepNext/>
-        <w:spacing w:before="0" w:after="40" w:line="254" w:lineRule="auto"/>
-      </w:pPr>
-      <w:r>
-        <w:rPr>
-          <w:rFonts w:ascii="Calibri" w:hAnsi="Calibri"/>
-          <w:b w:val="0"/>
-          <w:i/>
-          <w:color w:val="5A6472"/>
-          <w:sz w:val="18"/>
-          <w:rFonts w:ascii="Calibri" w:hAnsi="Calibri" w:cs="Calibri"/>
-        </w:rPr>
-        <w:t>Biomedical Manager  —  International Hospital Kampala</w:t>
-      </w:r>
-    </w:p>
-    <w:p>
-      <w:pPr>
-        <w:spacing w:before="0" w:after="40" w:line="254" w:lineRule="auto"/>
-        <w:jc w:val="both"/>
-      </w:pPr>
-      <w:r>
-        <w:rPr>
-          <w:rFonts w:ascii="Calibri" w:hAnsi="Calibri"/>
-          <w:b w:val="0"/>
-          <w:i w:val="0"/>
-          <w:color w:val="23272B"/>
-          <w:sz w:val="19"/>
-          <w:rFonts w:ascii="Calibri" w:hAnsi="Calibri" w:cs="Calibri"/>
-        </w:rPr>
-        <w:t>Maintained equipment, maintenance and compliance evidence to accreditation standard and supported the hospital through successful accreditation.</w:t>
-      </w:r>
-    </w:p>
-    <w:p>
-      <w:pPr>
-        <w:keepNext/>
-        <w:tabs>
-          <w:tab w:pos="10238" w:val="right"/>
-        </w:tabs>
-        <w:spacing w:before="120" w:after="0" w:line="254" w:lineRule="auto"/>
+        <w:spacing w:before="120" w:after="0" w:line="245" w:lineRule="auto"/>
       </w:pPr>
       <w:r>
         <w:rPr>
@@ -2203,13 +2358,13 @@
           <w:rFonts w:ascii="Calibri" w:hAnsi="Calibri" w:cs="Calibri"/>
         </w:rPr>
         <w:tab/>
-        <w:t>2021 – 2024</w:t>
+        <w:t>2021 to 2024</w:t>
       </w:r>
     </w:p>
     <w:p>
       <w:pPr>
         <w:keepNext/>
-        <w:spacing w:before="0" w:after="40" w:line="254" w:lineRule="auto"/>
+        <w:spacing w:before="0" w:after="40" w:line="245" w:lineRule="auto"/>
       </w:pPr>
       <w:r>
         <w:rPr>
@@ -2220,12 +2375,12 @@
           <w:sz w:val="18"/>
           <w:rFonts w:ascii="Calibri" w:hAnsi="Calibri" w:cs="Calibri"/>
         </w:rPr>
-        <w:t>Assistant Software Developer  —  Shulekeeper</w:t>
+        <w:t>Assistant Software Developer  ·  Shulekeeper</w:t>
       </w:r>
     </w:p>
     <w:p>
       <w:pPr>
-        <w:spacing w:before="0" w:after="40" w:line="254" w:lineRule="auto"/>
+        <w:spacing w:before="0" w:after="40" w:line="245" w:lineRule="auto"/>
         <w:jc w:val="both"/>
       </w:pPr>
       <w:r>
@@ -2246,7 +2401,7 @@
         <w:tabs>
           <w:tab w:pos="10238" w:val="right"/>
         </w:tabs>
-        <w:spacing w:before="120" w:after="0" w:line="254" w:lineRule="auto"/>
+        <w:spacing w:before="120" w:after="0" w:line="245" w:lineRule="auto"/>
       </w:pPr>
       <w:r>
         <w:rPr>
@@ -2269,13 +2424,13 @@
           <w:rFonts w:ascii="Calibri" w:hAnsi="Calibri" w:cs="Calibri"/>
         </w:rPr>
         <w:tab/>
-        <w:t>2017 – 2019</w:t>
+        <w:t>2017 to 2019</w:t>
       </w:r>
     </w:p>
     <w:p>
       <w:pPr>
         <w:keepNext/>
-        <w:spacing w:before="0" w:after="40" w:line="254" w:lineRule="auto"/>
+        <w:spacing w:before="0" w:after="40" w:line="245" w:lineRule="auto"/>
       </w:pPr>
       <w:r>
         <w:rPr>
@@ -2286,12 +2441,12 @@
           <w:sz w:val="18"/>
           <w:rFonts w:ascii="Calibri" w:hAnsi="Calibri" w:cs="Calibri"/>
         </w:rPr>
-        <w:t>Lead Software Developer  —  St. Catherine Hospital and St. Francis Hospital</w:t>
+        <w:t>Lead Software Developer  ·  St. Catherine Hospital and St. Francis Hospital</w:t>
       </w:r>
     </w:p>
     <w:p>
       <w:pPr>
-        <w:spacing w:before="0" w:after="40" w:line="254" w:lineRule="auto"/>
+        <w:spacing w:before="0" w:after="40" w:line="245" w:lineRule="auto"/>
         <w:jc w:val="both"/>
       </w:pPr>
       <w:r>
@@ -2312,7 +2467,7 @@
         <w:tabs>
           <w:tab w:pos="10238" w:val="right"/>
         </w:tabs>
-        <w:spacing w:before="120" w:after="0" w:line="254" w:lineRule="auto"/>
+        <w:spacing w:before="120" w:after="0" w:line="245" w:lineRule="auto"/>
       </w:pPr>
       <w:r>
         <w:rPr>
@@ -2335,13 +2490,13 @@
           <w:rFonts w:ascii="Calibri" w:hAnsi="Calibri" w:cs="Calibri"/>
         </w:rPr>
         <w:tab/>
-        <w:t>2017 – 2024</w:t>
+        <w:t>2017 to 2024</w:t>
       </w:r>
     </w:p>
     <w:p>
       <w:pPr>
         <w:keepNext/>
-        <w:spacing w:before="0" w:after="40" w:line="254" w:lineRule="auto"/>
+        <w:spacing w:before="0" w:after="40" w:line="245" w:lineRule="auto"/>
       </w:pPr>
       <w:r>
         <w:rPr>
@@ -2352,12 +2507,12 @@
           <w:sz w:val="18"/>
           <w:rFonts w:ascii="Calibri" w:hAnsi="Calibri" w:cs="Calibri"/>
         </w:rPr>
-        <w:t>Electronics Developer and Programmer  —  Wekebere</w:t>
+        <w:t>Electronics Developer and Programmer  ·  Wekebere</w:t>
       </w:r>
     </w:p>
     <w:p>
       <w:pPr>
-        <w:spacing w:before="0" w:after="40" w:line="254" w:lineRule="auto"/>
+        <w:spacing w:before="0" w:after="40" w:line="245" w:lineRule="auto"/>
         <w:jc w:val="both"/>
       </w:pPr>
       <w:r>
@@ -2375,9 +2530,11 @@
     <w:p>
       <w:pPr>
         <w:keepNext/>
-        <w:spacing w:before="220" w:after="100" w:line="254" w:lineRule="auto"/>
+        <w:spacing w:before="180" w:after="90" w:line="245" w:lineRule="auto"/>
+        <w:ind w:left="158"/>
         <w:pBdr>
-          <w:bottom w:val="single" w:sz="8" w:space="3" w:color="1A6B5C"/>
+          <w:left w:val="single" w:sz="22" w:space="6" w:color="1A6B5C"/>
+          <w:bottom w:val="single" w:sz="4" w:space="4" w:color="CFD8E3"/>
         </w:pBdr>
       </w:pPr>
       <w:r>
@@ -2388,7 +2545,7 @@
           <w:color w:val="0F2C4C"/>
           <w:sz w:val="21"/>
           <w:rFonts w:ascii="Calibri" w:hAnsi="Calibri" w:cs="Calibri"/>
-          <w:spacing w:val="24"/>
+          <w:spacing w:val="26"/>
         </w:rPr>
         <w:t>PROFESSIONAL COMPETENCIES</w:t>
       </w:r>
@@ -2407,6 +2564,12 @@
           <w:insideH w:val="none" w:sz="0"/>
           <w:insideV w:val="none" w:sz="0"/>
         </w:tblBorders>
+        <w:tblCellMar>
+          <w:top w:w="42" w:type="dxa"/>
+          <w:left w:w="85" w:type="dxa"/>
+          <w:bottom w:w="42" w:type="dxa"/>
+          <w:right w:w="85" w:type="dxa"/>
+        </w:tblCellMar>
       </w:tblPr>
       <w:tblGrid>
         <w:gridCol w:w="5119"/>
@@ -2416,11 +2579,11 @@
         <w:tc>
           <w:tcPr>
             <w:tcW w:type="dxa" w:w="2951"/>
-            <w:shd w:val="clear" w:color="auto" w:fill="F2F5F8"/>
+            <w:shd w:val="clear" w:color="auto" w:fill="F3F6F9"/>
           </w:tcPr>
           <w:p>
             <w:pPr>
-              <w:spacing w:before="60" w:after="60" w:line="245" w:lineRule="auto"/>
+              <w:spacing w:after="0" w:line="250" w:lineRule="auto"/>
             </w:pPr>
             <w:r>
               <w:rPr>
@@ -2437,12 +2600,12 @@
         </w:tc>
         <w:tc>
           <w:tcPr>
-            <w:tcW w:type="dxa" w:w="7416"/>
-            <w:shd w:val="clear" w:color="auto" w:fill="F2F5F8"/>
+            <w:tcW w:type="dxa" w:w="7286"/>
+            <w:shd w:val="clear" w:color="auto" w:fill="F3F6F9"/>
           </w:tcPr>
           <w:p>
             <w:pPr>
-              <w:spacing w:before="60" w:after="60" w:line="254" w:lineRule="auto"/>
+              <w:spacing w:after="0" w:line="259" w:lineRule="auto"/>
             </w:pPr>
             <w:r>
               <w:rPr>
@@ -2465,7 +2628,7 @@
           </w:tcPr>
           <w:p>
             <w:pPr>
-              <w:spacing w:before="60" w:after="60" w:line="245" w:lineRule="auto"/>
+              <w:spacing w:after="0" w:line="250" w:lineRule="auto"/>
             </w:pPr>
             <w:r>
               <w:rPr>
@@ -2482,11 +2645,11 @@
         </w:tc>
         <w:tc>
           <w:tcPr>
-            <w:tcW w:type="dxa" w:w="7416"/>
+            <w:tcW w:type="dxa" w:w="7286"/>
           </w:tcPr>
           <w:p>
             <w:pPr>
-              <w:spacing w:before="60" w:after="60" w:line="254" w:lineRule="auto"/>
+              <w:spacing w:after="0" w:line="259" w:lineRule="auto"/>
             </w:pPr>
             <w:r>
               <w:rPr>
@@ -2506,11 +2669,11 @@
         <w:tc>
           <w:tcPr>
             <w:tcW w:type="dxa" w:w="2951"/>
-            <w:shd w:val="clear" w:color="auto" w:fill="F2F5F8"/>
+            <w:shd w:val="clear" w:color="auto" w:fill="F3F6F9"/>
           </w:tcPr>
           <w:p>
             <w:pPr>
-              <w:spacing w:before="60" w:after="60" w:line="245" w:lineRule="auto"/>
+              <w:spacing w:after="0" w:line="250" w:lineRule="auto"/>
             </w:pPr>
             <w:r>
               <w:rPr>
@@ -2527,12 +2690,12 @@
         </w:tc>
         <w:tc>
           <w:tcPr>
-            <w:tcW w:type="dxa" w:w="7416"/>
-            <w:shd w:val="clear" w:color="auto" w:fill="F2F5F8"/>
+            <w:tcW w:type="dxa" w:w="7286"/>
+            <w:shd w:val="clear" w:color="auto" w:fill="F3F6F9"/>
           </w:tcPr>
           <w:p>
             <w:pPr>
-              <w:spacing w:before="60" w:after="60" w:line="254" w:lineRule="auto"/>
+              <w:spacing w:after="0" w:line="259" w:lineRule="auto"/>
             </w:pPr>
             <w:r>
               <w:rPr>
@@ -2555,7 +2718,7 @@
           </w:tcPr>
           <w:p>
             <w:pPr>
-              <w:spacing w:before="60" w:after="60" w:line="245" w:lineRule="auto"/>
+              <w:spacing w:after="0" w:line="250" w:lineRule="auto"/>
             </w:pPr>
             <w:r>
               <w:rPr>
@@ -2572,11 +2735,11 @@
         </w:tc>
         <w:tc>
           <w:tcPr>
-            <w:tcW w:type="dxa" w:w="7416"/>
+            <w:tcW w:type="dxa" w:w="7286"/>
           </w:tcPr>
           <w:p>
             <w:pPr>
-              <w:spacing w:before="60" w:after="60" w:line="254" w:lineRule="auto"/>
+              <w:spacing w:after="0" w:line="259" w:lineRule="auto"/>
             </w:pPr>
             <w:r>
               <w:rPr>
@@ -2587,7 +2750,7 @@
                 <w:sz w:val="19"/>
                 <w:rFonts w:ascii="Calibri" w:hAnsi="Calibri" w:cs="Calibri"/>
               </w:rPr>
-              <w:t>Cleans, models and reports on operational and clinical data; builds automated auditing and verification tooling to check records at scale rather than by hand.</w:t>
+              <w:t>Cleans, models and reports on operational and clinical data. Builds automated auditing and verification tooling to check records in bulk rather than by hand.</w:t>
             </w:r>
           </w:p>
         </w:tc>
@@ -2596,11 +2759,11 @@
         <w:tc>
           <w:tcPr>
             <w:tcW w:type="dxa" w:w="2951"/>
-            <w:shd w:val="clear" w:color="auto" w:fill="F2F5F8"/>
+            <w:shd w:val="clear" w:color="auto" w:fill="F3F6F9"/>
           </w:tcPr>
           <w:p>
             <w:pPr>
-              <w:spacing w:before="60" w:after="60" w:line="245" w:lineRule="auto"/>
+              <w:spacing w:after="0" w:line="250" w:lineRule="auto"/>
             </w:pPr>
             <w:r>
               <w:rPr>
@@ -2617,12 +2780,12 @@
         </w:tc>
         <w:tc>
           <w:tcPr>
-            <w:tcW w:type="dxa" w:w="7416"/>
-            <w:shd w:val="clear" w:color="auto" w:fill="F2F5F8"/>
+            <w:tcW w:type="dxa" w:w="7286"/>
+            <w:shd w:val="clear" w:color="auto" w:fill="F3F6F9"/>
           </w:tcPr>
           <w:p>
             <w:pPr>
-              <w:spacing w:before="60" w:after="60" w:line="254" w:lineRule="auto"/>
+              <w:spacing w:after="0" w:line="259" w:lineRule="auto"/>
             </w:pPr>
             <w:r>
               <w:rPr>
@@ -2645,7 +2808,7 @@
           </w:tcPr>
           <w:p>
             <w:pPr>
-              <w:spacing w:before="60" w:after="60" w:line="245" w:lineRule="auto"/>
+              <w:spacing w:after="0" w:line="250" w:lineRule="auto"/>
             </w:pPr>
             <w:r>
               <w:rPr>
@@ -2662,11 +2825,11 @@
         </w:tc>
         <w:tc>
           <w:tcPr>
-            <w:tcW w:type="dxa" w:w="7416"/>
+            <w:tcW w:type="dxa" w:w="7286"/>
           </w:tcPr>
           <w:p>
             <w:pPr>
-              <w:spacing w:before="60" w:after="60" w:line="254" w:lineRule="auto"/>
+              <w:spacing w:after="0" w:line="259" w:lineRule="auto"/>
             </w:pPr>
             <w:r>
               <w:rPr>
@@ -2677,7 +2840,7 @@
                 <w:sz w:val="19"/>
                 <w:rFonts w:ascii="Calibri" w:hAnsi="Calibri" w:cs="Calibri"/>
               </w:rPr>
-              <w:t>Chairs partner meetings and writes them up; works with hospital departments, suppliers, trainees, accreditation assessors, donors and prospective partners.</w:t>
+              <w:t>Chairs partner meetings and writes them up. Works with hospital departments, suppliers, trainees, accreditation assessors, donors and prospective partners.</w:t>
             </w:r>
           </w:p>
         </w:tc>
@@ -2686,11 +2849,11 @@
         <w:tc>
           <w:tcPr>
             <w:tcW w:type="dxa" w:w="2951"/>
-            <w:shd w:val="clear" w:color="auto" w:fill="F2F5F8"/>
+            <w:shd w:val="clear" w:color="auto" w:fill="F3F6F9"/>
           </w:tcPr>
           <w:p>
             <w:pPr>
-              <w:spacing w:before="60" w:after="60" w:line="245" w:lineRule="auto"/>
+              <w:spacing w:after="0" w:line="250" w:lineRule="auto"/>
             </w:pPr>
             <w:r>
               <w:rPr>
@@ -2707,12 +2870,12 @@
         </w:tc>
         <w:tc>
           <w:tcPr>
-            <w:tcW w:type="dxa" w:w="7416"/>
-            <w:shd w:val="clear" w:color="auto" w:fill="F2F5F8"/>
+            <w:tcW w:type="dxa" w:w="7286"/>
+            <w:shd w:val="clear" w:color="auto" w:fill="F3F6F9"/>
           </w:tcPr>
           <w:p>
             <w:pPr>
-              <w:spacing w:before="60" w:after="60" w:line="254" w:lineRule="auto"/>
+              <w:spacing w:after="0" w:line="259" w:lineRule="auto"/>
             </w:pPr>
             <w:r>
               <w:rPr>
@@ -2735,7 +2898,7 @@
           </w:tcPr>
           <w:p>
             <w:pPr>
-              <w:spacing w:before="60" w:after="60" w:line="245" w:lineRule="auto"/>
+              <w:spacing w:after="0" w:line="250" w:lineRule="auto"/>
             </w:pPr>
             <w:r>
               <w:rPr>
@@ -2752,11 +2915,11 @@
         </w:tc>
         <w:tc>
           <w:tcPr>
-            <w:tcW w:type="dxa" w:w="7416"/>
+            <w:tcW w:type="dxa" w:w="7286"/>
           </w:tcPr>
           <w:p>
             <w:pPr>
-              <w:spacing w:before="60" w:after="60" w:line="254" w:lineRule="auto"/>
+              <w:spacing w:after="0" w:line="259" w:lineRule="auto"/>
             </w:pPr>
             <w:r>
               <w:rPr>
@@ -2767,7 +2930,7 @@
                 <w:sz w:val="19"/>
                 <w:rFonts w:ascii="Calibri" w:hAnsi="Calibri" w:cs="Calibri"/>
               </w:rPr>
-              <w:t>Clear written and spoken English, comfortable presenting to clinical, executive and donor audiences; settles quickly into new countries, teams, codebases and equipment brands.</w:t>
+              <w:t>Clear written and spoken English, comfortable presenting to clinical, executive and donor audiences. Settles quickly into new countries, teams, codebases and equipment brands.</w:t>
             </w:r>
           </w:p>
         </w:tc>
@@ -2776,9 +2939,11 @@
     <w:p>
       <w:pPr>
         <w:keepNext/>
-        <w:spacing w:before="220" w:after="100" w:line="254" w:lineRule="auto"/>
+        <w:spacing w:before="180" w:after="90" w:line="245" w:lineRule="auto"/>
+        <w:ind w:left="158"/>
         <w:pBdr>
-          <w:bottom w:val="single" w:sz="8" w:space="3" w:color="1A6B5C"/>
+          <w:left w:val="single" w:sz="22" w:space="6" w:color="1A6B5C"/>
+          <w:bottom w:val="single" w:sz="4" w:space="4" w:color="CFD8E3"/>
         </w:pBdr>
       </w:pPr>
       <w:r>
@@ -2789,9 +2954,9 @@
           <w:color w:val="0F2C4C"/>
           <w:sz w:val="21"/>
           <w:rFonts w:ascii="Calibri" w:hAnsi="Calibri" w:cs="Calibri"/>
-          <w:spacing w:val="24"/>
+          <w:spacing w:val="26"/>
         </w:rPr>
-        <w:t>MEDICAL EQUIPMENT AND CLINICAL TECHNOLOGY EXPERIENCE</w:t>
+        <w:t>MEDICAL EQUIPMENT EXPERIENCE</w:t>
       </w:r>
     </w:p>
     <w:tbl>
@@ -2808,6 +2973,12 @@
           <w:insideH w:val="none" w:sz="0"/>
           <w:insideV w:val="none" w:sz="0"/>
         </w:tblBorders>
+        <w:tblCellMar>
+          <w:top w:w="42" w:type="dxa"/>
+          <w:left w:w="85" w:type="dxa"/>
+          <w:bottom w:w="42" w:type="dxa"/>
+          <w:right w:w="85" w:type="dxa"/>
+        </w:tblCellMar>
       </w:tblPr>
       <w:tblGrid>
         <w:gridCol w:w="5119"/>
@@ -2816,12 +2987,12 @@
       <w:tr>
         <w:tc>
           <w:tcPr>
-            <w:tcW w:type="dxa" w:w="2476"/>
-            <w:shd w:val="clear" w:color="auto" w:fill="F2F5F8"/>
+            <w:tcW w:type="dxa" w:w="2534"/>
+            <w:shd w:val="clear" w:color="auto" w:fill="F3F6F9"/>
           </w:tcPr>
           <w:p>
             <w:pPr>
-              <w:spacing w:before="60" w:after="60" w:line="245" w:lineRule="auto"/>
+              <w:spacing w:after="0" w:line="250" w:lineRule="auto"/>
             </w:pPr>
             <w:r>
               <w:rPr>
@@ -2838,12 +3009,12 @@
         </w:tc>
         <w:tc>
           <w:tcPr>
-            <w:tcW w:type="dxa" w:w="7891"/>
-            <w:shd w:val="clear" w:color="auto" w:fill="F2F5F8"/>
+            <w:tcW w:type="dxa" w:w="7704"/>
+            <w:shd w:val="clear" w:color="auto" w:fill="F3F6F9"/>
           </w:tcPr>
           <w:p>
             <w:pPr>
-              <w:spacing w:before="60" w:after="60" w:line="254" w:lineRule="auto"/>
+              <w:spacing w:after="0" w:line="259" w:lineRule="auto"/>
             </w:pPr>
             <w:r>
               <w:rPr>
@@ -2862,11 +3033,11 @@
       <w:tr>
         <w:tc>
           <w:tcPr>
-            <w:tcW w:type="dxa" w:w="2476"/>
+            <w:tcW w:type="dxa" w:w="2534"/>
           </w:tcPr>
           <w:p>
             <w:pPr>
-              <w:spacing w:before="60" w:after="60" w:line="245" w:lineRule="auto"/>
+              <w:spacing w:after="0" w:line="250" w:lineRule="auto"/>
             </w:pPr>
             <w:r>
               <w:rPr>
@@ -2883,11 +3054,11 @@
         </w:tc>
         <w:tc>
           <w:tcPr>
-            <w:tcW w:type="dxa" w:w="7891"/>
+            <w:tcW w:type="dxa" w:w="7704"/>
           </w:tcPr>
           <w:p>
             <w:pPr>
-              <w:spacing w:before="60" w:after="60" w:line="254" w:lineRule="auto"/>
+              <w:spacing w:after="0" w:line="259" w:lineRule="auto"/>
             </w:pPr>
             <w:r>
               <w:rPr>
@@ -2906,12 +3077,57 @@
       <w:tr>
         <w:tc>
           <w:tcPr>
-            <w:tcW w:type="dxa" w:w="2476"/>
-            <w:shd w:val="clear" w:color="auto" w:fill="F2F5F8"/>
+            <w:tcW w:type="dxa" w:w="2534"/>
+            <w:shd w:val="clear" w:color="auto" w:fill="F3F6F9"/>
           </w:tcPr>
           <w:p>
             <w:pPr>
-              <w:spacing w:before="60" w:after="60" w:line="245" w:lineRule="auto"/>
+              <w:spacing w:after="0" w:line="250" w:lineRule="auto"/>
+            </w:pPr>
+            <w:r>
+              <w:rPr>
+                <w:rFonts w:ascii="Calibri" w:hAnsi="Calibri"/>
+                <w:b/>
+                <w:i w:val="0"/>
+                <w:color w:val="0F2C4C"/>
+                <w:sz w:val="19"/>
+                <w:rFonts w:ascii="Calibri" w:hAnsi="Calibri" w:cs="Calibri"/>
+              </w:rPr>
+              <w:t>Oxygen and medical gas</w:t>
+            </w:r>
+          </w:p>
+        </w:tc>
+        <w:tc>
+          <w:tcPr>
+            <w:tcW w:type="dxa" w:w="7704"/>
+            <w:shd w:val="clear" w:color="auto" w:fill="F3F6F9"/>
+          </w:tcPr>
+          <w:p>
+            <w:pPr>
+              <w:spacing w:after="0" w:line="259" w:lineRule="auto"/>
+            </w:pPr>
+            <w:r>
+              <w:rPr>
+                <w:rFonts w:ascii="Calibri" w:hAnsi="Calibri"/>
+                <w:b w:val="0"/>
+                <w:i w:val="0"/>
+                <w:color w:val="23272B"/>
+                <w:sz w:val="19"/>
+                <w:rFonts w:ascii="Calibri" w:hAnsi="Calibri" w:cs="Calibri"/>
+              </w:rPr>
+              <w:t>Oxygen plants  ·  concentrators  ·  cylinder and manifold systems  ·  piped medical gas  ·  oxygen demand and capacity calculation</w:t>
+            </w:r>
+          </w:p>
+        </w:tc>
+      </w:tr>
+      <w:tr>
+        <w:tc>
+          <w:tcPr>
+            <w:tcW w:type="dxa" w:w="2534"/>
+          </w:tcPr>
+          <w:p>
+            <w:pPr>
+              <w:spacing w:after="0" w:line="250" w:lineRule="auto"/>
             </w:pPr>
             <w:r>
               <w:rPr>
@@ -2928,12 +3144,11 @@
         </w:tc>
         <w:tc>
           <w:tcPr>
-            <w:tcW w:type="dxa" w:w="7891"/>
-            <w:shd w:val="clear" w:color="auto" w:fill="F2F5F8"/>
+            <w:tcW w:type="dxa" w:w="7704"/>
           </w:tcPr>
           <w:p>
             <w:pPr>
-              <w:spacing w:before="60" w:after="60" w:line="254" w:lineRule="auto"/>
+              <w:spacing w:after="0" w:line="259" w:lineRule="auto"/>
             </w:pPr>
             <w:r>
               <w:rPr>
@@ -2952,11 +3167,12 @@
       <w:tr>
         <w:tc>
           <w:tcPr>
-            <w:tcW w:type="dxa" w:w="2476"/>
+            <w:tcW w:type="dxa" w:w="2534"/>
+            <w:shd w:val="clear" w:color="auto" w:fill="F3F6F9"/>
           </w:tcPr>
           <w:p>
             <w:pPr>
-              <w:spacing w:before="60" w:after="60" w:line="245" w:lineRule="auto"/>
+              <w:spacing w:after="0" w:line="250" w:lineRule="auto"/>
             </w:pPr>
             <w:r>
               <w:rPr>
@@ -2973,11 +3189,12 @@
         </w:tc>
         <w:tc>
           <w:tcPr>
-            <w:tcW w:type="dxa" w:w="7891"/>
+            <w:tcW w:type="dxa" w:w="7704"/>
+            <w:shd w:val="clear" w:color="auto" w:fill="F3F6F9"/>
           </w:tcPr>
           <w:p>
             <w:pPr>
-              <w:spacing w:before="60" w:after="60" w:line="254" w:lineRule="auto"/>
+              <w:spacing w:after="0" w:line="259" w:lineRule="auto"/>
             </w:pPr>
             <w:r>
               <w:rPr>
@@ -2996,12 +3213,11 @@
       <w:tr>
         <w:tc>
           <w:tcPr>
-            <w:tcW w:type="dxa" w:w="2476"/>
-            <w:shd w:val="clear" w:color="auto" w:fill="F2F5F8"/>
+            <w:tcW w:type="dxa" w:w="2534"/>
           </w:tcPr>
           <w:p>
             <w:pPr>
-              <w:spacing w:before="60" w:after="60" w:line="245" w:lineRule="auto"/>
+              <w:spacing w:after="0" w:line="250" w:lineRule="auto"/>
             </w:pPr>
             <w:r>
               <w:rPr>
@@ -3018,12 +3234,11 @@
         </w:tc>
         <w:tc>
           <w:tcPr>
-            <w:tcW w:type="dxa" w:w="7891"/>
-            <w:shd w:val="clear" w:color="auto" w:fill="F2F5F8"/>
+            <w:tcW w:type="dxa" w:w="7704"/>
           </w:tcPr>
           <w:p>
             <w:pPr>
-              <w:spacing w:before="60" w:after="60" w:line="254" w:lineRule="auto"/>
+              <w:spacing w:after="0" w:line="259" w:lineRule="auto"/>
             </w:pPr>
             <w:r>
               <w:rPr>
@@ -3034,7 +3249,7 @@
                 <w:sz w:val="19"/>
                 <w:rFonts w:ascii="Calibri" w:hAnsi="Calibri" w:cs="Calibri"/>
               </w:rPr>
-              <w:t>Oxygen plants  ·  RO water treatment systems  ·  medical gas distribution</w:t>
+              <w:t>RO water treatment systems  ·  sterilisation and autoclave equipment</w:t>
             </w:r>
           </w:p>
         </w:tc>
@@ -3043,9 +3258,11 @@
     <w:p>
       <w:pPr>
         <w:keepNext/>
-        <w:spacing w:before="220" w:after="100" w:line="254" w:lineRule="auto"/>
+        <w:spacing w:before="180" w:after="90" w:line="245" w:lineRule="auto"/>
+        <w:ind w:left="158"/>
         <w:pBdr>
-          <w:bottom w:val="single" w:sz="8" w:space="3" w:color="1A6B5C"/>
+          <w:left w:val="single" w:sz="22" w:space="6" w:color="1A6B5C"/>
+          <w:bottom w:val="single" w:sz="4" w:space="4" w:color="CFD8E3"/>
         </w:pBdr>
       </w:pPr>
       <w:r>
@@ -3056,7 +3273,7 @@
           <w:color w:val="0F2C4C"/>
           <w:sz w:val="21"/>
           <w:rFonts w:ascii="Calibri" w:hAnsi="Calibri" w:cs="Calibri"/>
-          <w:spacing w:val="24"/>
+          <w:spacing w:val="26"/>
         </w:rPr>
         <w:t>EDUCATION</w:t>
       </w:r>
@@ -3067,7 +3284,7 @@
         <w:tabs>
           <w:tab w:pos="10238" w:val="right"/>
         </w:tabs>
-        <w:spacing w:before="40" w:after="0" w:line="254" w:lineRule="auto"/>
+        <w:spacing w:before="0" w:after="0" w:line="245" w:lineRule="auto"/>
       </w:pPr>
       <w:r>
         <w:rPr>
@@ -3096,7 +3313,7 @@
     <w:p>
       <w:pPr>
         <w:keepNext/>
-        <w:spacing w:before="0" w:after="40" w:line="254" w:lineRule="auto"/>
+        <w:spacing w:before="0" w:after="40" w:line="245" w:lineRule="auto"/>
       </w:pPr>
       <w:r>
         <w:rPr>
@@ -3112,7 +3329,7 @@
     </w:p>
     <w:p>
       <w:pPr>
-        <w:spacing w:before="0" w:after="40" w:line="254" w:lineRule="auto"/>
+        <w:spacing w:before="0" w:after="40" w:line="245" w:lineRule="auto"/>
         <w:jc w:val="both"/>
       </w:pPr>
       <w:r>
@@ -3133,7 +3350,7 @@
         <w:tabs>
           <w:tab w:pos="10238" w:val="right"/>
         </w:tabs>
-        <w:spacing w:before="120" w:after="0" w:line="254" w:lineRule="auto"/>
+        <w:spacing w:before="120" w:after="0" w:line="245" w:lineRule="auto"/>
       </w:pPr>
       <w:r>
         <w:rPr>
@@ -3144,7 +3361,7 @@
           <w:sz w:val="20"/>
           <w:rFonts w:ascii="Calibri" w:hAnsi="Calibri" w:cs="Calibri"/>
         </w:rPr>
-        <w:t>BSc Biomedical Engineering — Second Upper Honours</w:t>
+        <w:t>BSc Biomedical Engineering, Second Upper Honours</w:t>
       </w:r>
       <w:r>
         <w:rPr>
@@ -3156,13 +3373,13 @@
           <w:rFonts w:ascii="Calibri" w:hAnsi="Calibri" w:cs="Calibri"/>
         </w:rPr>
         <w:tab/>
-        <w:t>2012 – 2017</w:t>
+        <w:t>2012 to 2017</w:t>
       </w:r>
     </w:p>
     <w:p>
       <w:pPr>
         <w:keepNext/>
-        <w:spacing w:before="0" w:after="40" w:line="254" w:lineRule="auto"/>
+        <w:spacing w:before="0" w:after="40" w:line="245" w:lineRule="auto"/>
       </w:pPr>
       <w:r>
         <w:rPr>
@@ -3178,7 +3395,7 @@
     </w:p>
     <w:p>
       <w:pPr>
-        <w:spacing w:before="0" w:after="40" w:line="254" w:lineRule="auto"/>
+        <w:spacing w:before="0" w:after="40" w:line="245" w:lineRule="auto"/>
         <w:jc w:val="both"/>
       </w:pPr>
       <w:r>
@@ -3199,7 +3416,7 @@
         <w:tabs>
           <w:tab w:pos="10238" w:val="right"/>
         </w:tabs>
-        <w:spacing w:before="120" w:after="0" w:line="254" w:lineRule="auto"/>
+        <w:spacing w:before="120" w:after="0" w:line="245" w:lineRule="auto"/>
       </w:pPr>
       <w:r>
         <w:rPr>
@@ -3210,7 +3427,7 @@
           <w:sz w:val="20"/>
           <w:rFonts w:ascii="Calibri" w:hAnsi="Calibri" w:cs="Calibri"/>
         </w:rPr>
-        <w:t>Advanced Java Programming — Level 1</w:t>
+        <w:t>Advanced Java Programming, Level 1</w:t>
       </w:r>
       <w:r>
         <w:rPr>
@@ -3222,13 +3439,13 @@
           <w:rFonts w:ascii="Calibri" w:hAnsi="Calibri" w:cs="Calibri"/>
         </w:rPr>
         <w:tab/>
-        <w:t>2015 – 2016</w:t>
+        <w:t>2015 to 2016</w:t>
       </w:r>
     </w:p>
     <w:p>
       <w:pPr>
         <w:keepNext/>
-        <w:spacing w:before="0" w:after="40" w:line="254" w:lineRule="auto"/>
+        <w:spacing w:before="0" w:after="40" w:line="245" w:lineRule="auto"/>
       </w:pPr>
       <w:r>
         <w:rPr>
@@ -3244,7 +3461,7 @@
     </w:p>
     <w:p>
       <w:pPr>
-        <w:spacing w:before="0" w:after="40" w:line="254" w:lineRule="auto"/>
+        <w:spacing w:before="0" w:after="40" w:line="245" w:lineRule="auto"/>
         <w:jc w:val="both"/>
       </w:pPr>
       <w:r>
@@ -3265,7 +3482,7 @@
         <w:tabs>
           <w:tab w:pos="10238" w:val="right"/>
         </w:tabs>
-        <w:spacing w:before="120" w:after="0" w:line="254" w:lineRule="auto"/>
+        <w:spacing w:before="120" w:after="0" w:line="245" w:lineRule="auto"/>
       </w:pPr>
       <w:r>
         <w:rPr>
@@ -3294,7 +3511,7 @@
     <w:p>
       <w:pPr>
         <w:keepNext/>
-        <w:spacing w:before="0" w:after="40" w:line="254" w:lineRule="auto"/>
+        <w:spacing w:before="0" w:after="40" w:line="245" w:lineRule="auto"/>
       </w:pPr>
       <w:r>
         <w:rPr>
@@ -3310,7 +3527,7 @@
     </w:p>
     <w:p>
       <w:pPr>
-        <w:spacing w:before="0" w:after="40" w:line="254" w:lineRule="auto"/>
+        <w:spacing w:before="0" w:after="40" w:line="245" w:lineRule="auto"/>
         <w:jc w:val="both"/>
       </w:pPr>
       <w:r>
@@ -3331,7 +3548,7 @@
         <w:tabs>
           <w:tab w:pos="10238" w:val="right"/>
         </w:tabs>
-        <w:spacing w:before="120" w:after="0" w:line="254" w:lineRule="auto"/>
+        <w:spacing w:before="120" w:after="0" w:line="245" w:lineRule="auto"/>
       </w:pPr>
       <w:r>
         <w:rPr>
@@ -3360,7 +3577,7 @@
     <w:p>
       <w:pPr>
         <w:keepNext/>
-        <w:spacing w:before="0" w:after="0" w:line="254" w:lineRule="auto"/>
+        <w:spacing w:before="0" w:after="0" w:line="245" w:lineRule="auto"/>
       </w:pPr>
       <w:r>
         <w:rPr>
@@ -3377,9 +3594,11 @@
     <w:p>
       <w:pPr>
         <w:keepNext/>
-        <w:spacing w:before="220" w:after="100" w:line="254" w:lineRule="auto"/>
+        <w:spacing w:before="180" w:after="90" w:line="245" w:lineRule="auto"/>
+        <w:ind w:left="158"/>
         <w:pBdr>
-          <w:bottom w:val="single" w:sz="8" w:space="3" w:color="1A6B5C"/>
+          <w:left w:val="single" w:sz="22" w:space="6" w:color="1A6B5C"/>
+          <w:bottom w:val="single" w:sz="4" w:space="4" w:color="CFD8E3"/>
         </w:pBdr>
       </w:pPr>
       <w:r>
@@ -3390,14 +3609,14 @@
           <w:color w:val="0F2C4C"/>
           <w:sz w:val="21"/>
           <w:rFonts w:ascii="Calibri" w:hAnsi="Calibri" w:cs="Calibri"/>
-          <w:spacing w:val="24"/>
+          <w:spacing w:val="26"/>
         </w:rPr>
-        <w:t>PROFESSIONAL TRAINING AND CERTIFICATION</w:t>
+        <w:t>TRAINING AND CERTIFICATION</w:t>
       </w:r>
     </w:p>
     <w:p>
       <w:pPr>
-        <w:spacing w:before="0" w:after="60" w:line="254" w:lineRule="auto"/>
+        <w:spacing w:before="0" w:after="68" w:line="245" w:lineRule="auto"/>
         <w:ind w:left="288" w:hanging="230"/>
       </w:pPr>
       <w:r>
@@ -3420,7 +3639,7 @@
           <w:sz w:val="19"/>
           <w:rFonts w:ascii="Calibri" w:hAnsi="Calibri" w:cs="Calibri"/>
         </w:rPr>
-        <w:t>COHSASA accreditation standards — in-service preparation and compliance</w:t>
+        <w:t>COHSASA accreditation standards: in-service preparation and compliance</w:t>
       </w:r>
       <w:r>
         <w:rPr>
@@ -3431,12 +3650,12 @@
           <w:sz w:val="19"/>
           <w:rFonts w:ascii="Calibri" w:hAnsi="Calibri" w:cs="Calibri"/>
         </w:rPr>
-        <w:t xml:space="preserve">  —  International Hospital Kampala, 2020 – 2024</w:t>
+        <w:t>.  International Hospital Kampala, 2020 to 2024.</w:t>
       </w:r>
     </w:p>
     <w:p>
       <w:pPr>
-        <w:spacing w:before="0" w:after="60" w:line="254" w:lineRule="auto"/>
+        <w:spacing w:before="0" w:after="68" w:line="245" w:lineRule="auto"/>
         <w:ind w:left="288" w:hanging="230"/>
       </w:pPr>
       <w:r>
@@ -3470,15 +3689,17 @@
           <w:sz w:val="19"/>
           <w:rFonts w:ascii="Calibri" w:hAnsi="Calibri" w:cs="Calibri"/>
         </w:rPr>
-        <w:t xml:space="preserve">  —  Fire Technologies Limited (IHK), 2021</w:t>
+        <w:t>.  Fire Technologies Limited (IHK), 2021.</w:t>
       </w:r>
     </w:p>
     <w:p>
       <w:pPr>
         <w:keepNext/>
-        <w:spacing w:before="220" w:after="100" w:line="254" w:lineRule="auto"/>
+        <w:spacing w:before="180" w:after="90" w:line="245" w:lineRule="auto"/>
+        <w:ind w:left="158"/>
         <w:pBdr>
-          <w:bottom w:val="single" w:sz="8" w:space="3" w:color="1A6B5C"/>
+          <w:left w:val="single" w:sz="22" w:space="6" w:color="1A6B5C"/>
+          <w:bottom w:val="single" w:sz="4" w:space="4" w:color="CFD8E3"/>
         </w:pBdr>
       </w:pPr>
       <w:r>
@@ -3489,14 +3710,14 @@
           <w:color w:val="0F2C4C"/>
           <w:sz w:val="21"/>
           <w:rFonts w:ascii="Calibri" w:hAnsi="Calibri" w:cs="Calibri"/>
-          <w:spacing w:val="24"/>
+          <w:spacing w:val="26"/>
         </w:rPr>
         <w:t>INTERESTS</w:t>
       </w:r>
     </w:p>
     <w:p>
       <w:pPr>
-        <w:spacing w:before="0" w:after="40" w:line="254" w:lineRule="auto"/>
+        <w:spacing w:before="0" w:after="40" w:line="245" w:lineRule="auto"/>
         <w:jc w:val="both"/>
       </w:pPr>
       <w:r>
@@ -3508,15 +3729,17 @@
           <w:sz w:val="19"/>
           <w:rFonts w:ascii="Calibri" w:hAnsi="Calibri" w:cs="Calibri"/>
         </w:rPr>
-        <w:t>Music — plays the saxophone and other instruments.  ·  Film.  ·  Physical fitness and regular exercise.  ·  Travel and working in new environments, which the regional field work has made second nature.</w:t>
+        <w:t>Music, and playing the saxophone in particular.  ·  Film.  ·  Physical fitness and regular exercise.  ·  Travel and working in unfamiliar places, which the regional field work has made second nature.</w:t>
       </w:r>
     </w:p>
     <w:p>
       <w:pPr>
         <w:keepNext/>
-        <w:spacing w:before="220" w:after="100" w:line="254" w:lineRule="auto"/>
+        <w:spacing w:before="180" w:after="90" w:line="245" w:lineRule="auto"/>
+        <w:ind w:left="158"/>
         <w:pBdr>
-          <w:bottom w:val="single" w:sz="8" w:space="3" w:color="1A6B5C"/>
+          <w:left w:val="single" w:sz="22" w:space="6" w:color="1A6B5C"/>
+          <w:bottom w:val="single" w:sz="4" w:space="4" w:color="CFD8E3"/>
         </w:pBdr>
       </w:pPr>
       <w:r>
@@ -3527,7 +3750,7 @@
           <w:color w:val="0F2C4C"/>
           <w:sz w:val="21"/>
           <w:rFonts w:ascii="Calibri" w:hAnsi="Calibri" w:cs="Calibri"/>
-          <w:spacing w:val="24"/>
+          <w:spacing w:val="26"/>
         </w:rPr>
         <w:t>REFEREES</w:t>
       </w:r>
@@ -3546,20 +3769,32 @@
           <w:insideH w:val="none" w:sz="0"/>
           <w:insideV w:val="none" w:sz="0"/>
         </w:tblBorders>
+        <w:tblCellMar>
+          <w:top w:w="90" w:type="dxa"/>
+          <w:left w:w="110" w:type="dxa"/>
+          <w:bottom w:w="90" w:type="dxa"/>
+          <w:right w:w="110" w:type="dxa"/>
+        </w:tblCellMar>
       </w:tblPr>
       <w:tblGrid>
-        <w:gridCol w:w="3413"/>
-        <w:gridCol w:w="3413"/>
-        <w:gridCol w:w="3413"/>
+        <w:gridCol w:w="2048"/>
+        <w:gridCol w:w="2048"/>
+        <w:gridCol w:w="2048"/>
+        <w:gridCol w:w="2048"/>
+        <w:gridCol w:w="2048"/>
       </w:tblGrid>
       <w:tr>
         <w:tc>
           <w:tcPr>
-            <w:tcW w:type="dxa" w:w="3456"/>
+            <w:tcW w:type="dxa" w:w="3268"/>
+            <w:shd w:val="clear" w:color="auto" w:fill="F3F6F9"/>
+            <w:tcBorders>
+              <w:top w:val="single" w:sz="18" w:space="0" w:color="1A6B5C"/>
+            </w:tcBorders>
           </w:tcPr>
           <w:p>
             <w:pPr>
-              <w:spacing w:after="20" w:line="252" w:lineRule="auto"/>
+              <w:spacing w:after="30" w:line="252" w:lineRule="auto"/>
             </w:pPr>
             <w:r>
               <w:rPr>
@@ -3575,7 +3810,7 @@
           </w:p>
           <w:p>
             <w:pPr>
-              <w:spacing w:after="20" w:line="252" w:lineRule="auto"/>
+              <w:spacing w:after="30" w:line="252" w:lineRule="auto"/>
             </w:pPr>
             <w:r>
               <w:rPr>
@@ -3583,7 +3818,7 @@
                 <w:b w:val="0"/>
                 <w:i/>
                 <w:color w:val="5A6472"/>
-                <w:sz w:val="18"/>
+                <w:sz w:val="17"/>
                 <w:rFonts w:ascii="Calibri" w:hAnsi="Calibri" w:cs="Calibri"/>
               </w:rPr>
               <w:t>Biomedical Engineer, St. Francis Hospital Nsambya</w:t>
@@ -3599,7 +3834,7 @@
                 <w:b w:val="0"/>
                 <w:i w:val="0"/>
                 <w:color w:val="23272B"/>
-                <w:sz w:val="18"/>
+                <w:sz w:val="17"/>
                 <w:rFonts w:ascii="Calibri" w:hAnsi="Calibri" w:cs="Calibri"/>
               </w:rPr>
               <w:t>+256 753 818 754  ·  +256 777 132 489</w:t>
@@ -3608,11 +3843,21 @@
         </w:tc>
         <w:tc>
           <w:tcPr>
-            <w:tcW w:type="dxa" w:w="3456"/>
+            <w:tcW w:type="dxa" w:w="216"/>
+          </w:tcPr>
+          <w:p/>
+        </w:tc>
+        <w:tc>
+          <w:tcPr>
+            <w:tcW w:type="dxa" w:w="3268"/>
+            <w:shd w:val="clear" w:color="auto" w:fill="F3F6F9"/>
+            <w:tcBorders>
+              <w:top w:val="single" w:sz="18" w:space="0" w:color="1A6B5C"/>
+            </w:tcBorders>
           </w:tcPr>
           <w:p>
             <w:pPr>
-              <w:spacing w:after="20" w:line="252" w:lineRule="auto"/>
+              <w:spacing w:after="30" w:line="252" w:lineRule="auto"/>
             </w:pPr>
             <w:r>
               <w:rPr>
@@ -3628,7 +3873,7 @@
           </w:p>
           <w:p>
             <w:pPr>
-              <w:spacing w:after="20" w:line="252" w:lineRule="auto"/>
+              <w:spacing w:after="30" w:line="252" w:lineRule="auto"/>
             </w:pPr>
             <w:r>
               <w:rPr>
@@ -3636,7 +3881,7 @@
                 <w:b w:val="0"/>
                 <w:i/>
                 <w:color w:val="5A6472"/>
-                <w:sz w:val="18"/>
+                <w:sz w:val="17"/>
                 <w:rFonts w:ascii="Calibri" w:hAnsi="Calibri" w:cs="Calibri"/>
               </w:rPr>
               <w:t>Senior Radiologist and Administrator, Mengo Hospital</w:t>
@@ -3652,7 +3897,7 @@
                 <w:b w:val="0"/>
                 <w:i w:val="0"/>
                 <w:color w:val="23272B"/>
-                <w:sz w:val="18"/>
+                <w:sz w:val="17"/>
                 <w:rFonts w:ascii="Calibri" w:hAnsi="Calibri" w:cs="Calibri"/>
               </w:rPr>
               <w:t>+256 772 592 771  ·  +256 701 592 771</w:t>
@@ -3661,11 +3906,21 @@
         </w:tc>
         <w:tc>
           <w:tcPr>
-            <w:tcW w:type="dxa" w:w="3456"/>
+            <w:tcW w:type="dxa" w:w="216"/>
+          </w:tcPr>
+          <w:p/>
+        </w:tc>
+        <w:tc>
+          <w:tcPr>
+            <w:tcW w:type="dxa" w:w="3268"/>
+            <w:shd w:val="clear" w:color="auto" w:fill="F3F6F9"/>
+            <w:tcBorders>
+              <w:top w:val="single" w:sz="18" w:space="0" w:color="1A6B5C"/>
+            </w:tcBorders>
           </w:tcPr>
           <w:p>
             <w:pPr>
-              <w:spacing w:after="20" w:line="252" w:lineRule="auto"/>
+              <w:spacing w:after="30" w:line="252" w:lineRule="auto"/>
             </w:pPr>
             <w:r>
               <w:rPr>
@@ -3681,7 +3936,7 @@
           </w:p>
           <w:p>
             <w:pPr>
-              <w:spacing w:after="20" w:line="252" w:lineRule="auto"/>
+              <w:spacing w:after="30" w:line="252" w:lineRule="auto"/>
             </w:pPr>
             <w:r>
               <w:rPr>
@@ -3689,7 +3944,7 @@
                 <w:b w:val="0"/>
                 <w:i/>
                 <w:color w:val="5A6472"/>
-                <w:sz w:val="18"/>
+                <w:sz w:val="17"/>
                 <w:rFonts w:ascii="Calibri" w:hAnsi="Calibri" w:cs="Calibri"/>
               </w:rPr>
               <w:t>Director and Founder, FairBanks Medical Centre</w:t>
@@ -3705,7 +3960,7 @@
                 <w:b w:val="0"/>
                 <w:i w:val="0"/>
                 <w:color w:val="23272B"/>
-                <w:sz w:val="18"/>
+                <w:sz w:val="17"/>
                 <w:rFonts w:ascii="Calibri" w:hAnsi="Calibri" w:cs="Calibri"/>
               </w:rPr>
               <w:t>+256 772 849 258  ·  nracheal017@gmail.com</w:t>
@@ -3717,7 +3972,7 @@
     <w:sectPr>
       <w:footerReference w:type="default" r:id="rId9"/>
       <w:pgSz w:w="11909" w:h="16834"/>
-      <w:pgMar w:top="749" w:right="835" w:bottom="749" w:left="835" w:header="720" w:footer="720" w:gutter="0"/>
+      <w:pgMar w:top="720" w:right="835" w:bottom="720" w:left="835" w:header="720" w:footer="720" w:gutter="0"/>
       <w:cols w:space="720"/>
       <w:docGrid w:linePitch="360"/>
     </w:sectPr>
@@ -3730,7 +3985,6 @@
   <w:p>
     <w:pPr>
       <w:pStyle w:val="Footer"/>
-      <w:spacing w:before="40"/>
       <w:jc w:val="center"/>
     </w:pPr>
     <w:r>

</xml_diff>

<commit_message>
Add outreach package for introduction to Mr. Robert Muwanga
This commit introduces a new outreach package for Wasswa Wilson, including a cover letter, email introduction, and supporting documents. The cover letter outlines Wasswa's professional background and current projects, emphasizing his expertise in biomedical engineering and software development. Additionally, the email template is provided for direct communication with Mr. Muwanga, ensuring a professional presentation of Wasswa's credentials and achievements. The package is designed to facilitate networking opportunities and potential collaborations.
</commit_message>
<xml_diff>
--- a/wilson/cv-2026/Wasswa_Wilson_CV_2026.docx
+++ b/wilson/cv-2026/Wasswa_Wilson_CV_2026.docx
@@ -110,7 +110,7 @@
     <w:p>
       <w:pPr>
         <w:keepNext/>
-        <w:spacing w:before="180" w:after="90" w:line="245" w:lineRule="auto"/>
+        <w:spacing w:before="160" w:after="80" w:line="245" w:lineRule="auto"/>
         <w:ind w:left="158"/>
         <w:pBdr>
           <w:left w:val="single" w:sz="22" w:space="6" w:color="1A6B5C"/>
@@ -144,13 +144,13 @@
           <w:sz w:val="19"/>
           <w:rFonts w:ascii="Calibri" w:hAnsi="Calibri" w:cs="Calibri"/>
         </w:rPr>
-        <w:t>I am a biomedical engineer and full-stack software developer based in Kampala, with over nine years of work across hospital technology, health information systems and software engineering. I lead development of the FairBanks Community Health Intelligence Platform (FCHIP), where I handle the data capture tools, the database, the cloud data flows and the management dashboards. Alongside it I am building a cross-sector application that collects field data and generates finished reports in real time, for accounting, research, biology, agriculture, social media and other record-heavy work. Before FairBanks I managed the Gould Family Foundation biomedical programme across East and Central Africa, and ran the biomedical function at International Hospital Kampala through the COVID-19 response and through successful COHSASA accreditation. I write Java, Python, JavaScript and TypeScript, work across React, Next.js, React Native, Node.js and Express, and design AI agents and automations that are running in production today.</w:t>
+        <w:t>I am a biomedical engineer and full-stack software developer based in Kampala, with over nine years of work across hospital technology, health information systems and software engineering. I lead development of the FairBanks Community Health Intelligence Platform (FCHIP), where I handle the data capture tools, the database, the cloud data flows and the management dashboards. Alongside it I am building a cross-sector application that collects field data and generates finished reports in real time, for accounting, research, biology, agriculture, social media and other record-heavy work. Before FairBanks I managed the Gould Family Foundation biomedical programme across East and Central Africa, and I ran the biomedical function at International Hospital Kampala through the COVID-19 response and through successful COHSASA accreditation. I write Java, Python, JavaScript and TypeScript, I work across React, Next.js, React Native, Node.js and Express, and I design AI agents and automations that are running in production today.</w:t>
       </w:r>
     </w:p>
     <w:p>
       <w:pPr>
         <w:keepNext/>
-        <w:spacing w:before="180" w:after="90" w:line="245" w:lineRule="auto"/>
+        <w:spacing w:before="160" w:after="80" w:line="245" w:lineRule="auto"/>
         <w:ind w:left="158"/>
         <w:pBdr>
           <w:left w:val="single" w:sz="22" w:space="6" w:color="1A6B5C"/>
@@ -229,7 +229,7 @@
                 <w:sz w:val="19"/>
                 <w:rFonts w:ascii="Calibri" w:hAnsi="Calibri" w:cs="Calibri"/>
               </w:rPr>
-              <w:t>Lead developer of FCHIP, the FairBanks Community Health Intelligence Platform: community screening, referral and follow-up data capture, database, cloud sync and reporting dashboards, delivered across web and mobile.</w:t>
+              <w:t>I lead development of FCHIP, the FairBanks Community Health Intelligence Platform. I built the community screening, referral and follow-up data capture, the database, the cloud sync and the reporting dashboards, and I deliver the platform across web and mobile.</w:t>
             </w:r>
           </w:p>
           <w:p>
@@ -258,7 +258,7 @@
                 <w:sz w:val="19"/>
                 <w:rFonts w:ascii="Calibri" w:hAnsi="Calibri" w:cs="Calibri"/>
               </w:rPr>
-              <w:t>Building a cross-sector data collection and reporting application that writes the report as the user works, instead of leaving it to be compiled afterwards. Aimed at accounting, research, biology, agriculture, social media and similar fields.</w:t>
+              <w:t>I am building a cross-sector data collection and reporting application that writes the report as the user works, instead of leaving it to be compiled afterwards. I designed it for accounting, research, biology, agriculture, social media and similar fields.</w:t>
             </w:r>
           </w:p>
           <w:p>
@@ -287,7 +287,7 @@
                 <w:sz w:val="19"/>
                 <w:rFonts w:ascii="Calibri" w:hAnsi="Calibri" w:cs="Calibri"/>
               </w:rPr>
-              <w:t>Developed the oxygen consumption formulas used to calculate patient demand during the COVID-19 response at International Hospital Kampala, and in support of Ministry of Health oxygen planning. The same method fed into capacity planning for later facility projects.</w:t>
+              <w:t>I developed the oxygen consumption formulas used to calculate patient demand during the COVID-19 response at International Hospital Kampala, and I supported Ministry of Health oxygen planning. My method went on to inform capacity planning for later facility projects.</w:t>
             </w:r>
           </w:p>
           <w:p>
@@ -316,7 +316,7 @@
                 <w:sz w:val="19"/>
                 <w:rFonts w:ascii="Calibri" w:hAnsi="Calibri" w:cs="Calibri"/>
               </w:rPr>
-              <w:t>Designed, built and deployed an AI reception agent for a law firm in Texas, USA. It handles live inbound client calls, books and reschedules appointments, and runs client follow-up. In active production use.</w:t>
+              <w:t>I designed, built and deployed an AI reception agent for a law firm in Texas, USA. It handles live inbound client calls, books and reschedules appointments, and runs client follow-up. It is in active production use.</w:t>
             </w:r>
           </w:p>
           <w:p>
@@ -345,7 +345,7 @@
                 <w:sz w:val="19"/>
                 <w:rFonts w:ascii="Calibri" w:hAnsi="Calibri" w:cs="Calibri"/>
               </w:rPr>
-              <w:t>Delivered hospital technology projects in five countries: Uganda, the Democratic Republic of Congo, Kenya, Tanzania and Somaliland. This included laboratory, theatre and radiology installations at the hospital serving the Kibali Gold Mine, DR Congo.</w:t>
+              <w:t>I have delivered hospital technology projects in five countries: Uganda, the Democratic Republic of Congo, Kenya, Tanzania and Somaliland. I completed the laboratory, theatre and radiology installations at the hospital serving the Kibali Gold Mine, DR Congo.</w:t>
             </w:r>
           </w:p>
           <w:p>
@@ -374,7 +374,7 @@
                 <w:sz w:val="19"/>
                 <w:rFonts w:ascii="Calibri" w:hAnsi="Calibri" w:cs="Calibri"/>
               </w:rPr>
-              <w:t>Prepared and maintained the biomedical compliance evidence that carried International Hospital Kampala through successful COHSASA accreditation, and cut equipment downtime with a documented preventive maintenance programme.</w:t>
+              <w:t>I prepared and maintained the biomedical compliance evidence that carried International Hospital Kampala through successful COHSASA accreditation, and I cut equipment downtime with a preventive maintenance programme that I designed, documented and ran.</w:t>
             </w:r>
           </w:p>
           <w:p>
@@ -403,7 +403,7 @@
                 <w:sz w:val="19"/>
                 <w:rFonts w:ascii="Calibri" w:hAnsi="Calibri" w:cs="Calibri"/>
               </w:rPr>
-              <w:t>Upgraded partner health facilities across East and Central Africa for the Gould Family Foundation, including the neonatal intensive care unit at Mama Lucy Kibaki Hospital, Nairobi.</w:t>
+              <w:t>I upgraded partner health facilities across East and Central Africa for the Gould Family Foundation, including the neonatal intensive care unit at Mama Lucy Kibaki Hospital, Nairobi.</w:t>
             </w:r>
           </w:p>
         </w:tc>
@@ -412,7 +412,7 @@
     <w:p>
       <w:pPr>
         <w:keepNext/>
-        <w:spacing w:before="180" w:after="90" w:line="245" w:lineRule="auto"/>
+        <w:spacing w:before="160" w:after="80" w:line="245" w:lineRule="auto"/>
         <w:ind w:left="158"/>
         <w:pBdr>
           <w:left w:val="single" w:sz="22" w:space="6" w:color="1A6B5C"/>
@@ -447,9 +447,9 @@
           <w:insideV w:val="none" w:sz="0"/>
         </w:tblBorders>
         <w:tblCellMar>
-          <w:top w:w="42" w:type="dxa"/>
+          <w:top w:w="36" w:type="dxa"/>
           <w:left w:w="85" w:type="dxa"/>
-          <w:bottom w:w="42" w:type="dxa"/>
+          <w:bottom w:w="36" w:type="dxa"/>
           <w:right w:w="85" w:type="dxa"/>
         </w:tblCellMar>
       </w:tblPr>
@@ -768,7 +768,7 @@
                 <w:sz w:val="19"/>
                 <w:rFonts w:ascii="Calibri" w:hAnsi="Calibri" w:cs="Calibri"/>
               </w:rPr>
-              <w:t>Windows  ·  Linux  ·  Android.  Administration, deployment and troubleshooting on all three.</w:t>
+              <w:t>Windows  ·  Linux  ·  Android.  I administer, deploy and troubleshoot on all three.</w:t>
             </w:r>
           </w:p>
         </w:tc>
@@ -867,7 +867,7 @@
     <w:p>
       <w:pPr>
         <w:keepNext/>
-        <w:spacing w:before="180" w:after="90" w:line="245" w:lineRule="auto"/>
+        <w:spacing w:before="160" w:after="80" w:line="245" w:lineRule="auto"/>
         <w:ind w:left="158"/>
         <w:pBdr>
           <w:left w:val="single" w:sz="22" w:space="6" w:color="1A6B5C"/>
@@ -938,7 +938,7 @@
     </w:p>
     <w:p>
       <w:pPr>
-        <w:spacing w:before="0" w:after="44" w:line="245" w:lineRule="auto"/>
+        <w:spacing w:before="0" w:after="38" w:line="245" w:lineRule="auto"/>
         <w:ind w:left="288" w:hanging="230"/>
         <w:jc w:val="both"/>
       </w:pPr>
@@ -962,12 +962,12 @@
           <w:sz w:val="19"/>
           <w:rFonts w:ascii="Calibri" w:hAnsi="Calibri" w:cs="Calibri"/>
         </w:rPr>
-        <w:t>Lead the design and build of the FairBanks Community Health Intelligence Platform (FCHIP): data capture form design, database structure, cloud data flows, reporting dashboards, and delivery across both web and mobile.</w:t>
+        <w:t>I lead the design and build of the FairBanks Community Health Intelligence Platform (FCHIP). I do the data capture form design, the database structure, the cloud data flows, the reporting dashboards and the delivery across both web and mobile.</w:t>
       </w:r>
     </w:p>
     <w:p>
       <w:pPr>
-        <w:spacing w:before="0" w:after="44" w:line="245" w:lineRule="auto"/>
+        <w:spacing w:before="0" w:after="38" w:line="245" w:lineRule="auto"/>
         <w:ind w:left="288" w:hanging="230"/>
         <w:jc w:val="both"/>
       </w:pPr>
@@ -991,12 +991,12 @@
           <w:sz w:val="19"/>
           <w:rFonts w:ascii="Calibri" w:hAnsi="Calibri" w:cs="Calibri"/>
         </w:rPr>
-        <w:t>Building a cross-sector data collection and reporting application that turns work already being done into finished reports in real time, for accounting, research and laboratory science, biology, agriculture, social media and similar record-heavy fields.</w:t>
+        <w:t>I am building a cross-sector data collection and reporting application that turns work already being done into finished reports in real time, for accounting, research and laboratory science, biology, agriculture, social media and similar record-heavy fields.</w:t>
       </w:r>
     </w:p>
     <w:p>
       <w:pPr>
-        <w:spacing w:before="0" w:after="44" w:line="245" w:lineRule="auto"/>
+        <w:spacing w:before="0" w:after="38" w:line="245" w:lineRule="auto"/>
         <w:ind w:left="288" w:hanging="230"/>
         <w:jc w:val="both"/>
       </w:pPr>
@@ -1020,12 +1020,12 @@
           <w:sz w:val="19"/>
           <w:rFonts w:ascii="Calibri" w:hAnsi="Calibri" w:cs="Calibri"/>
         </w:rPr>
-        <w:t>Architect and maintain the hospital and clinic software used daily by clinical and administrative staff, covering patient records, scheduling, referral tracking and management reporting.</w:t>
+        <w:t>I architect and maintain the hospital and clinic software that clinical and administrative staff use daily, covering patient records, scheduling, referral tracking and management reporting.</w:t>
       </w:r>
     </w:p>
     <w:p>
       <w:pPr>
-        <w:spacing w:before="0" w:after="44" w:line="245" w:lineRule="auto"/>
+        <w:spacing w:before="0" w:after="38" w:line="245" w:lineRule="auto"/>
         <w:ind w:left="288" w:hanging="230"/>
         <w:jc w:val="both"/>
       </w:pPr>
@@ -1049,12 +1049,12 @@
           <w:sz w:val="19"/>
           <w:rFonts w:ascii="Calibri" w:hAnsi="Calibri" w:cs="Calibri"/>
         </w:rPr>
-        <w:t>Design and deploy AI agents and automation pipelines that remove manual handling from reception, appointment management, client follow-up and routine reporting.</w:t>
+        <w:t>I design and deploy the AI agents and automation pipelines that remove manual handling from reception, appointment management, client follow-up and routine reporting.</w:t>
       </w:r>
     </w:p>
     <w:p>
       <w:pPr>
-        <w:spacing w:before="0" w:after="44" w:line="245" w:lineRule="auto"/>
+        <w:spacing w:before="0" w:after="38" w:line="245" w:lineRule="auto"/>
         <w:ind w:left="288" w:hanging="230"/>
         <w:jc w:val="both"/>
       </w:pPr>
@@ -1078,12 +1078,12 @@
           <w:sz w:val="19"/>
           <w:rFonts w:ascii="Calibri" w:hAnsi="Calibri" w:cs="Calibri"/>
         </w:rPr>
-        <w:t>Own technical documentation, data-protection practice, access control and release management across the platform.</w:t>
+        <w:t>I own the technical documentation, the data-protection practice, the access control and the release management across the platform.</w:t>
       </w:r>
     </w:p>
     <w:p>
       <w:pPr>
-        <w:spacing w:before="0" w:after="44" w:line="245" w:lineRule="auto"/>
+        <w:spacing w:before="0" w:after="38" w:line="245" w:lineRule="auto"/>
         <w:ind w:left="288" w:hanging="230"/>
         <w:jc w:val="both"/>
       </w:pPr>
@@ -1107,7 +1107,7 @@
           <w:sz w:val="19"/>
           <w:rFonts w:ascii="Calibri" w:hAnsi="Calibri" w:cs="Calibri"/>
         </w:rPr>
-        <w:t>Write and edit institutional proposals, grant applications, partnership documents and investment materials. Chaired the FairBanks meeting with the Uganda Health Partners Cooperative on cooperative health insurance in July 2026.</w:t>
+        <w:t>I write and edit the institutional proposals, grant applications, partnership documents and investment materials, and I chaired the FairBanks meeting with the Uganda Health Partners Cooperative on cooperative health insurance in July 2026.</w:t>
       </w:r>
     </w:p>
     <w:p>
@@ -1161,7 +1161,7 @@
     </w:p>
     <w:p>
       <w:pPr>
-        <w:spacing w:before="0" w:after="44" w:line="245" w:lineRule="auto"/>
+        <w:spacing w:before="0" w:after="38" w:line="245" w:lineRule="auto"/>
         <w:ind w:left="288" w:hanging="230"/>
         <w:jc w:val="both"/>
       </w:pPr>
@@ -1185,12 +1185,12 @@
           <w:sz w:val="19"/>
           <w:rFonts w:ascii="Calibri" w:hAnsi="Calibri" w:cs="Calibri"/>
         </w:rPr>
-        <w:t>Install, commission, calibrate and maintain hospital medical equipment under contract across five countries, working independently on site and to a fixed handover standard.</w:t>
+        <w:t>I install, commission, calibrate and maintain hospital medical equipment under contract across five countries, working independently on site and to a fixed handover standard.</w:t>
       </w:r>
     </w:p>
     <w:p>
       <w:pPr>
-        <w:spacing w:before="0" w:after="44" w:line="245" w:lineRule="auto"/>
+        <w:spacing w:before="0" w:after="38" w:line="245" w:lineRule="auto"/>
         <w:ind w:left="288" w:hanging="230"/>
         <w:jc w:val="both"/>
       </w:pPr>
@@ -1214,12 +1214,12 @@
           <w:sz w:val="19"/>
           <w:rFonts w:ascii="Calibri" w:hAnsi="Calibri" w:cs="Calibri"/>
         </w:rPr>
-        <w:t>Completed laboratory, theatre and radiology installations at several hospitals in the Democratic Republic of Congo, including the facility serving the Kibali Gold Mine.</w:t>
+        <w:t>I completed the laboratory, theatre and radiology installations at several hospitals in the Democratic Republic of Congo, including the facility serving the Kibali Gold Mine.</w:t>
       </w:r>
     </w:p>
     <w:p>
       <w:pPr>
-        <w:spacing w:before="0" w:after="44" w:line="245" w:lineRule="auto"/>
+        <w:spacing w:before="0" w:after="38" w:line="245" w:lineRule="auto"/>
         <w:ind w:left="288" w:hanging="230"/>
         <w:jc w:val="both"/>
       </w:pPr>
@@ -1243,12 +1243,12 @@
           <w:sz w:val="19"/>
           <w:rFonts w:ascii="Calibri" w:hAnsi="Calibri" w:cs="Calibri"/>
         </w:rPr>
-        <w:t>Train clinical users at handover and produce a written service report and maintenance record for every assignment, so the client keeps a verifiable equipment history.</w:t>
+        <w:t>I train the clinical users at handover, and I produce a written service report and maintenance record for every assignment, so the client keeps a verifiable equipment history.</w:t>
       </w:r>
     </w:p>
     <w:p>
       <w:pPr>
-        <w:spacing w:before="0" w:after="44" w:line="245" w:lineRule="auto"/>
+        <w:spacing w:before="0" w:after="38" w:line="245" w:lineRule="auto"/>
         <w:ind w:left="288" w:hanging="230"/>
         <w:jc w:val="both"/>
       </w:pPr>
@@ -1272,7 +1272,7 @@
           <w:sz w:val="19"/>
           <w:rFonts w:ascii="Calibri" w:hAnsi="Calibri" w:cs="Calibri"/>
         </w:rPr>
-        <w:t>Handle preventive and corrective maintenance, on-site fault diagnosis and specification advice for procurement.</w:t>
+        <w:t>I handle the preventive and corrective maintenance, the on-site fault diagnosis and the specification advice for procurement.</w:t>
       </w:r>
     </w:p>
     <w:p>
@@ -1326,7 +1326,7 @@
     </w:p>
     <w:p>
       <w:pPr>
-        <w:spacing w:before="0" w:after="44" w:line="245" w:lineRule="auto"/>
+        <w:spacing w:before="0" w:after="38" w:line="245" w:lineRule="auto"/>
         <w:ind w:left="288" w:hanging="230"/>
         <w:jc w:val="both"/>
       </w:pPr>
@@ -1350,12 +1350,12 @@
           <w:sz w:val="19"/>
           <w:rFonts w:ascii="Calibri" w:hAnsi="Calibri" w:cs="Calibri"/>
         </w:rPr>
-        <w:t>Managed the regional biomedical team, covering programme planning, implementation and reporting across partner health facilities in multiple countries.</w:t>
+        <w:t>I managed the regional biomedical team, covering programme planning, implementation and reporting across partner health facilities in multiple countries.</w:t>
       </w:r>
     </w:p>
     <w:p>
       <w:pPr>
-        <w:spacing w:before="0" w:after="44" w:line="245" w:lineRule="auto"/>
+        <w:spacing w:before="0" w:after="38" w:line="245" w:lineRule="auto"/>
         <w:ind w:left="288" w:hanging="230"/>
         <w:jc w:val="both"/>
       </w:pPr>
@@ -1379,12 +1379,12 @@
           <w:sz w:val="19"/>
           <w:rFonts w:ascii="Calibri" w:hAnsi="Calibri" w:cs="Calibri"/>
         </w:rPr>
-        <w:t>Oversaw procurement, installation and commissioning of medical technologies, with programme documentation kept in line with healthcare technology standards.</w:t>
+        <w:t>I oversaw the procurement, installation and commissioning of medical technologies, and I kept the programme documentation in line with healthcare technology standards.</w:t>
       </w:r>
     </w:p>
     <w:p>
       <w:pPr>
-        <w:spacing w:before="0" w:after="44" w:line="245" w:lineRule="auto"/>
+        <w:spacing w:before="0" w:after="38" w:line="245" w:lineRule="auto"/>
         <w:ind w:left="288" w:hanging="230"/>
         <w:jc w:val="both"/>
       </w:pPr>
@@ -1408,12 +1408,12 @@
           <w:sz w:val="19"/>
           <w:rFonts w:ascii="Calibri" w:hAnsi="Calibri" w:cs="Calibri"/>
         </w:rPr>
-        <w:t>Developed equipment lifecycle-management and master-planning strategies that were applied across partner facilities.</w:t>
+        <w:t>I developed the equipment lifecycle-management and master-planning strategies that were then applied across partner facilities.</w:t>
       </w:r>
     </w:p>
     <w:p>
       <w:pPr>
-        <w:spacing w:before="0" w:after="44" w:line="245" w:lineRule="auto"/>
+        <w:spacing w:before="0" w:after="38" w:line="245" w:lineRule="auto"/>
         <w:ind w:left="288" w:hanging="230"/>
         <w:jc w:val="both"/>
       </w:pPr>
@@ -1437,12 +1437,12 @@
           <w:sz w:val="19"/>
           <w:rFonts w:ascii="Calibri" w:hAnsi="Calibri" w:cs="Calibri"/>
         </w:rPr>
-        <w:t>Upgraded several facilities, including the neonatal intensive care unit at Mama Lucy Kibaki Hospital, Nairobi, where oxygen and equipment demand modelling informed the capacity plan.</w:t>
+        <w:t>I upgraded several facilities, including the neonatal intensive care unit at Mama Lucy Kibaki Hospital, Nairobi, where my oxygen and equipment demand modelling informed the capacity plan.</w:t>
       </w:r>
     </w:p>
     <w:p>
       <w:pPr>
-        <w:spacing w:before="0" w:after="44" w:line="245" w:lineRule="auto"/>
+        <w:spacing w:before="0" w:after="38" w:line="245" w:lineRule="auto"/>
         <w:ind w:left="288" w:hanging="230"/>
         <w:jc w:val="both"/>
       </w:pPr>
@@ -1466,7 +1466,7 @@
           <w:sz w:val="19"/>
           <w:rFonts w:ascii="Calibri" w:hAnsi="Calibri" w:cs="Calibri"/>
         </w:rPr>
-        <w:t>Led biomedical and clinical user training programmes for engineers, technicians and clinical staff.</w:t>
+        <w:t>I led the biomedical and clinical user training programmes for engineers, technicians and clinical staff.</w:t>
       </w:r>
     </w:p>
     <w:p>
@@ -1520,7 +1520,7 @@
     </w:p>
     <w:p>
       <w:pPr>
-        <w:spacing w:before="0" w:after="44" w:line="245" w:lineRule="auto"/>
+        <w:spacing w:before="0" w:after="38" w:line="245" w:lineRule="auto"/>
         <w:ind w:left="288" w:hanging="230"/>
         <w:jc w:val="both"/>
       </w:pPr>
@@ -1544,12 +1544,12 @@
           <w:sz w:val="19"/>
           <w:rFonts w:ascii="Calibri" w:hAnsi="Calibri" w:cs="Calibri"/>
         </w:rPr>
-        <w:t>Managed the biomedical engineering function of a major private hospital for four years, including team supervision, workplans and reporting to executive management.</w:t>
+        <w:t>I managed the biomedical engineering function of a major private hospital for four years, including team supervision, workplans and reporting to executive management.</w:t>
       </w:r>
     </w:p>
     <w:p>
       <w:pPr>
-        <w:spacing w:before="0" w:after="44" w:line="245" w:lineRule="auto"/>
+        <w:spacing w:before="0" w:after="38" w:line="245" w:lineRule="auto"/>
         <w:ind w:left="288" w:hanging="230"/>
         <w:jc w:val="both"/>
       </w:pPr>
@@ -1573,12 +1573,12 @@
           <w:sz w:val="19"/>
           <w:rFonts w:ascii="Calibri" w:hAnsi="Calibri" w:cs="Calibri"/>
         </w:rPr>
-        <w:t>Led oxygen therapy management through the COVID-19 response and supported Ministry of Health oxygen planning. Developed the formulas used to calculate patient oxygen consumption, which gave managers a dependable basis for sizing plant capacity, cylinder stock and flow requirements rather than estimating them.</w:t>
+        <w:t>I led oxygen therapy management through the COVID-19 response and I supported Ministry of Health oxygen planning. I developed the formulas used to calculate patient oxygen consumption, which gave managers a dependable basis for sizing plant capacity, cylinder stock and flow requirements rather than estimating them.</w:t>
       </w:r>
     </w:p>
     <w:p>
       <w:pPr>
-        <w:spacing w:before="0" w:after="44" w:line="245" w:lineRule="auto"/>
+        <w:spacing w:before="0" w:after="38" w:line="245" w:lineRule="auto"/>
         <w:ind w:left="288" w:hanging="230"/>
         <w:jc w:val="both"/>
       </w:pPr>
@@ -1602,12 +1602,12 @@
           <w:sz w:val="19"/>
           <w:rFonts w:ascii="Calibri" w:hAnsi="Calibri" w:cs="Calibri"/>
         </w:rPr>
-        <w:t>Led installation and commissioning of CT and X-ray imaging, oxygen plant, laboratory, theatre and ICU systems, through to handover and trained clinical users.</w:t>
+        <w:t>I led the installation and commissioning of CT and X-ray imaging, oxygen plant, laboratory, theatre and ICU systems through to handover, and I trained the clinical users.</w:t>
       </w:r>
     </w:p>
     <w:p>
       <w:pPr>
-        <w:spacing w:before="0" w:after="44" w:line="245" w:lineRule="auto"/>
+        <w:spacing w:before="0" w:after="38" w:line="245" w:lineRule="auto"/>
         <w:ind w:left="288" w:hanging="230"/>
         <w:jc w:val="both"/>
       </w:pPr>
@@ -1631,12 +1631,12 @@
           <w:sz w:val="19"/>
           <w:rFonts w:ascii="Calibri" w:hAnsi="Calibri" w:cs="Calibri"/>
         </w:rPr>
-        <w:t>Built the preventive maintenance schedules and service-record systems that reduced equipment downtime and kept devices safe for clinical use.</w:t>
+        <w:t>I built the preventive maintenance schedules and service-record systems that reduced equipment downtime and kept devices safe for clinical use.</w:t>
       </w:r>
     </w:p>
     <w:p>
       <w:pPr>
-        <w:spacing w:before="0" w:after="44" w:line="245" w:lineRule="auto"/>
+        <w:spacing w:before="0" w:after="38" w:line="245" w:lineRule="auto"/>
         <w:ind w:left="288" w:hanging="230"/>
         <w:jc w:val="both"/>
       </w:pPr>
@@ -1660,12 +1660,12 @@
           <w:sz w:val="19"/>
           <w:rFonts w:ascii="Calibri" w:hAnsi="Calibri" w:cs="Calibri"/>
         </w:rPr>
-        <w:t>Coordinated procurement, technical specification, commissioning documentation and lifecycle management of hospital medical equipment.</w:t>
+        <w:t>I coordinated the procurement, technical specification, commissioning documentation and lifecycle management of hospital medical equipment.</w:t>
       </w:r>
     </w:p>
     <w:p>
       <w:pPr>
-        <w:spacing w:before="0" w:after="44" w:line="245" w:lineRule="auto"/>
+        <w:spacing w:before="0" w:after="38" w:line="245" w:lineRule="auto"/>
         <w:ind w:left="288" w:hanging="230"/>
         <w:jc w:val="both"/>
       </w:pPr>
@@ -1689,7 +1689,7 @@
           <w:sz w:val="19"/>
           <w:rFonts w:ascii="Calibri" w:hAnsi="Calibri" w:cs="Calibri"/>
         </w:rPr>
-        <w:t>Prepared and maintained the compliance evidence files reviewed for COHSASA accreditation, supporting the hospital through successful accreditation.</w:t>
+        <w:t>I prepared and maintained the compliance evidence files reviewed for COHSASA accreditation, and I supported the hospital through successful accreditation.</w:t>
       </w:r>
     </w:p>
     <w:p>
@@ -1743,7 +1743,7 @@
     </w:p>
     <w:p>
       <w:pPr>
-        <w:spacing w:before="0" w:after="44" w:line="245" w:lineRule="auto"/>
+        <w:spacing w:before="0" w:after="38" w:line="245" w:lineRule="auto"/>
         <w:ind w:left="288" w:hanging="230"/>
         <w:jc w:val="both"/>
       </w:pPr>
@@ -1767,12 +1767,12 @@
           <w:sz w:val="19"/>
           <w:rFonts w:ascii="Calibri" w:hAnsi="Calibri" w:cs="Calibri"/>
         </w:rPr>
-        <w:t>Maintained and serviced hospital diagnostic and patient-monitoring equipment.</w:t>
+        <w:t>I maintained and serviced the hospital diagnostic and patient-monitoring equipment.</w:t>
       </w:r>
     </w:p>
     <w:p>
       <w:pPr>
-        <w:spacing w:before="0" w:after="44" w:line="245" w:lineRule="auto"/>
+        <w:spacing w:before="0" w:after="38" w:line="245" w:lineRule="auto"/>
         <w:ind w:left="288" w:hanging="230"/>
         <w:jc w:val="both"/>
       </w:pPr>
@@ -1796,12 +1796,12 @@
           <w:sz w:val="19"/>
           <w:rFonts w:ascii="Calibri" w:hAnsi="Calibri" w:cs="Calibri"/>
         </w:rPr>
-        <w:t>Supported installation and calibration of medical imaging and ICU equipment.</w:t>
+        <w:t>I supported the installation and calibration of medical imaging and ICU equipment.</w:t>
       </w:r>
     </w:p>
     <w:p>
       <w:pPr>
-        <w:spacing w:before="0" w:after="44" w:line="245" w:lineRule="auto"/>
+        <w:spacing w:before="0" w:after="38" w:line="245" w:lineRule="auto"/>
         <w:ind w:left="288" w:hanging="230"/>
         <w:jc w:val="both"/>
       </w:pPr>
@@ -1825,7 +1825,7 @@
           <w:sz w:val="19"/>
           <w:rFonts w:ascii="Calibri" w:hAnsi="Calibri" w:cs="Calibri"/>
         </w:rPr>
-        <w:t>Helped establish preventive maintenance schedules and service follow-up records.</w:t>
+        <w:t>I helped establish the preventive maintenance schedules and service follow-up records.</w:t>
       </w:r>
     </w:p>
     <w:p>
@@ -1879,7 +1879,7 @@
     </w:p>
     <w:p>
       <w:pPr>
-        <w:spacing w:before="0" w:after="44" w:line="245" w:lineRule="auto"/>
+        <w:spacing w:before="0" w:after="38" w:line="245" w:lineRule="auto"/>
         <w:ind w:left="288" w:hanging="230"/>
         <w:jc w:val="both"/>
       </w:pPr>
@@ -1903,12 +1903,12 @@
           <w:sz w:val="19"/>
           <w:rFonts w:ascii="Calibri" w:hAnsi="Calibri" w:cs="Calibri"/>
         </w:rPr>
-        <w:t>Contributed to biomedical research projects and laboratory experimentation.</w:t>
+        <w:t>I contributed to biomedical research projects and laboratory experimentation.</w:t>
       </w:r>
     </w:p>
     <w:p>
       <w:pPr>
-        <w:spacing w:before="0" w:after="44" w:line="245" w:lineRule="auto"/>
+        <w:spacing w:before="0" w:after="38" w:line="245" w:lineRule="auto"/>
         <w:ind w:left="288" w:hanging="230"/>
         <w:jc w:val="both"/>
       </w:pPr>
@@ -1932,7 +1932,7 @@
           <w:sz w:val="19"/>
           <w:rFonts w:ascii="Calibri" w:hAnsi="Calibri" w:cs="Calibri"/>
         </w:rPr>
-        <w:t>Carried out laboratory data analysis, mathematical modelling and research pipeline design in Python.</w:t>
+        <w:t>I carried out laboratory data analysis, mathematical modelling and research pipeline design in Python.</w:t>
       </w:r>
     </w:p>
     <w:p>
@@ -1986,7 +1986,7 @@
     </w:p>
     <w:p>
       <w:pPr>
-        <w:spacing w:before="0" w:after="44" w:line="245" w:lineRule="auto"/>
+        <w:spacing w:before="0" w:after="38" w:line="245" w:lineRule="auto"/>
         <w:ind w:left="288" w:hanging="230"/>
         <w:jc w:val="both"/>
       </w:pPr>
@@ -2010,12 +2010,12 @@
           <w:sz w:val="19"/>
           <w:rFonts w:ascii="Calibri" w:hAnsi="Calibri" w:cs="Calibri"/>
         </w:rPr>
-        <w:t>Assisted in teaching biomedical engineering course units at undergraduate level.</w:t>
+        <w:t>I assisted in teaching biomedical engineering course units at undergraduate level.</w:t>
       </w:r>
     </w:p>
     <w:p>
       <w:pPr>
-        <w:spacing w:before="0" w:after="44" w:line="245" w:lineRule="auto"/>
+        <w:spacing w:before="0" w:after="38" w:line="245" w:lineRule="auto"/>
         <w:ind w:left="288" w:hanging="230"/>
         <w:jc w:val="both"/>
       </w:pPr>
@@ -2039,13 +2039,13 @@
           <w:sz w:val="19"/>
           <w:rFonts w:ascii="Calibri" w:hAnsi="Calibri" w:cs="Calibri"/>
         </w:rPr>
-        <w:t>Supervised and supported laboratory practical sessions for engineering students.</w:t>
+        <w:t>I supervised and supported the laboratory practical sessions for engineering students.</w:t>
       </w:r>
     </w:p>
     <w:p>
       <w:pPr>
         <w:keepNext/>
-        <w:spacing w:before="180" w:after="90" w:line="245" w:lineRule="auto"/>
+        <w:spacing w:before="160" w:after="80" w:line="245" w:lineRule="auto"/>
         <w:ind w:left="158"/>
         <w:pBdr>
           <w:left w:val="single" w:sz="22" w:space="6" w:color="1A6B5C"/>
@@ -2128,7 +2128,7 @@
           <w:sz w:val="19"/>
           <w:rFonts w:ascii="Calibri" w:hAnsi="Calibri" w:cs="Calibri"/>
         </w:rPr>
-        <w:t>Community, screening, referral and follow-up data capture; database structure; cloud data flows; management dashboards; web and mobile delivery. Built with Next.js, TypeScript, React Native and cloud data services.</w:t>
+        <w:t>I build the community, screening, referral and follow-up data capture, the database structure, the cloud data flows, the management dashboards and the web and mobile delivery. I work in Next.js, TypeScript, React Native and cloud data services.</w:t>
       </w:r>
     </w:p>
     <w:p>
@@ -2194,7 +2194,7 @@
           <w:sz w:val="19"/>
           <w:rFonts w:ascii="Calibri" w:hAnsi="Calibri" w:cs="Calibri"/>
         </w:rPr>
-        <w:t>An application that simplifies data collection and reporting for professions that live on records: accounting, research, biology and laboratory science, agriculture and social media among them. Rather than collecting data now and writing the report later, the user works inside the app and the information and reports are generated in real time as they go.</w:t>
+        <w:t>I am building an application that simplifies data collection and reporting for professions that live on records: accounting, research, biology and laboratory science, agriculture and social media among them. Rather than collecting data now and writing the report later, the user works inside the app and it generates the information and reports in real time as they go.</w:t>
       </w:r>
     </w:p>
     <w:p>
@@ -2260,7 +2260,7 @@
           <w:sz w:val="19"/>
           <w:rFonts w:ascii="Calibri" w:hAnsi="Calibri" w:cs="Calibri"/>
         </w:rPr>
-        <w:t>Ran oxygen therapy management for the hospital through the pandemic and developed the formulas for calculating patient oxygen consumption. The figures were used to size plant capacity, cylinder stock and flow requirements, and to support planning decisions at managerial and national level.</w:t>
+        <w:t>I ran oxygen therapy management for the hospital through the pandemic and I developed the formulas for calculating patient oxygen consumption. My figures were used to size plant capacity, cylinder stock and flow requirements, and to support planning decisions at managerial and national level.</w:t>
       </w:r>
     </w:p>
     <w:p>
@@ -2326,7 +2326,7 @@
           <w:sz w:val="19"/>
           <w:rFonts w:ascii="Calibri" w:hAnsi="Calibri" w:cs="Calibri"/>
         </w:rPr>
-        <w:t>Built and deployed an AI agent that answers live inbound client calls, books and reschedules appointments, and runs post-contact client follow-up. In active production use.</w:t>
+        <w:t>I built and deployed an AI agent that answers live inbound client calls, books and reschedules appointments, and runs post-contact client follow-up. It is in active production use.</w:t>
       </w:r>
     </w:p>
     <w:p>
@@ -2392,7 +2392,7 @@
           <w:sz w:val="19"/>
           <w:rFonts w:ascii="Calibri" w:hAnsi="Calibri" w:cs="Calibri"/>
         </w:rPr>
-        <w:t>Multi-user records and reporting platform built with React and Next.js, TypeScript, Laravel, MySQL and AWS. Contributed front-end and back-end work, third-party integrations, testing, user training and documentation.</w:t>
+        <w:t>I contributed front-end and back-end development, third-party integrations, testing, user training and documentation to a multi-user records and reporting platform built with React and Next.js, TypeScript, Laravel, MySQL and AWS.</w:t>
       </w:r>
     </w:p>
     <w:p>
@@ -2458,7 +2458,7 @@
           <w:sz w:val="19"/>
           <w:rFonts w:ascii="Calibri" w:hAnsi="Calibri" w:cs="Calibri"/>
         </w:rPr>
-        <w:t>Clinical image capture and procedure reporting system in JavaFX and MySQL. Led algorithm design, relational modelling, legacy data migration, on-site installation, user training and the user manual.</w:t>
+        <w:t>I led the build of a clinical image capture and procedure reporting system in JavaFX and MySQL. I did the algorithm design, the relational modelling, the legacy data migration, the on-site installation, the user training and the user manual.</w:t>
       </w:r>
     </w:p>
     <w:p>
@@ -2524,13 +2524,13 @@
           <w:sz w:val="19"/>
           <w:rFonts w:ascii="Calibri" w:hAnsi="Calibri" w:cs="Calibri"/>
         </w:rPr>
-        <w:t>Android and Arduino monitoring system for third-trimester foetal heart-rate measurement, with Java serial communication between device and phone and Microsoft Azure cloud storage.</w:t>
+        <w:t>I built an Android and Arduino monitoring system for third-trimester foetal heart-rate measurement, and I implemented the Java serial communication between the device and the phone, with Microsoft Azure cloud storage.</w:t>
       </w:r>
     </w:p>
     <w:p>
       <w:pPr>
         <w:keepNext/>
-        <w:spacing w:before="180" w:after="90" w:line="245" w:lineRule="auto"/>
+        <w:spacing w:before="160" w:after="80" w:line="245" w:lineRule="auto"/>
         <w:ind w:left="158"/>
         <w:pBdr>
           <w:left w:val="single" w:sz="22" w:space="6" w:color="1A6B5C"/>
@@ -2565,9 +2565,9 @@
           <w:insideV w:val="none" w:sz="0"/>
         </w:tblBorders>
         <w:tblCellMar>
-          <w:top w:w="42" w:type="dxa"/>
+          <w:top w:w="36" w:type="dxa"/>
           <w:left w:w="85" w:type="dxa"/>
-          <w:bottom w:w="42" w:type="dxa"/>
+          <w:bottom w:w="36" w:type="dxa"/>
           <w:right w:w="85" w:type="dxa"/>
         </w:tblCellMar>
       </w:tblPr>
@@ -2616,7 +2616,7 @@
                 <w:sz w:val="19"/>
                 <w:rFonts w:ascii="Calibri" w:hAnsi="Calibri" w:cs="Calibri"/>
               </w:rPr>
-              <w:t>Managed a regional biomedical team across East and Central Africa and a hospital biomedical function for four years: workplans, schedules, procurement coordination and management reporting.</w:t>
+              <w:t>I managed a regional biomedical team across East and Central Africa, and a hospital biomedical function for four years: workplans, schedules, procurement coordination and management reporting.</w:t>
             </w:r>
           </w:p>
         </w:tc>
@@ -2660,7 +2660,7 @@
                 <w:sz w:val="19"/>
                 <w:rFonts w:ascii="Calibri" w:hAnsi="Calibri" w:cs="Calibri"/>
               </w:rPr>
-              <w:t>Leads the FCHIP indicator, data-quality, dashboard and reporting build. Built equipment registers, maintenance schedules and routine management reports. Analysis in Python, SQL, Java, JavaScript and MATLAB.</w:t>
+              <w:t>I lead the FCHIP indicator, data-quality, dashboard and reporting build. I built the equipment registers, maintenance schedules and routine management reports at IHK and GFF. I analyse in Python, SQL, Java, JavaScript and MATLAB.</w:t>
             </w:r>
           </w:p>
         </w:tc>
@@ -2706,7 +2706,7 @@
                 <w:sz w:val="19"/>
                 <w:rFonts w:ascii="Calibri" w:hAnsi="Calibri" w:cs="Calibri"/>
               </w:rPr>
-              <w:t>Writes and edits institutional proposals, grant applications, investment materials, partnership documents, technical documentation and user manuals.</w:t>
+              <w:t>I write and edit institutional proposals, grant applications, investment materials, partnership documents, technical documentation and user manuals.</w:t>
             </w:r>
           </w:p>
         </w:tc>
@@ -2750,7 +2750,7 @@
                 <w:sz w:val="19"/>
                 <w:rFonts w:ascii="Calibri" w:hAnsi="Calibri" w:cs="Calibri"/>
               </w:rPr>
-              <w:t>Cleans, models and reports on operational and clinical data. Builds automated auditing and verification tooling to check records in bulk rather than by hand.</w:t>
+              <w:t>I clean, model and report on operational and clinical data, and I build automated auditing and verification tooling that checks records in bulk rather than by hand.</w:t>
             </w:r>
           </w:p>
         </w:tc>
@@ -2796,7 +2796,7 @@
                 <w:sz w:val="19"/>
                 <w:rFonts w:ascii="Calibri" w:hAnsi="Calibri" w:cs="Calibri"/>
               </w:rPr>
-              <w:t>Coordinated specification, procurement, commissioning and lifecycle documentation, and kept the compliance evidence reviewed for COHSASA accreditation.</w:t>
+              <w:t>I coordinated specification, procurement, commissioning and lifecycle documentation, and I kept the compliance evidence reviewed for COHSASA accreditation.</w:t>
             </w:r>
           </w:p>
         </w:tc>
@@ -2840,7 +2840,7 @@
                 <w:sz w:val="19"/>
                 <w:rFonts w:ascii="Calibri" w:hAnsi="Calibri" w:cs="Calibri"/>
               </w:rPr>
-              <w:t>Chairs partner meetings and writes them up. Works with hospital departments, suppliers, trainees, accreditation assessors, donors and prospective partners.</w:t>
+              <w:t>I chair partner meetings and write them up, and I work with hospital departments, suppliers, trainees, accreditation assessors, donors and prospective partners.</w:t>
             </w:r>
           </w:p>
         </w:tc>
@@ -2886,7 +2886,7 @@
                 <w:sz w:val="19"/>
                 <w:rFonts w:ascii="Calibri" w:hAnsi="Calibri" w:cs="Calibri"/>
               </w:rPr>
-              <w:t>Trained biomedical engineers, technicians and clinical users across multiple facilities, and taught undergraduate engineering laboratory practicals at Makerere University.</w:t>
+              <w:t>I trained biomedical engineers, technicians and clinical users across multiple facilities, and I taught undergraduate engineering laboratory practicals at Makerere University.</w:t>
             </w:r>
           </w:p>
         </w:tc>
@@ -2930,7 +2930,7 @@
                 <w:sz w:val="19"/>
                 <w:rFonts w:ascii="Calibri" w:hAnsi="Calibri" w:cs="Calibri"/>
               </w:rPr>
-              <w:t>Clear written and spoken English, comfortable presenting to clinical, executive and donor audiences. Settles quickly into new countries, teams, codebases and equipment brands.</w:t>
+              <w:t>I write and speak clear English and I present comfortably to clinical, executive and donor audiences. I settle quickly into new countries, teams, codebases and equipment brands.</w:t>
             </w:r>
           </w:p>
         </w:tc>
@@ -2939,7 +2939,7 @@
     <w:p>
       <w:pPr>
         <w:keepNext/>
-        <w:spacing w:before="180" w:after="90" w:line="245" w:lineRule="auto"/>
+        <w:spacing w:before="160" w:after="80" w:line="245" w:lineRule="auto"/>
         <w:ind w:left="158"/>
         <w:pBdr>
           <w:left w:val="single" w:sz="22" w:space="6" w:color="1A6B5C"/>
@@ -2974,9 +2974,9 @@
           <w:insideV w:val="none" w:sz="0"/>
         </w:tblBorders>
         <w:tblCellMar>
-          <w:top w:w="42" w:type="dxa"/>
+          <w:top w:w="36" w:type="dxa"/>
           <w:left w:w="85" w:type="dxa"/>
-          <w:bottom w:w="42" w:type="dxa"/>
+          <w:bottom w:w="36" w:type="dxa"/>
           <w:right w:w="85" w:type="dxa"/>
         </w:tblCellMar>
       </w:tblPr>
@@ -3258,7 +3258,7 @@
     <w:p>
       <w:pPr>
         <w:keepNext/>
-        <w:spacing w:before="180" w:after="90" w:line="245" w:lineRule="auto"/>
+        <w:spacing w:before="160" w:after="80" w:line="245" w:lineRule="auto"/>
         <w:ind w:left="158"/>
         <w:pBdr>
           <w:left w:val="single" w:sz="22" w:space="6" w:color="1A6B5C"/>
@@ -3577,7 +3577,7 @@
     <w:p>
       <w:pPr>
         <w:keepNext/>
-        <w:spacing w:before="0" w:after="0" w:line="245" w:lineRule="auto"/>
+        <w:spacing w:before="0" w:after="40" w:line="245" w:lineRule="auto"/>
       </w:pPr>
       <w:r>
         <w:rPr>
@@ -3593,8 +3593,25 @@
     </w:p>
     <w:p>
       <w:pPr>
+        <w:spacing w:before="0" w:after="40" w:line="245" w:lineRule="auto"/>
+        <w:jc w:val="both"/>
+      </w:pPr>
+      <w:r>
+        <w:rPr>
+          <w:rFonts w:ascii="Calibri" w:hAnsi="Calibri"/>
+          <w:b w:val="0"/>
+          <w:i w:val="0"/>
+          <w:color w:val="23272B"/>
+          <w:sz w:val="18"/>
+          <w:rFonts w:ascii="Calibri" w:hAnsi="Calibri" w:cs="Calibri"/>
+        </w:rPr>
+        <w:t>Division 1.</w:t>
+      </w:r>
+    </w:p>
+    <w:p>
+      <w:pPr>
         <w:keepNext/>
-        <w:spacing w:before="180" w:after="90" w:line="245" w:lineRule="auto"/>
+        <w:spacing w:before="160" w:after="80" w:line="245" w:lineRule="auto"/>
         <w:ind w:left="158"/>
         <w:pBdr>
           <w:left w:val="single" w:sz="22" w:space="6" w:color="1A6B5C"/>
@@ -3695,7 +3712,7 @@
     <w:p>
       <w:pPr>
         <w:keepNext/>
-        <w:spacing w:before="180" w:after="90" w:line="245" w:lineRule="auto"/>
+        <w:spacing w:before="160" w:after="80" w:line="245" w:lineRule="auto"/>
         <w:ind w:left="158"/>
         <w:pBdr>
           <w:left w:val="single" w:sz="22" w:space="6" w:color="1A6B5C"/>
@@ -3729,13 +3746,13 @@
           <w:sz w:val="19"/>
           <w:rFonts w:ascii="Calibri" w:hAnsi="Calibri" w:cs="Calibri"/>
         </w:rPr>
-        <w:t>Music, and playing the saxophone in particular.  ·  Film.  ·  Physical fitness and regular exercise.  ·  Travel and working in unfamiliar places, which the regional field work has made second nature.</w:t>
+        <w:t>I play music, the saxophone in particular.  ·  I watch film.  ·  I train and exercise regularly.  ·  I enjoy travelling and working in unfamiliar places, which the regional field work has made second nature.</w:t>
       </w:r>
     </w:p>
     <w:p>
       <w:pPr>
         <w:keepNext/>
-        <w:spacing w:before="180" w:after="90" w:line="245" w:lineRule="auto"/>
+        <w:spacing w:before="160" w:after="80" w:line="245" w:lineRule="auto"/>
         <w:ind w:left="158"/>
         <w:pBdr>
           <w:left w:val="single" w:sz="22" w:space="6" w:color="1A6B5C"/>

</xml_diff>

<commit_message>
Enhance Wasswa Wilson's CV and outreach materials with updated content and structure
This commit updates Wasswa Wilson's CV, cover letter, and email introduction to Mr. Robert Muwanga, reflecting a refined professional profile that emphasizes his roles as a biomedical engineer, researcher, and full-stack software developer. Key additions include a dedicated section on research, data management, and proposal writing, showcasing his expertise and recent achievements. The outreach materials are designed to facilitate networking opportunities and present a comprehensive view of Wasswa's qualifications and contributions in the healthcare and technology sectors.
</commit_message>
<xml_diff>
--- a/wilson/cv-2026/Wasswa_Wilson_CV_2026.docx
+++ b/wilson/cv-2026/Wasswa_Wilson_CV_2026.docx
@@ -67,7 +67,7 @@
                 <w:sz w:val="19"/>
                 <w:rFonts w:ascii="Calibri" w:hAnsi="Calibri" w:cs="Calibri"/>
               </w:rPr>
-              <w:t>Biomedical Engineer  ·  Full-Stack Software Developer  ·  Health Technology Programme Lead</w:t>
+              <w:t>Biomedical Engineer  ·  Researcher and Data Lead  ·  Full-Stack Software Developer  ·  Proposal Writer</w:t>
             </w:r>
           </w:p>
         </w:tc>
@@ -144,7 +144,7 @@
           <w:sz w:val="19"/>
           <w:rFonts w:ascii="Calibri" w:hAnsi="Calibri" w:cs="Calibri"/>
         </w:rPr>
-        <w:t>I am a biomedical engineer and full-stack software developer based in Kampala, with over nine years of work across hospital technology, health information systems and software engineering. I lead development of the FairBanks Community Health Intelligence Platform (FCHIP), where I handle the data capture tools, the database, the cloud data flows and the management dashboards. Alongside it I am building a cross-sector application that collects field data and generates finished reports in real time, for accounting, research, biology, agriculture, social media and other record-heavy work. Before FairBanks I managed the Gould Family Foundation biomedical programme across East and Central Africa, and I ran the biomedical function at International Hospital Kampala through the COVID-19 response and through successful COHSASA accreditation. I write Java, Python, JavaScript and TypeScript, I work across React, Next.js, React Native, Node.js and Express, and I design AI agents and automations that are running in production today.</w:t>
+        <w:t>I am a biomedical engineer, researcher and full-stack software developer based in Kampala, with over nine years of work across health research, data systems and software engineering. I started in research at the Uganda Virus Research Institute and I have kept the habit: I model a problem, test it against real data and document it so someone else can rely on it. During the COVID-19 response that produced the oxygen consumption formulas that gave hospital and national planners a defensible basis for sizing supply. Today I lead development of the FairBanks Community Health Intelligence Platform (FCHIP), where I own the data capture tools, the database, the cloud data flows and the management dashboards, and I am building a cross-sector application that turns field data into finished reports in real time. I also write the institutional proposals, grant applications and investment materials FairBanks submits. I analyse in Python, SQL, MATLAB and Excel, I build automated auditing tooling, and I design AI agents and automations that are running in production.</w:t>
       </w:r>
     </w:p>
     <w:p>
@@ -229,6 +229,64 @@
                 <w:sz w:val="19"/>
                 <w:rFonts w:ascii="Calibri" w:hAnsi="Calibri" w:cs="Calibri"/>
               </w:rPr>
+              <w:t>I developed the oxygen consumption formulas used to calculate patient demand during the COVID-19 response at International Hospital Kampala, and I supported Ministry of Health oxygen planning. I defined the model, tested it against real hospital demand and handed it to management as a planning tool. It went on to inform capacity planning for later facility projects.</w:t>
+            </w:r>
+          </w:p>
+          <w:p>
+            <w:pPr>
+              <w:spacing w:before="0" w:after="68" w:line="245" w:lineRule="auto"/>
+              <w:ind w:left="259" w:hanging="230"/>
+              <w:jc w:val="both"/>
+            </w:pPr>
+            <w:r>
+              <w:rPr>
+                <w:rFonts w:ascii="Calibri" w:hAnsi="Calibri"/>
+                <w:b/>
+                <w:i w:val="0"/>
+                <w:color w:val="1A6B5C"/>
+                <w:sz w:val="19"/>
+                <w:rFonts w:ascii="Calibri" w:hAnsi="Calibri" w:cs="Calibri"/>
+              </w:rPr>
+              <w:t xml:space="preserve">•   </w:t>
+            </w:r>
+            <w:r>
+              <w:rPr>
+                <w:rFonts w:ascii="Calibri" w:hAnsi="Calibri"/>
+                <w:b w:val="0"/>
+                <w:i w:val="0"/>
+                <w:color w:val="23272B"/>
+                <w:sz w:val="19"/>
+                <w:rFonts w:ascii="Calibri" w:hAnsi="Calibri" w:cs="Calibri"/>
+              </w:rPr>
+              <w:t>I write the proposals FairBanks submits, among them the WA Foundation Category 2 full project proposal for FairBanks Community Health Reach, accelerator and fellowship applications, and the investment proposals for the maternity and diagnostics projects. I handle the narrative, the financial annexes and the supporting evidence files.</w:t>
+            </w:r>
+          </w:p>
+          <w:p>
+            <w:pPr>
+              <w:spacing w:before="0" w:after="68" w:line="245" w:lineRule="auto"/>
+              <w:ind w:left="259" w:hanging="230"/>
+              <w:jc w:val="both"/>
+            </w:pPr>
+            <w:r>
+              <w:rPr>
+                <w:rFonts w:ascii="Calibri" w:hAnsi="Calibri"/>
+                <w:b/>
+                <w:i w:val="0"/>
+                <w:color w:val="1A6B5C"/>
+                <w:sz w:val="19"/>
+                <w:rFonts w:ascii="Calibri" w:hAnsi="Calibri" w:cs="Calibri"/>
+              </w:rPr>
+              <w:t xml:space="preserve">•   </w:t>
+            </w:r>
+            <w:r>
+              <w:rPr>
+                <w:rFonts w:ascii="Calibri" w:hAnsi="Calibri"/>
+                <w:b w:val="0"/>
+                <w:i w:val="0"/>
+                <w:color w:val="23272B"/>
+                <w:sz w:val="19"/>
+                <w:rFonts w:ascii="Calibri" w:hAnsi="Calibri" w:cs="Calibri"/>
+              </w:rPr>
               <w:t>I lead development of FCHIP, the FairBanks Community Health Intelligence Platform. I built the community screening, referral and follow-up data capture, the database, the cloud sync and the reporting dashboards, and I deliver the platform across web and mobile.</w:t>
             </w:r>
           </w:p>
@@ -287,35 +345,6 @@
                 <w:sz w:val="19"/>
                 <w:rFonts w:ascii="Calibri" w:hAnsi="Calibri" w:cs="Calibri"/>
               </w:rPr>
-              <w:t>I developed the oxygen consumption formulas used to calculate patient demand during the COVID-19 response at International Hospital Kampala, and I supported Ministry of Health oxygen planning. My method went on to inform capacity planning for later facility projects.</w:t>
-            </w:r>
-          </w:p>
-          <w:p>
-            <w:pPr>
-              <w:spacing w:before="0" w:after="68" w:line="245" w:lineRule="auto"/>
-              <w:ind w:left="259" w:hanging="230"/>
-              <w:jc w:val="both"/>
-            </w:pPr>
-            <w:r>
-              <w:rPr>
-                <w:rFonts w:ascii="Calibri" w:hAnsi="Calibri"/>
-                <w:b/>
-                <w:i w:val="0"/>
-                <w:color w:val="1A6B5C"/>
-                <w:sz w:val="19"/>
-                <w:rFonts w:ascii="Calibri" w:hAnsi="Calibri" w:cs="Calibri"/>
-              </w:rPr>
-              <w:t xml:space="preserve">•   </w:t>
-            </w:r>
-            <w:r>
-              <w:rPr>
-                <w:rFonts w:ascii="Calibri" w:hAnsi="Calibri"/>
-                <w:b w:val="0"/>
-                <w:i w:val="0"/>
-                <w:color w:val="23272B"/>
-                <w:sz w:val="19"/>
-                <w:rFonts w:ascii="Calibri" w:hAnsi="Calibri" w:cs="Calibri"/>
-              </w:rPr>
               <w:t>I designed, built and deployed an AI reception agent for a law firm in Texas, USA. It handles live inbound client calls, books and reschedules appointments, and runs client follow-up. It is in active production use.</w:t>
             </w:r>
           </w:p>
@@ -345,36 +374,7 @@
                 <w:sz w:val="19"/>
                 <w:rFonts w:ascii="Calibri" w:hAnsi="Calibri" w:cs="Calibri"/>
               </w:rPr>
-              <w:t>I have delivered hospital technology projects in five countries: Uganda, the Democratic Republic of Congo, Kenya, Tanzania and Somaliland. I completed the laboratory, theatre and radiology installations at the hospital serving the Kibali Gold Mine, DR Congo.</w:t>
-            </w:r>
-          </w:p>
-          <w:p>
-            <w:pPr>
-              <w:spacing w:before="0" w:after="68" w:line="245" w:lineRule="auto"/>
-              <w:ind w:left="259" w:hanging="230"/>
-              <w:jc w:val="both"/>
-            </w:pPr>
-            <w:r>
-              <w:rPr>
-                <w:rFonts w:ascii="Calibri" w:hAnsi="Calibri"/>
-                <w:b/>
-                <w:i w:val="0"/>
-                <w:color w:val="1A6B5C"/>
-                <w:sz w:val="19"/>
-                <w:rFonts w:ascii="Calibri" w:hAnsi="Calibri" w:cs="Calibri"/>
-              </w:rPr>
-              <w:t xml:space="preserve">•   </w:t>
-            </w:r>
-            <w:r>
-              <w:rPr>
-                <w:rFonts w:ascii="Calibri" w:hAnsi="Calibri"/>
-                <w:b w:val="0"/>
-                <w:i w:val="0"/>
-                <w:color w:val="23272B"/>
-                <w:sz w:val="19"/>
-                <w:rFonts w:ascii="Calibri" w:hAnsi="Calibri" w:cs="Calibri"/>
-              </w:rPr>
-              <w:t>I prepared and maintained the biomedical compliance evidence that carried International Hospital Kampala through successful COHSASA accreditation, and I cut equipment downtime with a preventive maintenance programme that I designed, documented and ran.</w:t>
+              <w:t>I prepared and maintained the biomedical compliance evidence that carried International Hospital Kampala through successful COHSASA accreditation, which is data quality assurance against a published standard.</w:t>
             </w:r>
           </w:p>
           <w:p>
@@ -403,7 +403,282 @@
                 <w:sz w:val="19"/>
                 <w:rFonts w:ascii="Calibri" w:hAnsi="Calibri" w:cs="Calibri"/>
               </w:rPr>
-              <w:t>I upgraded partner health facilities across East and Central Africa for the Gould Family Foundation, including the neonatal intensive care unit at Mama Lucy Kibaki Hospital, Nairobi.</w:t>
+              <w:t>I have delivered hospital technology projects in five countries: Uganda, the Democratic Republic of Congo, Kenya, Tanzania and Somaliland, and I upgraded partner facilities for the Gould Family Foundation including the neonatal intensive care unit at Mama Lucy Kibaki Hospital, Nairobi.</w:t>
+            </w:r>
+          </w:p>
+        </w:tc>
+      </w:tr>
+    </w:tbl>
+    <w:p>
+      <w:pPr>
+        <w:keepNext/>
+        <w:spacing w:before="160" w:after="80" w:line="245" w:lineRule="auto"/>
+        <w:ind w:left="158"/>
+        <w:pBdr>
+          <w:left w:val="single" w:sz="22" w:space="6" w:color="1A6B5C"/>
+          <w:bottom w:val="single" w:sz="4" w:space="4" w:color="CFD8E3"/>
+        </w:pBdr>
+      </w:pPr>
+      <w:r>
+        <w:rPr>
+          <w:rFonts w:ascii="Calibri" w:hAnsi="Calibri"/>
+          <w:b/>
+          <w:i w:val="0"/>
+          <w:color w:val="0F2C4C"/>
+          <w:sz w:val="21"/>
+          <w:rFonts w:ascii="Calibri" w:hAnsi="Calibri" w:cs="Calibri"/>
+          <w:spacing w:val="26"/>
+        </w:rPr>
+        <w:t>RESEARCH, DATA AND PROPOSAL DEVELOPMENT</w:t>
+      </w:r>
+    </w:p>
+    <w:tbl>
+      <w:tblPr>
+        <w:tblW w:type="auto" w:w="0"/>
+        <w:jc w:val="left"/>
+        <w:tblLayout w:type="fixed"/>
+        <w:tblLook w:firstColumn="1" w:firstRow="1" w:lastColumn="0" w:lastRow="0" w:noHBand="0" w:noVBand="1" w:val="04A0"/>
+        <w:tblBorders>
+          <w:top w:val="none" w:sz="0"/>
+          <w:left w:val="none" w:sz="0"/>
+          <w:bottom w:val="none" w:sz="0"/>
+          <w:right w:val="none" w:sz="0"/>
+          <w:insideH w:val="none" w:sz="0"/>
+          <w:insideV w:val="none" w:sz="0"/>
+        </w:tblBorders>
+        <w:tblCellMar>
+          <w:top w:w="36" w:type="dxa"/>
+          <w:left w:w="85" w:type="dxa"/>
+          <w:bottom w:w="36" w:type="dxa"/>
+          <w:right w:w="85" w:type="dxa"/>
+        </w:tblCellMar>
+      </w:tblPr>
+      <w:tblGrid>
+        <w:gridCol w:w="5119"/>
+        <w:gridCol w:w="5119"/>
+      </w:tblGrid>
+      <w:tr>
+        <w:tc>
+          <w:tcPr>
+            <w:tcW w:type="dxa" w:w="2880"/>
+            <w:shd w:val="clear" w:color="auto" w:fill="F3F6F9"/>
+          </w:tcPr>
+          <w:p>
+            <w:pPr>
+              <w:spacing w:after="0" w:line="250" w:lineRule="auto"/>
+            </w:pPr>
+            <w:r>
+              <w:rPr>
+                <w:rFonts w:ascii="Calibri" w:hAnsi="Calibri"/>
+                <w:b/>
+                <w:i w:val="0"/>
+                <w:color w:val="0F2C4C"/>
+                <w:sz w:val="19"/>
+                <w:rFonts w:ascii="Calibri" w:hAnsi="Calibri" w:cs="Calibri"/>
+              </w:rPr>
+              <w:t>Research</w:t>
+            </w:r>
+          </w:p>
+        </w:tc>
+        <w:tc>
+          <w:tcPr>
+            <w:tcW w:type="dxa" w:w="7358"/>
+            <w:shd w:val="clear" w:color="auto" w:fill="F3F6F9"/>
+          </w:tcPr>
+          <w:p>
+            <w:pPr>
+              <w:spacing w:after="0" w:line="259" w:lineRule="auto"/>
+            </w:pPr>
+            <w:r>
+              <w:rPr>
+                <w:rFonts w:ascii="Calibri" w:hAnsi="Calibri"/>
+                <w:b w:val="0"/>
+                <w:i w:val="0"/>
+                <w:color w:val="23272B"/>
+                <w:sz w:val="19"/>
+                <w:rFonts w:ascii="Calibri" w:hAnsi="Calibri" w:cs="Calibri"/>
+              </w:rPr>
+              <w:t>I worked as a research intern at the Uganda Virus Research Institute on laboratory data analysis, mathematical modelling and research pipeline design in Python. My BSc at Makerere covered Research Methods, Biomedical Modelling and Simulation, Biosignal Processing and Analysis, and Bioinformatics and Functional Genomics, and I carried a full research project through to completion. I apply the same method to operational problems, most visibly in the COVID-19 oxygen demand modelling.</w:t>
+            </w:r>
+          </w:p>
+        </w:tc>
+      </w:tr>
+      <w:tr>
+        <w:tc>
+          <w:tcPr>
+            <w:tcW w:type="dxa" w:w="2880"/>
+          </w:tcPr>
+          <w:p>
+            <w:pPr>
+              <w:spacing w:after="0" w:line="250" w:lineRule="auto"/>
+            </w:pPr>
+            <w:r>
+              <w:rPr>
+                <w:rFonts w:ascii="Calibri" w:hAnsi="Calibri"/>
+                <w:b/>
+                <w:i w:val="0"/>
+                <w:color w:val="0F2C4C"/>
+                <w:sz w:val="19"/>
+                <w:rFonts w:ascii="Calibri" w:hAnsi="Calibri" w:cs="Calibri"/>
+              </w:rPr>
+              <w:t>Data management at scale</w:t>
+            </w:r>
+          </w:p>
+        </w:tc>
+        <w:tc>
+          <w:tcPr>
+            <w:tcW w:type="dxa" w:w="7358"/>
+          </w:tcPr>
+          <w:p>
+            <w:pPr>
+              <w:spacing w:after="0" w:line="259" w:lineRule="auto"/>
+            </w:pPr>
+            <w:r>
+              <w:rPr>
+                <w:rFonts w:ascii="Calibri" w:hAnsi="Calibri"/>
+                <w:b w:val="0"/>
+                <w:i w:val="0"/>
+                <w:color w:val="23272B"/>
+                <w:sz w:val="19"/>
+                <w:rFonts w:ascii="Calibri" w:hAnsi="Calibri" w:cs="Calibri"/>
+              </w:rPr>
+              <w:t>I design and run the data layer of FCHIP: capture schemas, validation rules, cloud data flows, storage and synchronisation across web and mobile. Earlier I built and maintained the equipment registers, maintenance schedules and service histories for multi-facility programmes at International Hospital Kampala and the Gould Family Foundation, and kept them accurate enough to survive accreditation review.</w:t>
+            </w:r>
+          </w:p>
+        </w:tc>
+      </w:tr>
+      <w:tr>
+        <w:tc>
+          <w:tcPr>
+            <w:tcW w:type="dxa" w:w="2880"/>
+            <w:shd w:val="clear" w:color="auto" w:fill="F3F6F9"/>
+          </w:tcPr>
+          <w:p>
+            <w:pPr>
+              <w:spacing w:after="0" w:line="250" w:lineRule="auto"/>
+            </w:pPr>
+            <w:r>
+              <w:rPr>
+                <w:rFonts w:ascii="Calibri" w:hAnsi="Calibri"/>
+                <w:b/>
+                <w:i w:val="0"/>
+                <w:color w:val="0F2C4C"/>
+                <w:sz w:val="19"/>
+                <w:rFonts w:ascii="Calibri" w:hAnsi="Calibri" w:cs="Calibri"/>
+              </w:rPr>
+              <w:t>Analysis and reporting</w:t>
+            </w:r>
+          </w:p>
+        </w:tc>
+        <w:tc>
+          <w:tcPr>
+            <w:tcW w:type="dxa" w:w="7358"/>
+            <w:shd w:val="clear" w:color="auto" w:fill="F3F6F9"/>
+          </w:tcPr>
+          <w:p>
+            <w:pPr>
+              <w:spacing w:after="0" w:line="259" w:lineRule="auto"/>
+            </w:pPr>
+            <w:r>
+              <w:rPr>
+                <w:rFonts w:ascii="Calibri" w:hAnsi="Calibri"/>
+                <w:b w:val="0"/>
+                <w:i w:val="0"/>
+                <w:color w:val="23272B"/>
+                <w:sz w:val="19"/>
+                <w:rFonts w:ascii="Calibri" w:hAnsi="Calibri" w:cs="Calibri"/>
+              </w:rPr>
+              <w:t>I analyse in Python, SQL, MATLAB and Excel. I publish results as live management dashboards rather than static documents, so decision-makers work from current numbers, and I build automated auditing and verification tooling that checks records in bulk instead of by hand.</w:t>
+            </w:r>
+          </w:p>
+        </w:tc>
+      </w:tr>
+      <w:tr>
+        <w:tc>
+          <w:tcPr>
+            <w:tcW w:type="dxa" w:w="2880"/>
+          </w:tcPr>
+          <w:p>
+            <w:pPr>
+              <w:spacing w:after="0" w:line="250" w:lineRule="auto"/>
+            </w:pPr>
+            <w:r>
+              <w:rPr>
+                <w:rFonts w:ascii="Calibri" w:hAnsi="Calibri"/>
+                <w:b/>
+                <w:i w:val="0"/>
+                <w:color w:val="0F2C4C"/>
+                <w:sz w:val="19"/>
+                <w:rFonts w:ascii="Calibri" w:hAnsi="Calibri" w:cs="Calibri"/>
+              </w:rPr>
+              <w:t>Proposals, grants and technical writing</w:t>
+            </w:r>
+          </w:p>
+        </w:tc>
+        <w:tc>
+          <w:tcPr>
+            <w:tcW w:type="dxa" w:w="7358"/>
+          </w:tcPr>
+          <w:p>
+            <w:pPr>
+              <w:spacing w:after="0" w:line="259" w:lineRule="auto"/>
+            </w:pPr>
+            <w:r>
+              <w:rPr>
+                <w:rFonts w:ascii="Calibri" w:hAnsi="Calibri"/>
+                <w:b w:val="0"/>
+                <w:i w:val="0"/>
+                <w:color w:val="23272B"/>
+                <w:sz w:val="19"/>
+                <w:rFonts w:ascii="Calibri" w:hAnsi="Calibri" w:cs="Calibri"/>
+              </w:rPr>
+              <w:t>I write and edit institutional proposals, grant applications, investment proposals, concept notes, partnership documents, pitch decks, technical documentation and user manuals, together with the annexes and evidence files that have to stand up to assessment.</w:t>
+            </w:r>
+          </w:p>
+        </w:tc>
+      </w:tr>
+      <w:tr>
+        <w:tc>
+          <w:tcPr>
+            <w:tcW w:type="dxa" w:w="2880"/>
+            <w:shd w:val="clear" w:color="auto" w:fill="F3F6F9"/>
+          </w:tcPr>
+          <w:p>
+            <w:pPr>
+              <w:spacing w:after="0" w:line="250" w:lineRule="auto"/>
+            </w:pPr>
+            <w:r>
+              <w:rPr>
+                <w:rFonts w:ascii="Calibri" w:hAnsi="Calibri"/>
+                <w:b/>
+                <w:i w:val="0"/>
+                <w:color w:val="0F2C4C"/>
+                <w:sz w:val="19"/>
+                <w:rFonts w:ascii="Calibri" w:hAnsi="Calibri" w:cs="Calibri"/>
+              </w:rPr>
+              <w:t>Modern tooling and automation</w:t>
+            </w:r>
+          </w:p>
+        </w:tc>
+        <w:tc>
+          <w:tcPr>
+            <w:tcW w:type="dxa" w:w="7358"/>
+            <w:shd w:val="clear" w:color="auto" w:fill="F3F6F9"/>
+          </w:tcPr>
+          <w:p>
+            <w:pPr>
+              <w:spacing w:after="0" w:line="259" w:lineRule="auto"/>
+            </w:pPr>
+            <w:r>
+              <w:rPr>
+                <w:rFonts w:ascii="Calibri" w:hAnsi="Calibri"/>
+                <w:b w:val="0"/>
+                <w:i w:val="0"/>
+                <w:color w:val="23272B"/>
+                <w:sz w:val="19"/>
+                <w:rFonts w:ascii="Calibri" w:hAnsi="Calibri" w:cs="Calibri"/>
+              </w:rPr>
+              <w:t>I work with AI agents and agent-assisted development daily, in Cursor, Claude, OpenAI GPT and Codex, and I build automation pipelines that take routine collection, reconciliation and reporting off people's hands.</w:t>
             </w:r>
           </w:p>
         </w:tc>
@@ -457,6 +732,96 @@
         <w:gridCol w:w="5119"/>
         <w:gridCol w:w="5119"/>
       </w:tblGrid>
+      <w:tr>
+        <w:tc>
+          <w:tcPr>
+            <w:tcW w:type="dxa" w:w="2390"/>
+            <w:shd w:val="clear" w:color="auto" w:fill="F3F6F9"/>
+          </w:tcPr>
+          <w:p>
+            <w:pPr>
+              <w:spacing w:after="0" w:line="250" w:lineRule="auto"/>
+            </w:pPr>
+            <w:r>
+              <w:rPr>
+                <w:rFonts w:ascii="Calibri" w:hAnsi="Calibri"/>
+                <w:b/>
+                <w:i w:val="0"/>
+                <w:color w:val="0F2C4C"/>
+                <w:sz w:val="19"/>
+                <w:rFonts w:ascii="Calibri" w:hAnsi="Calibri" w:cs="Calibri"/>
+              </w:rPr>
+              <w:t>Data, analytics and reporting</w:t>
+            </w:r>
+          </w:p>
+        </w:tc>
+        <w:tc>
+          <w:tcPr>
+            <w:tcW w:type="dxa" w:w="7848"/>
+            <w:shd w:val="clear" w:color="auto" w:fill="F3F6F9"/>
+          </w:tcPr>
+          <w:p>
+            <w:pPr>
+              <w:spacing w:after="0" w:line="259" w:lineRule="auto"/>
+            </w:pPr>
+            <w:r>
+              <w:rPr>
+                <w:rFonts w:ascii="Calibri" w:hAnsi="Calibri"/>
+                <w:b w:val="0"/>
+                <w:i w:val="0"/>
+                <w:color w:val="23272B"/>
+                <w:sz w:val="19"/>
+                <w:rFonts w:ascii="Calibri" w:hAnsi="Calibri" w:cs="Calibri"/>
+              </w:rPr>
+              <w:t>Python  ·  SQL  ·  MATLAB  ·  Excel  ·  relational modelling and query optimisation  ·  data cleaning and validation  ·  ETL and cloud data pipelines  ·  dashboard and report design  ·  automated auditing and verification tooling</w:t>
+            </w:r>
+          </w:p>
+        </w:tc>
+      </w:tr>
+      <w:tr>
+        <w:tc>
+          <w:tcPr>
+            <w:tcW w:type="dxa" w:w="2390"/>
+          </w:tcPr>
+          <w:p>
+            <w:pPr>
+              <w:spacing w:after="0" w:line="250" w:lineRule="auto"/>
+            </w:pPr>
+            <w:r>
+              <w:rPr>
+                <w:rFonts w:ascii="Calibri" w:hAnsi="Calibri"/>
+                <w:b/>
+                <w:i w:val="0"/>
+                <w:color w:val="0F2C4C"/>
+                <w:sz w:val="19"/>
+                <w:rFonts w:ascii="Calibri" w:hAnsi="Calibri" w:cs="Calibri"/>
+              </w:rPr>
+              <w:t>AI, agents and automation</w:t>
+            </w:r>
+          </w:p>
+        </w:tc>
+        <w:tc>
+          <w:tcPr>
+            <w:tcW w:type="dxa" w:w="7848"/>
+          </w:tcPr>
+          <w:p>
+            <w:pPr>
+              <w:spacing w:after="0" w:line="259" w:lineRule="auto"/>
+            </w:pPr>
+            <w:r>
+              <w:rPr>
+                <w:rFonts w:ascii="Calibri" w:hAnsi="Calibri"/>
+                <w:b w:val="0"/>
+                <w:i w:val="0"/>
+                <w:color w:val="23272B"/>
+                <w:sz w:val="19"/>
+                <w:rFonts w:ascii="Calibri" w:hAnsi="Calibri" w:cs="Calibri"/>
+              </w:rPr>
+              <w:t>AI agent design, deployment and monitoring  ·  workflow and process automation  ·  third-party systems integration  ·  Cursor  ·  Claude  ·  OpenAI GPT  ·  Codex</w:t>
+            </w:r>
+          </w:p>
+        </w:tc>
+      </w:tr>
       <w:tr>
         <w:tc>
           <w:tcPr>
@@ -588,7 +953,7 @@
                 <w:sz w:val="19"/>
                 <w:rFonts w:ascii="Calibri" w:hAnsi="Calibri" w:cs="Calibri"/>
               </w:rPr>
-              <w:t>Node.js  ·  Express  ·  Laravel  ·  CodeIgniter  ·  Spring / Spring Boot  ·  Convex  ·  Prisma  ·  REST APIs  ·  JWT  ·  role-based access control</w:t>
+              <w:t>Node.js  ·  Express  ·  Laravel  ·  CodeIgniter  ·  Spring / Spring Boot  ·  Convex  ·  Prisma  ·  MySQL  ·  REST APIs  ·  JWT  ·  role-based access control</w:t>
             </w:r>
           </w:p>
         </w:tc>
@@ -611,7 +976,7 @@
                 <w:sz w:val="19"/>
                 <w:rFonts w:ascii="Calibri" w:hAnsi="Calibri" w:cs="Calibri"/>
               </w:rPr>
-              <w:t>Databases and data</w:t>
+              <w:t>Cloud and DevOps</w:t>
             </w:r>
           </w:p>
         </w:tc>
@@ -632,7 +997,7 @@
                 <w:sz w:val="19"/>
                 <w:rFonts w:ascii="Calibri" w:hAnsi="Calibri" w:cs="Calibri"/>
               </w:rPr>
-              <w:t>MySQL  ·  relational modelling and query optimisation  ·  SQL analytics  ·  data cleaning and reporting  ·  MATLAB modelling  ·  Excel analysis and dashboards</w:t>
+              <w:t>AWS  ·  Microsoft Azure  ·  Vercel  ·  EAS  ·  Bunny.net CDN  ·  Git and GitHub  ·  CI/CD pipelines  ·  release and environment management</w:t>
             </w:r>
           </w:p>
         </w:tc>
@@ -656,7 +1021,7 @@
                 <w:sz w:val="19"/>
                 <w:rFonts w:ascii="Calibri" w:hAnsi="Calibri" w:cs="Calibri"/>
               </w:rPr>
-              <w:t>Cloud and DevOps</w:t>
+              <w:t>Research and scientific</w:t>
             </w:r>
           </w:p>
         </w:tc>
@@ -678,7 +1043,7 @@
                 <w:sz w:val="19"/>
                 <w:rFonts w:ascii="Calibri" w:hAnsi="Calibri" w:cs="Calibri"/>
               </w:rPr>
-              <w:t>AWS  ·  Microsoft Azure  ·  Vercel  ·  EAS  ·  Bunny.net CDN  ·  Git and GitHub  ·  CI/CD pipelines  ·  release and environment management</w:t>
+              <w:t>Research methods and study documentation  ·  mathematical modelling and simulation  ·  biosignal processing  ·  medical imaging  ·  bioinformatics and functional genomics  ·  embedded systems design  ·  Proteus  ·  Eagle CAD  ·  Solid Edge</w:t>
             </w:r>
           </w:p>
         </w:tc>
@@ -701,7 +1066,7 @@
                 <w:sz w:val="19"/>
                 <w:rFonts w:ascii="Calibri" w:hAnsi="Calibri" w:cs="Calibri"/>
               </w:rPr>
-              <w:t>AI, agents and automation</w:t>
+              <w:t>Documents and productivity</w:t>
             </w:r>
           </w:p>
         </w:tc>
@@ -722,7 +1087,7 @@
                 <w:sz w:val="19"/>
                 <w:rFonts w:ascii="Calibri" w:hAnsi="Calibri" w:cs="Calibri"/>
               </w:rPr>
-              <w:t>AI agent design, deployment and monitoring  ·  workflow and process automation  ·  third-party systems integration  ·  automated auditing and verification tooling  ·  Cursor  ·  Claude  ·  OpenAI GPT  ·  Codex</w:t>
+              <w:t>Microsoft Word  ·  Excel  ·  PowerPoint  ·  proposal, grant and investment writing  ·  technical writing  ·  document editing and design  ·  Windows, Linux and Android</w:t>
             </w:r>
           </w:p>
         </w:tc>
@@ -746,7 +1111,7 @@
                 <w:sz w:val="19"/>
                 <w:rFonts w:ascii="Calibri" w:hAnsi="Calibri" w:cs="Calibri"/>
               </w:rPr>
-              <w:t>Operating systems</w:t>
+              <w:t>Medical equipment</w:t>
             </w:r>
           </w:p>
         </w:tc>
@@ -768,97 +1133,7 @@
                 <w:sz w:val="19"/>
                 <w:rFonts w:ascii="Calibri" w:hAnsi="Calibri" w:cs="Calibri"/>
               </w:rPr>
-              <w:t>Windows  ·  Linux  ·  Android.  I administer, deploy and troubleshoot on all three.</w:t>
-            </w:r>
-          </w:p>
-        </w:tc>
-      </w:tr>
-      <w:tr>
-        <w:tc>
-          <w:tcPr>
-            <w:tcW w:type="dxa" w:w="2390"/>
-          </w:tcPr>
-          <w:p>
-            <w:pPr>
-              <w:spacing w:after="0" w:line="250" w:lineRule="auto"/>
-            </w:pPr>
-            <w:r>
-              <w:rPr>
-                <w:rFonts w:ascii="Calibri" w:hAnsi="Calibri"/>
-                <w:b/>
-                <w:i w:val="0"/>
-                <w:color w:val="0F2C4C"/>
-                <w:sz w:val="19"/>
-                <w:rFonts w:ascii="Calibri" w:hAnsi="Calibri" w:cs="Calibri"/>
-              </w:rPr>
-              <w:t>Engineering and scientific</w:t>
-            </w:r>
-          </w:p>
-        </w:tc>
-        <w:tc>
-          <w:tcPr>
-            <w:tcW w:type="dxa" w:w="7848"/>
-          </w:tcPr>
-          <w:p>
-            <w:pPr>
-              <w:spacing w:after="0" w:line="259" w:lineRule="auto"/>
-            </w:pPr>
-            <w:r>
-              <w:rPr>
-                <w:rFonts w:ascii="Calibri" w:hAnsi="Calibri"/>
-                <w:b w:val="0"/>
-                <w:i w:val="0"/>
-                <w:color w:val="23272B"/>
-                <w:sz w:val="19"/>
-                <w:rFonts w:ascii="Calibri" w:hAnsi="Calibri" w:cs="Calibri"/>
-              </w:rPr>
-              <w:t>Embedded systems design  ·  biosignal processing  ·  medical imaging  ·  biomedical modelling and simulation  ·  bioinformatics and functional genomics  ·  Proteus  ·  Eagle CAD  ·  Solid Edge</w:t>
-            </w:r>
-          </w:p>
-        </w:tc>
-      </w:tr>
-      <w:tr>
-        <w:tc>
-          <w:tcPr>
-            <w:tcW w:type="dxa" w:w="2390"/>
-            <w:shd w:val="clear" w:color="auto" w:fill="F3F6F9"/>
-          </w:tcPr>
-          <w:p>
-            <w:pPr>
-              <w:spacing w:after="0" w:line="250" w:lineRule="auto"/>
-            </w:pPr>
-            <w:r>
-              <w:rPr>
-                <w:rFonts w:ascii="Calibri" w:hAnsi="Calibri"/>
-                <w:b/>
-                <w:i w:val="0"/>
-                <w:color w:val="0F2C4C"/>
-                <w:sz w:val="19"/>
-                <w:rFonts w:ascii="Calibri" w:hAnsi="Calibri" w:cs="Calibri"/>
-              </w:rPr>
-              <w:t>Documents and productivity</w:t>
-            </w:r>
-          </w:p>
-        </w:tc>
-        <w:tc>
-          <w:tcPr>
-            <w:tcW w:type="dxa" w:w="7848"/>
-            <w:shd w:val="clear" w:color="auto" w:fill="F3F6F9"/>
-          </w:tcPr>
-          <w:p>
-            <w:pPr>
-              <w:spacing w:after="0" w:line="259" w:lineRule="auto"/>
-            </w:pPr>
-            <w:r>
-              <w:rPr>
-                <w:rFonts w:ascii="Calibri" w:hAnsi="Calibri"/>
-                <w:b w:val="0"/>
-                <w:i w:val="0"/>
-                <w:color w:val="23272B"/>
-                <w:sz w:val="19"/>
-                <w:rFonts w:ascii="Calibri" w:hAnsi="Calibri" w:cs="Calibri"/>
-              </w:rPr>
-              <w:t>Microsoft Word  ·  Excel  ·  PowerPoint  ·  technical writing  ·  proposal and grant development  ·  document editing and design  ·  report and dashboard production</w:t>
+              <w:t>CT and X-ray imaging  ·  ultrasound and C-arms  ·  ventilators, monitors and infusion pumps  ·  theatre and ICU systems  ·  haematology, chemistry and blood bank analysers  ·  neonatal incubators, phototherapy, foetal Dopplers and CTG  ·  oxygen plants, cylinder and manifold systems and piped medical gas  ·  RO water and sterilisation plant</w:t>
             </w:r>
           </w:p>
         </w:tc>
@@ -991,6 +1266,64 @@
           <w:sz w:val="19"/>
           <w:rFonts w:ascii="Calibri" w:hAnsi="Calibri" w:cs="Calibri"/>
         </w:rPr>
+        <w:t>I define the indicators, validation rules and data-quality checks behind FCHIP reporting, and I analyse the resulting data in Python and SQL so that management reporting rests on figures that have been checked.</w:t>
+      </w:r>
+    </w:p>
+    <w:p>
+      <w:pPr>
+        <w:spacing w:before="0" w:after="38" w:line="245" w:lineRule="auto"/>
+        <w:ind w:left="288" w:hanging="230"/>
+        <w:jc w:val="both"/>
+      </w:pPr>
+      <w:r>
+        <w:rPr>
+          <w:rFonts w:ascii="Calibri" w:hAnsi="Calibri"/>
+          <w:b/>
+          <w:i w:val="0"/>
+          <w:color w:val="1A6B5C"/>
+          <w:sz w:val="19"/>
+          <w:rFonts w:ascii="Calibri" w:hAnsi="Calibri" w:cs="Calibri"/>
+        </w:rPr>
+        <w:t xml:space="preserve">•   </w:t>
+      </w:r>
+      <w:r>
+        <w:rPr>
+          <w:rFonts w:ascii="Calibri" w:hAnsi="Calibri"/>
+          <w:b w:val="0"/>
+          <w:i w:val="0"/>
+          <w:color w:val="23272B"/>
+          <w:sz w:val="19"/>
+          <w:rFonts w:ascii="Calibri" w:hAnsi="Calibri" w:cs="Calibri"/>
+        </w:rPr>
+        <w:t>I write and edit the institutional proposals, grant applications, investment materials and partnership documents FairBanks submits, including the WA Foundation Category 2 full project proposal for FairBanks Community Health Reach. I chaired the FairBanks meeting with the Uganda Health Partners Cooperative on cooperative health insurance in July 2026.</w:t>
+      </w:r>
+    </w:p>
+    <w:p>
+      <w:pPr>
+        <w:spacing w:before="0" w:after="38" w:line="245" w:lineRule="auto"/>
+        <w:ind w:left="288" w:hanging="230"/>
+        <w:jc w:val="both"/>
+      </w:pPr>
+      <w:r>
+        <w:rPr>
+          <w:rFonts w:ascii="Calibri" w:hAnsi="Calibri"/>
+          <w:b/>
+          <w:i w:val="0"/>
+          <w:color w:val="1A6B5C"/>
+          <w:sz w:val="19"/>
+          <w:rFonts w:ascii="Calibri" w:hAnsi="Calibri" w:cs="Calibri"/>
+        </w:rPr>
+        <w:t xml:space="preserve">•   </w:t>
+      </w:r>
+      <w:r>
+        <w:rPr>
+          <w:rFonts w:ascii="Calibri" w:hAnsi="Calibri"/>
+          <w:b w:val="0"/>
+          <w:i w:val="0"/>
+          <w:color w:val="23272B"/>
+          <w:sz w:val="19"/>
+          <w:rFonts w:ascii="Calibri" w:hAnsi="Calibri" w:cs="Calibri"/>
+        </w:rPr>
         <w:t>I am building a cross-sector data collection and reporting application that turns work already being done into finished reports in real time, for accounting, research and laboratory science, biology, agriculture, social media and similar record-heavy fields.</w:t>
       </w:r>
     </w:p>
@@ -1020,36 +1353,7 @@
           <w:sz w:val="19"/>
           <w:rFonts w:ascii="Calibri" w:hAnsi="Calibri" w:cs="Calibri"/>
         </w:rPr>
-        <w:t>I architect and maintain the hospital and clinic software that clinical and administrative staff use daily, covering patient records, scheduling, referral tracking and management reporting.</w:t>
-      </w:r>
-    </w:p>
-    <w:p>
-      <w:pPr>
-        <w:spacing w:before="0" w:after="38" w:line="245" w:lineRule="auto"/>
-        <w:ind w:left="288" w:hanging="230"/>
-        <w:jc w:val="both"/>
-      </w:pPr>
-      <w:r>
-        <w:rPr>
-          <w:rFonts w:ascii="Calibri" w:hAnsi="Calibri"/>
-          <w:b/>
-          <w:i w:val="0"/>
-          <w:color w:val="1A6B5C"/>
-          <w:sz w:val="19"/>
-          <w:rFonts w:ascii="Calibri" w:hAnsi="Calibri" w:cs="Calibri"/>
-        </w:rPr>
-        <w:t xml:space="preserve">•   </w:t>
-      </w:r>
-      <w:r>
-        <w:rPr>
-          <w:rFonts w:ascii="Calibri" w:hAnsi="Calibri"/>
-          <w:b w:val="0"/>
-          <w:i w:val="0"/>
-          <w:color w:val="23272B"/>
-          <w:sz w:val="19"/>
-          <w:rFonts w:ascii="Calibri" w:hAnsi="Calibri" w:cs="Calibri"/>
-        </w:rPr>
-        <w:t>I design and deploy the AI agents and automation pipelines that remove manual handling from reception, appointment management, client follow-up and routine reporting.</w:t>
+        <w:t>I design and deploy the AI agents and automation pipelines that remove manual handling from reception, appointment management, client follow-up and routine reporting, and I architect and maintain the hospital and clinic software that staff use daily.</w:t>
       </w:r>
     </w:p>
     <w:p>
@@ -1079,35 +1383,6 @@
           <w:rFonts w:ascii="Calibri" w:hAnsi="Calibri" w:cs="Calibri"/>
         </w:rPr>
         <w:t>I own the technical documentation, the data-protection practice, the access control and the release management across the platform.</w:t>
-      </w:r>
-    </w:p>
-    <w:p>
-      <w:pPr>
-        <w:spacing w:before="0" w:after="38" w:line="245" w:lineRule="auto"/>
-        <w:ind w:left="288" w:hanging="230"/>
-        <w:jc w:val="both"/>
-      </w:pPr>
-      <w:r>
-        <w:rPr>
-          <w:rFonts w:ascii="Calibri" w:hAnsi="Calibri"/>
-          <w:b/>
-          <w:i w:val="0"/>
-          <w:color w:val="1A6B5C"/>
-          <w:sz w:val="19"/>
-          <w:rFonts w:ascii="Calibri" w:hAnsi="Calibri" w:cs="Calibri"/>
-        </w:rPr>
-        <w:t xml:space="preserve">•   </w:t>
-      </w:r>
-      <w:r>
-        <w:rPr>
-          <w:rFonts w:ascii="Calibri" w:hAnsi="Calibri"/>
-          <w:b w:val="0"/>
-          <w:i w:val="0"/>
-          <w:color w:val="23272B"/>
-          <w:sz w:val="19"/>
-          <w:rFonts w:ascii="Calibri" w:hAnsi="Calibri" w:cs="Calibri"/>
-        </w:rPr>
-        <w:t>I write and edit the institutional proposals, grant applications, partnership documents and investment materials, and I chaired the FairBanks meeting with the Uganda Health Partners Cooperative on cooperative health insurance in July 2026.</w:t>
       </w:r>
     </w:p>
     <w:p>
@@ -1248,35 +1523,6 @@
     </w:p>
     <w:p>
       <w:pPr>
-        <w:spacing w:before="0" w:after="38" w:line="245" w:lineRule="auto"/>
-        <w:ind w:left="288" w:hanging="230"/>
-        <w:jc w:val="both"/>
-      </w:pPr>
-      <w:r>
-        <w:rPr>
-          <w:rFonts w:ascii="Calibri" w:hAnsi="Calibri"/>
-          <w:b/>
-          <w:i w:val="0"/>
-          <w:color w:val="1A6B5C"/>
-          <w:sz w:val="19"/>
-          <w:rFonts w:ascii="Calibri" w:hAnsi="Calibri" w:cs="Calibri"/>
-        </w:rPr>
-        <w:t xml:space="preserve">•   </w:t>
-      </w:r>
-      <w:r>
-        <w:rPr>
-          <w:rFonts w:ascii="Calibri" w:hAnsi="Calibri"/>
-          <w:b w:val="0"/>
-          <w:i w:val="0"/>
-          <w:color w:val="23272B"/>
-          <w:sz w:val="19"/>
-          <w:rFonts w:ascii="Calibri" w:hAnsi="Calibri" w:cs="Calibri"/>
-        </w:rPr>
-        <w:t>I handle the preventive and corrective maintenance, the on-site fault diagnosis and the specification advice for procurement.</w:t>
-      </w:r>
-    </w:p>
-    <w:p>
-      <w:pPr>
         <w:keepNext/>
         <w:tabs>
           <w:tab w:pos="10238" w:val="right"/>
@@ -1379,7 +1625,7 @@
           <w:sz w:val="19"/>
           <w:rFonts w:ascii="Calibri" w:hAnsi="Calibri" w:cs="Calibri"/>
         </w:rPr>
-        <w:t>I oversaw the procurement, installation and commissioning of medical technologies, and I kept the programme documentation in line with healthcare technology standards.</w:t>
+        <w:t>I built and maintained the programme data: equipment registers, lifecycle records, procurement documentation and the routine reports that went to management.</w:t>
       </w:r>
     </w:p>
     <w:p>
@@ -1602,6 +1848,35 @@
           <w:sz w:val="19"/>
           <w:rFonts w:ascii="Calibri" w:hAnsi="Calibri" w:cs="Calibri"/>
         </w:rPr>
+        <w:t>I prepared and maintained the compliance evidence files reviewed for COHSASA accreditation, and I supported the hospital through successful accreditation.</w:t>
+      </w:r>
+    </w:p>
+    <w:p>
+      <w:pPr>
+        <w:spacing w:before="0" w:after="38" w:line="245" w:lineRule="auto"/>
+        <w:ind w:left="288" w:hanging="230"/>
+        <w:jc w:val="both"/>
+      </w:pPr>
+      <w:r>
+        <w:rPr>
+          <w:rFonts w:ascii="Calibri" w:hAnsi="Calibri"/>
+          <w:b/>
+          <w:i w:val="0"/>
+          <w:color w:val="1A6B5C"/>
+          <w:sz w:val="19"/>
+          <w:rFonts w:ascii="Calibri" w:hAnsi="Calibri" w:cs="Calibri"/>
+        </w:rPr>
+        <w:t xml:space="preserve">•   </w:t>
+      </w:r>
+      <w:r>
+        <w:rPr>
+          <w:rFonts w:ascii="Calibri" w:hAnsi="Calibri"/>
+          <w:b w:val="0"/>
+          <w:i w:val="0"/>
+          <w:color w:val="23272B"/>
+          <w:sz w:val="19"/>
+          <w:rFonts w:ascii="Calibri" w:hAnsi="Calibri" w:cs="Calibri"/>
+        </w:rPr>
         <w:t>I led the installation and commissioning of CT and X-ray imaging, oxygen plant, laboratory, theatre and ICU systems through to handover, and I trained the clinical users.</w:t>
       </w:r>
     </w:p>
@@ -1631,65 +1906,7 @@
           <w:sz w:val="19"/>
           <w:rFonts w:ascii="Calibri" w:hAnsi="Calibri" w:cs="Calibri"/>
         </w:rPr>
-        <w:t>I built the preventive maintenance schedules and service-record systems that reduced equipment downtime and kept devices safe for clinical use.</w:t>
-      </w:r>
-    </w:p>
-    <w:p>
-      <w:pPr>
-        <w:spacing w:before="0" w:after="38" w:line="245" w:lineRule="auto"/>
-        <w:ind w:left="288" w:hanging="230"/>
-        <w:jc w:val="both"/>
-      </w:pPr>
-      <w:r>
-        <w:rPr>
-          <w:rFonts w:ascii="Calibri" w:hAnsi="Calibri"/>
-          <w:b/>
-          <w:i w:val="0"/>
-          <w:color w:val="1A6B5C"/>
-          <w:sz w:val="19"/>
-          <w:rFonts w:ascii="Calibri" w:hAnsi="Calibri" w:cs="Calibri"/>
-        </w:rPr>
-        <w:t xml:space="preserve">•   </w:t>
-      </w:r>
-      <w:r>
-        <w:rPr>
-          <w:rFonts w:ascii="Calibri" w:hAnsi="Calibri"/>
-          <w:b w:val="0"/>
-          <w:i w:val="0"/>
-          <w:color w:val="23272B"/>
-          <w:sz w:val="19"/>
-          <w:rFonts w:ascii="Calibri" w:hAnsi="Calibri" w:cs="Calibri"/>
-        </w:rPr>
-        <w:t>I coordinated the procurement, technical specification, commissioning documentation and lifecycle management of hospital medical equipment.</w:t>
-      </w:r>
-    </w:p>
-    <w:p>
-      <w:pPr>
-        <w:spacing w:before="0" w:after="38" w:line="245" w:lineRule="auto"/>
-        <w:ind w:left="288" w:hanging="230"/>
-        <w:jc w:val="both"/>
-      </w:pPr>
-      <w:r>
-        <w:rPr>
-          <w:rFonts w:ascii="Calibri" w:hAnsi="Calibri"/>
-          <w:b/>
-          <w:i w:val="0"/>
-          <w:color w:val="1A6B5C"/>
-          <w:sz w:val="19"/>
-          <w:rFonts w:ascii="Calibri" w:hAnsi="Calibri" w:cs="Calibri"/>
-        </w:rPr>
-        <w:t xml:space="preserve">•   </w:t>
-      </w:r>
-      <w:r>
-        <w:rPr>
-          <w:rFonts w:ascii="Calibri" w:hAnsi="Calibri"/>
-          <w:b w:val="0"/>
-          <w:i w:val="0"/>
-          <w:color w:val="23272B"/>
-          <w:sz w:val="19"/>
-          <w:rFonts w:ascii="Calibri" w:hAnsi="Calibri" w:cs="Calibri"/>
-        </w:rPr>
-        <w:t>I prepared and maintained the compliance evidence files reviewed for COHSASA accreditation, and I supported the hospital through successful accreditation.</w:t>
+        <w:t>I built the preventive maintenance schedules and service-record systems that reduced equipment downtime, and I coordinated procurement, technical specification and lifecycle management of hospital medical equipment.</w:t>
       </w:r>
     </w:p>
     <w:p>
@@ -1767,36 +1984,7 @@
           <w:sz w:val="19"/>
           <w:rFonts w:ascii="Calibri" w:hAnsi="Calibri" w:cs="Calibri"/>
         </w:rPr>
-        <w:t>I maintained and serviced the hospital diagnostic and patient-monitoring equipment.</w:t>
-      </w:r>
-    </w:p>
-    <w:p>
-      <w:pPr>
-        <w:spacing w:before="0" w:after="38" w:line="245" w:lineRule="auto"/>
-        <w:ind w:left="288" w:hanging="230"/>
-        <w:jc w:val="both"/>
-      </w:pPr>
-      <w:r>
-        <w:rPr>
-          <w:rFonts w:ascii="Calibri" w:hAnsi="Calibri"/>
-          <w:b/>
-          <w:i w:val="0"/>
-          <w:color w:val="1A6B5C"/>
-          <w:sz w:val="19"/>
-          <w:rFonts w:ascii="Calibri" w:hAnsi="Calibri" w:cs="Calibri"/>
-        </w:rPr>
-        <w:t xml:space="preserve">•   </w:t>
-      </w:r>
-      <w:r>
-        <w:rPr>
-          <w:rFonts w:ascii="Calibri" w:hAnsi="Calibri"/>
-          <w:b w:val="0"/>
-          <w:i w:val="0"/>
-          <w:color w:val="23272B"/>
-          <w:sz w:val="19"/>
-          <w:rFonts w:ascii="Calibri" w:hAnsi="Calibri" w:cs="Calibri"/>
-        </w:rPr>
-        <w:t>I supported the installation and calibration of medical imaging and ICU equipment.</w:t>
+        <w:t>I maintained and serviced the hospital diagnostic and patient-monitoring equipment, and I supported the installation and calibration of imaging and ICU equipment.</w:t>
       </w:r>
     </w:p>
     <w:p>
@@ -1903,7 +2091,7 @@
           <w:sz w:val="19"/>
           <w:rFonts w:ascii="Calibri" w:hAnsi="Calibri" w:cs="Calibri"/>
         </w:rPr>
-        <w:t>I contributed to biomedical research projects and laboratory experimentation.</w:t>
+        <w:t>I carried out laboratory data analysis, mathematical modelling and research pipeline design in Python.</w:t>
       </w:r>
     </w:p>
     <w:p>
@@ -1932,7 +2120,7 @@
           <w:sz w:val="19"/>
           <w:rFonts w:ascii="Calibri" w:hAnsi="Calibri" w:cs="Calibri"/>
         </w:rPr>
-        <w:t>I carried out laboratory data analysis, mathematical modelling and research pipeline design in Python.</w:t>
+        <w:t>I contributed to biomedical research projects and laboratory experimentation, and I handled the recording, quality checking and documentation of research data so results could be reproduced.</w:t>
       </w:r>
     </w:p>
     <w:p>
@@ -2082,7 +2270,7 @@
           <w:sz w:val="20"/>
           <w:rFonts w:ascii="Calibri" w:hAnsi="Calibri" w:cs="Calibri"/>
         </w:rPr>
-        <w:t>FairBanks Community Health Intelligence Platform (FCHIP)</w:t>
+        <w:t>Institutional proposals, grants and investment materials</w:t>
       </w:r>
       <w:r>
         <w:rPr>
@@ -2111,7 +2299,7 @@
           <w:sz w:val="18"/>
           <w:rFonts w:ascii="Calibri" w:hAnsi="Calibri" w:cs="Calibri"/>
         </w:rPr>
-        <w:t>Lead Software Developer  ·  FairBanks Medical Centre Limited</w:t>
+        <w:t>Lead Writer  ·  FairBanks Medical Centre Limited</w:t>
       </w:r>
     </w:p>
     <w:p>
@@ -2128,73 +2316,7 @@
           <w:sz w:val="19"/>
           <w:rFonts w:ascii="Calibri" w:hAnsi="Calibri" w:cs="Calibri"/>
         </w:rPr>
-        <w:t>I build the community, screening, referral and follow-up data capture, the database structure, the cloud data flows, the management dashboards and the web and mobile delivery. I work in Next.js, TypeScript, React Native and cloud data services.</w:t>
-      </w:r>
-    </w:p>
-    <w:p>
-      <w:pPr>
-        <w:keepNext/>
-        <w:tabs>
-          <w:tab w:pos="10238" w:val="right"/>
-        </w:tabs>
-        <w:spacing w:before="120" w:after="0" w:line="245" w:lineRule="auto"/>
-      </w:pPr>
-      <w:r>
-        <w:rPr>
-          <w:rFonts w:ascii="Calibri" w:hAnsi="Calibri"/>
-          <w:b/>
-          <w:i w:val="0"/>
-          <w:color w:val="0F2C4C"/>
-          <w:sz w:val="20"/>
-          <w:rFonts w:ascii="Calibri" w:hAnsi="Calibri" w:cs="Calibri"/>
-        </w:rPr>
-        <w:t>Cross-sector data collection and reporting application</w:t>
-      </w:r>
-      <w:r>
-        <w:rPr>
-          <w:rFonts w:ascii="Calibri" w:hAnsi="Calibri"/>
-          <w:b/>
-          <w:i w:val="0"/>
-          <w:color w:val="1A6B5C"/>
-          <w:sz w:val="18"/>
-          <w:rFonts w:ascii="Calibri" w:hAnsi="Calibri" w:cs="Calibri"/>
-        </w:rPr>
-        <w:tab/>
-        <w:t>2026 to present</w:t>
-      </w:r>
-    </w:p>
-    <w:p>
-      <w:pPr>
-        <w:keepNext/>
-        <w:spacing w:before="0" w:after="40" w:line="245" w:lineRule="auto"/>
-      </w:pPr>
-      <w:r>
-        <w:rPr>
-          <w:rFonts w:ascii="Calibri" w:hAnsi="Calibri"/>
-          <w:b w:val="0"/>
-          <w:i/>
-          <w:color w:val="5A6472"/>
-          <w:sz w:val="18"/>
-          <w:rFonts w:ascii="Calibri" w:hAnsi="Calibri" w:cs="Calibri"/>
-        </w:rPr>
-        <w:t>Founder and Lead Developer  ·  In development</w:t>
-      </w:r>
-    </w:p>
-    <w:p>
-      <w:pPr>
-        <w:spacing w:before="0" w:after="40" w:line="245" w:lineRule="auto"/>
-        <w:jc w:val="both"/>
-      </w:pPr>
-      <w:r>
-        <w:rPr>
-          <w:rFonts w:ascii="Calibri" w:hAnsi="Calibri"/>
-          <w:b w:val="0"/>
-          <w:i w:val="0"/>
-          <w:color w:val="23272B"/>
-          <w:sz w:val="19"/>
-          <w:rFonts w:ascii="Calibri" w:hAnsi="Calibri" w:cs="Calibri"/>
-        </w:rPr>
-        <w:t>I am building an application that simplifies data collection and reporting for professions that live on records: accounting, research, biology and laboratory science, agriculture and social media among them. Rather than collecting data now and writing the report later, the user works inside the app and it generates the information and reports in real time as they go.</w:t>
+        <w:t>I write and edit what FairBanks submits: the WA Foundation Category 2 full project proposal for FairBanks Community Health Reach, accelerator and fellowship applications, investment proposals for the maternity and diagnostics projects, partnership documents and pitch decks. I handle the narrative, the annexes, the financial presentation and the evidence files, and I maintain the pipeline of opportunities and deadlines.</w:t>
       </w:r>
     </w:p>
     <w:p>
@@ -2524,737 +2646,9 @@
           <w:sz w:val="19"/>
           <w:rFonts w:ascii="Calibri" w:hAnsi="Calibri" w:cs="Calibri"/>
         </w:rPr>
-        <w:t>I built an Android and Arduino monitoring system for third-trimester foetal heart-rate measurement, and I implemented the Java serial communication between the device and the phone, with Microsoft Azure cloud storage.</w:t>
+        <w:t>I built an Android and Arduino monitoring system for third-trimester foetal heart-rate measurement, and I implemented the Java serial communication between device and phone, with Microsoft Azure cloud storage.</w:t>
       </w:r>
     </w:p>
-    <w:p>
-      <w:pPr>
-        <w:keepNext/>
-        <w:spacing w:before="160" w:after="80" w:line="245" w:lineRule="auto"/>
-        <w:ind w:left="158"/>
-        <w:pBdr>
-          <w:left w:val="single" w:sz="22" w:space="6" w:color="1A6B5C"/>
-          <w:bottom w:val="single" w:sz="4" w:space="4" w:color="CFD8E3"/>
-        </w:pBdr>
-      </w:pPr>
-      <w:r>
-        <w:rPr>
-          <w:rFonts w:ascii="Calibri" w:hAnsi="Calibri"/>
-          <w:b/>
-          <w:i w:val="0"/>
-          <w:color w:val="0F2C4C"/>
-          <w:sz w:val="21"/>
-          <w:rFonts w:ascii="Calibri" w:hAnsi="Calibri" w:cs="Calibri"/>
-          <w:spacing w:val="26"/>
-        </w:rPr>
-        <w:t>PROFESSIONAL COMPETENCIES</w:t>
-      </w:r>
-    </w:p>
-    <w:tbl>
-      <w:tblPr>
-        <w:tblW w:type="auto" w:w="0"/>
-        <w:jc w:val="left"/>
-        <w:tblLayout w:type="fixed"/>
-        <w:tblLook w:firstColumn="1" w:firstRow="1" w:lastColumn="0" w:lastRow="0" w:noHBand="0" w:noVBand="1" w:val="04A0"/>
-        <w:tblBorders>
-          <w:top w:val="none" w:sz="0"/>
-          <w:left w:val="none" w:sz="0"/>
-          <w:bottom w:val="none" w:sz="0"/>
-          <w:right w:val="none" w:sz="0"/>
-          <w:insideH w:val="none" w:sz="0"/>
-          <w:insideV w:val="none" w:sz="0"/>
-        </w:tblBorders>
-        <w:tblCellMar>
-          <w:top w:w="36" w:type="dxa"/>
-          <w:left w:w="85" w:type="dxa"/>
-          <w:bottom w:w="36" w:type="dxa"/>
-          <w:right w:w="85" w:type="dxa"/>
-        </w:tblCellMar>
-      </w:tblPr>
-      <w:tblGrid>
-        <w:gridCol w:w="5119"/>
-        <w:gridCol w:w="5119"/>
-      </w:tblGrid>
-      <w:tr>
-        <w:tc>
-          <w:tcPr>
-            <w:tcW w:type="dxa" w:w="2951"/>
-            <w:shd w:val="clear" w:color="auto" w:fill="F3F6F9"/>
-          </w:tcPr>
-          <w:p>
-            <w:pPr>
-              <w:spacing w:after="0" w:line="250" w:lineRule="auto"/>
-            </w:pPr>
-            <w:r>
-              <w:rPr>
-                <w:rFonts w:ascii="Calibri" w:hAnsi="Calibri"/>
-                <w:b/>
-                <w:i w:val="0"/>
-                <w:color w:val="0F2C4C"/>
-                <w:sz w:val="19"/>
-                <w:rFonts w:ascii="Calibri" w:hAnsi="Calibri" w:cs="Calibri"/>
-              </w:rPr>
-              <w:t>Programme and project management</w:t>
-            </w:r>
-          </w:p>
-        </w:tc>
-        <w:tc>
-          <w:tcPr>
-            <w:tcW w:type="dxa" w:w="7286"/>
-            <w:shd w:val="clear" w:color="auto" w:fill="F3F6F9"/>
-          </w:tcPr>
-          <w:p>
-            <w:pPr>
-              <w:spacing w:after="0" w:line="259" w:lineRule="auto"/>
-            </w:pPr>
-            <w:r>
-              <w:rPr>
-                <w:rFonts w:ascii="Calibri" w:hAnsi="Calibri"/>
-                <w:b w:val="0"/>
-                <w:i w:val="0"/>
-                <w:color w:val="23272B"/>
-                <w:sz w:val="19"/>
-                <w:rFonts w:ascii="Calibri" w:hAnsi="Calibri" w:cs="Calibri"/>
-              </w:rPr>
-              <w:t>I managed a regional biomedical team across East and Central Africa, and a hospital biomedical function for four years: workplans, schedules, procurement coordination and management reporting.</w:t>
-            </w:r>
-          </w:p>
-        </w:tc>
-      </w:tr>
-      <w:tr>
-        <w:tc>
-          <w:tcPr>
-            <w:tcW w:type="dxa" w:w="2951"/>
-          </w:tcPr>
-          <w:p>
-            <w:pPr>
-              <w:spacing w:after="0" w:line="250" w:lineRule="auto"/>
-            </w:pPr>
-            <w:r>
-              <w:rPr>
-                <w:rFonts w:ascii="Calibri" w:hAnsi="Calibri"/>
-                <w:b/>
-                <w:i w:val="0"/>
-                <w:color w:val="0F2C4C"/>
-                <w:sz w:val="19"/>
-                <w:rFonts w:ascii="Calibri" w:hAnsi="Calibri" w:cs="Calibri"/>
-              </w:rPr>
-              <w:t>Monitoring, evaluation and data</w:t>
-            </w:r>
-          </w:p>
-        </w:tc>
-        <w:tc>
-          <w:tcPr>
-            <w:tcW w:type="dxa" w:w="7286"/>
-          </w:tcPr>
-          <w:p>
-            <w:pPr>
-              <w:spacing w:after="0" w:line="259" w:lineRule="auto"/>
-            </w:pPr>
-            <w:r>
-              <w:rPr>
-                <w:rFonts w:ascii="Calibri" w:hAnsi="Calibri"/>
-                <w:b w:val="0"/>
-                <w:i w:val="0"/>
-                <w:color w:val="23272B"/>
-                <w:sz w:val="19"/>
-                <w:rFonts w:ascii="Calibri" w:hAnsi="Calibri" w:cs="Calibri"/>
-              </w:rPr>
-              <w:t>I lead the FCHIP indicator, data-quality, dashboard and reporting build. I built the equipment registers, maintenance schedules and routine management reports at IHK and GFF. I analyse in Python, SQL, Java, JavaScript and MATLAB.</w:t>
-            </w:r>
-          </w:p>
-        </w:tc>
-      </w:tr>
-      <w:tr>
-        <w:tc>
-          <w:tcPr>
-            <w:tcW w:type="dxa" w:w="2951"/>
-            <w:shd w:val="clear" w:color="auto" w:fill="F3F6F9"/>
-          </w:tcPr>
-          <w:p>
-            <w:pPr>
-              <w:spacing w:after="0" w:line="250" w:lineRule="auto"/>
-            </w:pPr>
-            <w:r>
-              <w:rPr>
-                <w:rFonts w:ascii="Calibri" w:hAnsi="Calibri"/>
-                <w:b/>
-                <w:i w:val="0"/>
-                <w:color w:val="0F2C4C"/>
-                <w:sz w:val="19"/>
-                <w:rFonts w:ascii="Calibri" w:hAnsi="Calibri" w:cs="Calibri"/>
-              </w:rPr>
-              <w:t>Proposal, grant and technical writing</w:t>
-            </w:r>
-          </w:p>
-        </w:tc>
-        <w:tc>
-          <w:tcPr>
-            <w:tcW w:type="dxa" w:w="7286"/>
-            <w:shd w:val="clear" w:color="auto" w:fill="F3F6F9"/>
-          </w:tcPr>
-          <w:p>
-            <w:pPr>
-              <w:spacing w:after="0" w:line="259" w:lineRule="auto"/>
-            </w:pPr>
-            <w:r>
-              <w:rPr>
-                <w:rFonts w:ascii="Calibri" w:hAnsi="Calibri"/>
-                <w:b w:val="0"/>
-                <w:i w:val="0"/>
-                <w:color w:val="23272B"/>
-                <w:sz w:val="19"/>
-                <w:rFonts w:ascii="Calibri" w:hAnsi="Calibri" w:cs="Calibri"/>
-              </w:rPr>
-              <w:t>I write and edit institutional proposals, grant applications, investment materials, partnership documents, technical documentation and user manuals.</w:t>
-            </w:r>
-          </w:p>
-        </w:tc>
-      </w:tr>
-      <w:tr>
-        <w:tc>
-          <w:tcPr>
-            <w:tcW w:type="dxa" w:w="2951"/>
-          </w:tcPr>
-          <w:p>
-            <w:pPr>
-              <w:spacing w:after="0" w:line="250" w:lineRule="auto"/>
-            </w:pPr>
-            <w:r>
-              <w:rPr>
-                <w:rFonts w:ascii="Calibri" w:hAnsi="Calibri"/>
-                <w:b/>
-                <w:i w:val="0"/>
-                <w:color w:val="0F2C4C"/>
-                <w:sz w:val="19"/>
-                <w:rFonts w:ascii="Calibri" w:hAnsi="Calibri" w:cs="Calibri"/>
-              </w:rPr>
-              <w:t>Data analysis and automated auditing</w:t>
-            </w:r>
-          </w:p>
-        </w:tc>
-        <w:tc>
-          <w:tcPr>
-            <w:tcW w:type="dxa" w:w="7286"/>
-          </w:tcPr>
-          <w:p>
-            <w:pPr>
-              <w:spacing w:after="0" w:line="259" w:lineRule="auto"/>
-            </w:pPr>
-            <w:r>
-              <w:rPr>
-                <w:rFonts w:ascii="Calibri" w:hAnsi="Calibri"/>
-                <w:b w:val="0"/>
-                <w:i w:val="0"/>
-                <w:color w:val="23272B"/>
-                <w:sz w:val="19"/>
-                <w:rFonts w:ascii="Calibri" w:hAnsi="Calibri" w:cs="Calibri"/>
-              </w:rPr>
-              <w:t>I clean, model and report on operational and clinical data, and I build automated auditing and verification tooling that checks records in bulk rather than by hand.</w:t>
-            </w:r>
-          </w:p>
-        </w:tc>
-      </w:tr>
-      <w:tr>
-        <w:tc>
-          <w:tcPr>
-            <w:tcW w:type="dxa" w:w="2951"/>
-            <w:shd w:val="clear" w:color="auto" w:fill="F3F6F9"/>
-          </w:tcPr>
-          <w:p>
-            <w:pPr>
-              <w:spacing w:after="0" w:line="250" w:lineRule="auto"/>
-            </w:pPr>
-            <w:r>
-              <w:rPr>
-                <w:rFonts w:ascii="Calibri" w:hAnsi="Calibri"/>
-                <w:b/>
-                <w:i w:val="0"/>
-                <w:color w:val="0F2C4C"/>
-                <w:sz w:val="19"/>
-                <w:rFonts w:ascii="Calibri" w:hAnsi="Calibri" w:cs="Calibri"/>
-              </w:rPr>
-              <w:t>Procurement, specification and compliance</w:t>
-            </w:r>
-          </w:p>
-        </w:tc>
-        <w:tc>
-          <w:tcPr>
-            <w:tcW w:type="dxa" w:w="7286"/>
-            <w:shd w:val="clear" w:color="auto" w:fill="F3F6F9"/>
-          </w:tcPr>
-          <w:p>
-            <w:pPr>
-              <w:spacing w:after="0" w:line="259" w:lineRule="auto"/>
-            </w:pPr>
-            <w:r>
-              <w:rPr>
-                <w:rFonts w:ascii="Calibri" w:hAnsi="Calibri"/>
-                <w:b w:val="0"/>
-                <w:i w:val="0"/>
-                <w:color w:val="23272B"/>
-                <w:sz w:val="19"/>
-                <w:rFonts w:ascii="Calibri" w:hAnsi="Calibri" w:cs="Calibri"/>
-              </w:rPr>
-              <w:t>I coordinated specification, procurement, commissioning and lifecycle documentation, and I kept the compliance evidence reviewed for COHSASA accreditation.</w:t>
-            </w:r>
-          </w:p>
-        </w:tc>
-      </w:tr>
-      <w:tr>
-        <w:tc>
-          <w:tcPr>
-            <w:tcW w:type="dxa" w:w="2951"/>
-          </w:tcPr>
-          <w:p>
-            <w:pPr>
-              <w:spacing w:after="0" w:line="250" w:lineRule="auto"/>
-            </w:pPr>
-            <w:r>
-              <w:rPr>
-                <w:rFonts w:ascii="Calibri" w:hAnsi="Calibri"/>
-                <w:b/>
-                <w:i w:val="0"/>
-                <w:color w:val="0F2C4C"/>
-                <w:sz w:val="19"/>
-                <w:rFonts w:ascii="Calibri" w:hAnsi="Calibri" w:cs="Calibri"/>
-              </w:rPr>
-              <w:t>Stakeholder and partnership management</w:t>
-            </w:r>
-          </w:p>
-        </w:tc>
-        <w:tc>
-          <w:tcPr>
-            <w:tcW w:type="dxa" w:w="7286"/>
-          </w:tcPr>
-          <w:p>
-            <w:pPr>
-              <w:spacing w:after="0" w:line="259" w:lineRule="auto"/>
-            </w:pPr>
-            <w:r>
-              <w:rPr>
-                <w:rFonts w:ascii="Calibri" w:hAnsi="Calibri"/>
-                <w:b w:val="0"/>
-                <w:i w:val="0"/>
-                <w:color w:val="23272B"/>
-                <w:sz w:val="19"/>
-                <w:rFonts w:ascii="Calibri" w:hAnsi="Calibri" w:cs="Calibri"/>
-              </w:rPr>
-              <w:t>I chair partner meetings and write them up, and I work with hospital departments, suppliers, trainees, accreditation assessors, donors and prospective partners.</w:t>
-            </w:r>
-          </w:p>
-        </w:tc>
-      </w:tr>
-      <w:tr>
-        <w:tc>
-          <w:tcPr>
-            <w:tcW w:type="dxa" w:w="2951"/>
-            <w:shd w:val="clear" w:color="auto" w:fill="F3F6F9"/>
-          </w:tcPr>
-          <w:p>
-            <w:pPr>
-              <w:spacing w:after="0" w:line="250" w:lineRule="auto"/>
-            </w:pPr>
-            <w:r>
-              <w:rPr>
-                <w:rFonts w:ascii="Calibri" w:hAnsi="Calibri"/>
-                <w:b/>
-                <w:i w:val="0"/>
-                <w:color w:val="0F2C4C"/>
-                <w:sz w:val="19"/>
-                <w:rFonts w:ascii="Calibri" w:hAnsi="Calibri" w:cs="Calibri"/>
-              </w:rPr>
-              <w:t>Training and capacity building</w:t>
-            </w:r>
-          </w:p>
-        </w:tc>
-        <w:tc>
-          <w:tcPr>
-            <w:tcW w:type="dxa" w:w="7286"/>
-            <w:shd w:val="clear" w:color="auto" w:fill="F3F6F9"/>
-          </w:tcPr>
-          <w:p>
-            <w:pPr>
-              <w:spacing w:after="0" w:line="259" w:lineRule="auto"/>
-            </w:pPr>
-            <w:r>
-              <w:rPr>
-                <w:rFonts w:ascii="Calibri" w:hAnsi="Calibri"/>
-                <w:b w:val="0"/>
-                <w:i w:val="0"/>
-                <w:color w:val="23272B"/>
-                <w:sz w:val="19"/>
-                <w:rFonts w:ascii="Calibri" w:hAnsi="Calibri" w:cs="Calibri"/>
-              </w:rPr>
-              <w:t>I trained biomedical engineers, technicians and clinical users across multiple facilities, and I taught undergraduate engineering laboratory practicals at Makerere University.</w:t>
-            </w:r>
-          </w:p>
-        </w:tc>
-      </w:tr>
-      <w:tr>
-        <w:tc>
-          <w:tcPr>
-            <w:tcW w:type="dxa" w:w="2951"/>
-          </w:tcPr>
-          <w:p>
-            <w:pPr>
-              <w:spacing w:after="0" w:line="250" w:lineRule="auto"/>
-            </w:pPr>
-            <w:r>
-              <w:rPr>
-                <w:rFonts w:ascii="Calibri" w:hAnsi="Calibri"/>
-                <w:b/>
-                <w:i w:val="0"/>
-                <w:color w:val="0F2C4C"/>
-                <w:sz w:val="19"/>
-                <w:rFonts w:ascii="Calibri" w:hAnsi="Calibri" w:cs="Calibri"/>
-              </w:rPr>
-              <w:t>Communication and adaptability</w:t>
-            </w:r>
-          </w:p>
-        </w:tc>
-        <w:tc>
-          <w:tcPr>
-            <w:tcW w:type="dxa" w:w="7286"/>
-          </w:tcPr>
-          <w:p>
-            <w:pPr>
-              <w:spacing w:after="0" w:line="259" w:lineRule="auto"/>
-            </w:pPr>
-            <w:r>
-              <w:rPr>
-                <w:rFonts w:ascii="Calibri" w:hAnsi="Calibri"/>
-                <w:b w:val="0"/>
-                <w:i w:val="0"/>
-                <w:color w:val="23272B"/>
-                <w:sz w:val="19"/>
-                <w:rFonts w:ascii="Calibri" w:hAnsi="Calibri" w:cs="Calibri"/>
-              </w:rPr>
-              <w:t>I write and speak clear English and I present comfortably to clinical, executive and donor audiences. I settle quickly into new countries, teams, codebases and equipment brands.</w:t>
-            </w:r>
-          </w:p>
-        </w:tc>
-      </w:tr>
-    </w:tbl>
-    <w:p>
-      <w:pPr>
-        <w:keepNext/>
-        <w:spacing w:before="160" w:after="80" w:line="245" w:lineRule="auto"/>
-        <w:ind w:left="158"/>
-        <w:pBdr>
-          <w:left w:val="single" w:sz="22" w:space="6" w:color="1A6B5C"/>
-          <w:bottom w:val="single" w:sz="4" w:space="4" w:color="CFD8E3"/>
-        </w:pBdr>
-      </w:pPr>
-      <w:r>
-        <w:rPr>
-          <w:rFonts w:ascii="Calibri" w:hAnsi="Calibri"/>
-          <w:b/>
-          <w:i w:val="0"/>
-          <w:color w:val="0F2C4C"/>
-          <w:sz w:val="21"/>
-          <w:rFonts w:ascii="Calibri" w:hAnsi="Calibri" w:cs="Calibri"/>
-          <w:spacing w:val="26"/>
-        </w:rPr>
-        <w:t>MEDICAL EQUIPMENT EXPERIENCE</w:t>
-      </w:r>
-    </w:p>
-    <w:tbl>
-      <w:tblPr>
-        <w:tblW w:type="auto" w:w="0"/>
-        <w:jc w:val="left"/>
-        <w:tblLayout w:type="fixed"/>
-        <w:tblLook w:firstColumn="1" w:firstRow="1" w:lastColumn="0" w:lastRow="0" w:noHBand="0" w:noVBand="1" w:val="04A0"/>
-        <w:tblBorders>
-          <w:top w:val="none" w:sz="0"/>
-          <w:left w:val="none" w:sz="0"/>
-          <w:bottom w:val="none" w:sz="0"/>
-          <w:right w:val="none" w:sz="0"/>
-          <w:insideH w:val="none" w:sz="0"/>
-          <w:insideV w:val="none" w:sz="0"/>
-        </w:tblBorders>
-        <w:tblCellMar>
-          <w:top w:w="36" w:type="dxa"/>
-          <w:left w:w="85" w:type="dxa"/>
-          <w:bottom w:w="36" w:type="dxa"/>
-          <w:right w:w="85" w:type="dxa"/>
-        </w:tblCellMar>
-      </w:tblPr>
-      <w:tblGrid>
-        <w:gridCol w:w="5119"/>
-        <w:gridCol w:w="5119"/>
-      </w:tblGrid>
-      <w:tr>
-        <w:tc>
-          <w:tcPr>
-            <w:tcW w:type="dxa" w:w="2534"/>
-            <w:shd w:val="clear" w:color="auto" w:fill="F3F6F9"/>
-          </w:tcPr>
-          <w:p>
-            <w:pPr>
-              <w:spacing w:after="0" w:line="250" w:lineRule="auto"/>
-            </w:pPr>
-            <w:r>
-              <w:rPr>
-                <w:rFonts w:ascii="Calibri" w:hAnsi="Calibri"/>
-                <w:b/>
-                <w:i w:val="0"/>
-                <w:color w:val="0F2C4C"/>
-                <w:sz w:val="19"/>
-                <w:rFonts w:ascii="Calibri" w:hAnsi="Calibri" w:cs="Calibri"/>
-              </w:rPr>
-              <w:t>Radiology and imaging</w:t>
-            </w:r>
-          </w:p>
-        </w:tc>
-        <w:tc>
-          <w:tcPr>
-            <w:tcW w:type="dxa" w:w="7704"/>
-            <w:shd w:val="clear" w:color="auto" w:fill="F3F6F9"/>
-          </w:tcPr>
-          <w:p>
-            <w:pPr>
-              <w:spacing w:after="0" w:line="259" w:lineRule="auto"/>
-            </w:pPr>
-            <w:r>
-              <w:rPr>
-                <w:rFonts w:ascii="Calibri" w:hAnsi="Calibri"/>
-                <w:b w:val="0"/>
-                <w:i w:val="0"/>
-                <w:color w:val="23272B"/>
-                <w:sz w:val="19"/>
-                <w:rFonts w:ascii="Calibri" w:hAnsi="Calibri" w:cs="Calibri"/>
-              </w:rPr>
-              <w:t>CT scanners  ·  X-ray machines  ·  ultrasound systems  ·  C-arms</w:t>
-            </w:r>
-          </w:p>
-        </w:tc>
-      </w:tr>
-      <w:tr>
-        <w:tc>
-          <w:tcPr>
-            <w:tcW w:type="dxa" w:w="2534"/>
-          </w:tcPr>
-          <w:p>
-            <w:pPr>
-              <w:spacing w:after="0" w:line="250" w:lineRule="auto"/>
-            </w:pPr>
-            <w:r>
-              <w:rPr>
-                <w:rFonts w:ascii="Calibri" w:hAnsi="Calibri"/>
-                <w:b/>
-                <w:i w:val="0"/>
-                <w:color w:val="0F2C4C"/>
-                <w:sz w:val="19"/>
-                <w:rFonts w:ascii="Calibri" w:hAnsi="Calibri" w:cs="Calibri"/>
-              </w:rPr>
-              <w:t>Theatre and intensive care</w:t>
-            </w:r>
-          </w:p>
-        </w:tc>
-        <w:tc>
-          <w:tcPr>
-            <w:tcW w:type="dxa" w:w="7704"/>
-          </w:tcPr>
-          <w:p>
-            <w:pPr>
-              <w:spacing w:after="0" w:line="259" w:lineRule="auto"/>
-            </w:pPr>
-            <w:r>
-              <w:rPr>
-                <w:rFonts w:ascii="Calibri" w:hAnsi="Calibri"/>
-                <w:b w:val="0"/>
-                <w:i w:val="0"/>
-                <w:color w:val="23272B"/>
-                <w:sz w:val="19"/>
-                <w:rFonts w:ascii="Calibri" w:hAnsi="Calibri" w:cs="Calibri"/>
-              </w:rPr>
-              <w:t>Theatre systems  ·  ventilators  ·  patient monitors  ·  infusion pumps  ·  critical-care devices</w:t>
-            </w:r>
-          </w:p>
-        </w:tc>
-      </w:tr>
-      <w:tr>
-        <w:tc>
-          <w:tcPr>
-            <w:tcW w:type="dxa" w:w="2534"/>
-            <w:shd w:val="clear" w:color="auto" w:fill="F3F6F9"/>
-          </w:tcPr>
-          <w:p>
-            <w:pPr>
-              <w:spacing w:after="0" w:line="250" w:lineRule="auto"/>
-            </w:pPr>
-            <w:r>
-              <w:rPr>
-                <w:rFonts w:ascii="Calibri" w:hAnsi="Calibri"/>
-                <w:b/>
-                <w:i w:val="0"/>
-                <w:color w:val="0F2C4C"/>
-                <w:sz w:val="19"/>
-                <w:rFonts w:ascii="Calibri" w:hAnsi="Calibri" w:cs="Calibri"/>
-              </w:rPr>
-              <w:t>Oxygen and medical gas</w:t>
-            </w:r>
-          </w:p>
-        </w:tc>
-        <w:tc>
-          <w:tcPr>
-            <w:tcW w:type="dxa" w:w="7704"/>
-            <w:shd w:val="clear" w:color="auto" w:fill="F3F6F9"/>
-          </w:tcPr>
-          <w:p>
-            <w:pPr>
-              <w:spacing w:after="0" w:line="259" w:lineRule="auto"/>
-            </w:pPr>
-            <w:r>
-              <w:rPr>
-                <w:rFonts w:ascii="Calibri" w:hAnsi="Calibri"/>
-                <w:b w:val="0"/>
-                <w:i w:val="0"/>
-                <w:color w:val="23272B"/>
-                <w:sz w:val="19"/>
-                <w:rFonts w:ascii="Calibri" w:hAnsi="Calibri" w:cs="Calibri"/>
-              </w:rPr>
-              <w:t>Oxygen plants  ·  concentrators  ·  cylinder and manifold systems  ·  piped medical gas  ·  oxygen demand and capacity calculation</w:t>
-            </w:r>
-          </w:p>
-        </w:tc>
-      </w:tr>
-      <w:tr>
-        <w:tc>
-          <w:tcPr>
-            <w:tcW w:type="dxa" w:w="2534"/>
-          </w:tcPr>
-          <w:p>
-            <w:pPr>
-              <w:spacing w:after="0" w:line="250" w:lineRule="auto"/>
-            </w:pPr>
-            <w:r>
-              <w:rPr>
-                <w:rFonts w:ascii="Calibri" w:hAnsi="Calibri"/>
-                <w:b/>
-                <w:i w:val="0"/>
-                <w:color w:val="0F2C4C"/>
-                <w:sz w:val="19"/>
-                <w:rFonts w:ascii="Calibri" w:hAnsi="Calibri" w:cs="Calibri"/>
-              </w:rPr>
-              <w:t>Laboratory</w:t>
-            </w:r>
-          </w:p>
-        </w:tc>
-        <w:tc>
-          <w:tcPr>
-            <w:tcW w:type="dxa" w:w="7704"/>
-          </w:tcPr>
-          <w:p>
-            <w:pPr>
-              <w:spacing w:after="0" w:line="259" w:lineRule="auto"/>
-            </w:pPr>
-            <w:r>
-              <w:rPr>
-                <w:rFonts w:ascii="Calibri" w:hAnsi="Calibri"/>
-                <w:b w:val="0"/>
-                <w:i w:val="0"/>
-                <w:color w:val="23272B"/>
-                <w:sz w:val="19"/>
-                <w:rFonts w:ascii="Calibri" w:hAnsi="Calibri" w:cs="Calibri"/>
-              </w:rPr>
-              <w:t>Haematology analysers  ·  clinical chemistry analysers  ·  blood bank and transfusion equipment</w:t>
-            </w:r>
-          </w:p>
-        </w:tc>
-      </w:tr>
-      <w:tr>
-        <w:tc>
-          <w:tcPr>
-            <w:tcW w:type="dxa" w:w="2534"/>
-            <w:shd w:val="clear" w:color="auto" w:fill="F3F6F9"/>
-          </w:tcPr>
-          <w:p>
-            <w:pPr>
-              <w:spacing w:after="0" w:line="250" w:lineRule="auto"/>
-            </w:pPr>
-            <w:r>
-              <w:rPr>
-                <w:rFonts w:ascii="Calibri" w:hAnsi="Calibri"/>
-                <w:b/>
-                <w:i w:val="0"/>
-                <w:color w:val="0F2C4C"/>
-                <w:sz w:val="19"/>
-                <w:rFonts w:ascii="Calibri" w:hAnsi="Calibri" w:cs="Calibri"/>
-              </w:rPr>
-              <w:t>Maternity and neonatal</w:t>
-            </w:r>
-          </w:p>
-        </w:tc>
-        <w:tc>
-          <w:tcPr>
-            <w:tcW w:type="dxa" w:w="7704"/>
-            <w:shd w:val="clear" w:color="auto" w:fill="F3F6F9"/>
-          </w:tcPr>
-          <w:p>
-            <w:pPr>
-              <w:spacing w:after="0" w:line="259" w:lineRule="auto"/>
-            </w:pPr>
-            <w:r>
-              <w:rPr>
-                <w:rFonts w:ascii="Calibri" w:hAnsi="Calibri"/>
-                <w:b w:val="0"/>
-                <w:i w:val="0"/>
-                <w:color w:val="23272B"/>
-                <w:sz w:val="19"/>
-                <w:rFonts w:ascii="Calibri" w:hAnsi="Calibri" w:cs="Calibri"/>
-              </w:rPr>
-              <w:t>Neonatal incubators  ·  phototherapy units  ·  foetal Dopplers  ·  CTG machines</w:t>
-            </w:r>
-          </w:p>
-        </w:tc>
-      </w:tr>
-      <w:tr>
-        <w:tc>
-          <w:tcPr>
-            <w:tcW w:type="dxa" w:w="2534"/>
-          </w:tcPr>
-          <w:p>
-            <w:pPr>
-              <w:spacing w:after="0" w:line="250" w:lineRule="auto"/>
-            </w:pPr>
-            <w:r>
-              <w:rPr>
-                <w:rFonts w:ascii="Calibri" w:hAnsi="Calibri"/>
-                <w:b/>
-                <w:i w:val="0"/>
-                <w:color w:val="0F2C4C"/>
-                <w:sz w:val="19"/>
-                <w:rFonts w:ascii="Calibri" w:hAnsi="Calibri" w:cs="Calibri"/>
-              </w:rPr>
-              <w:t>Support plant</w:t>
-            </w:r>
-          </w:p>
-        </w:tc>
-        <w:tc>
-          <w:tcPr>
-            <w:tcW w:type="dxa" w:w="7704"/>
-          </w:tcPr>
-          <w:p>
-            <w:pPr>
-              <w:spacing w:after="0" w:line="259" w:lineRule="auto"/>
-            </w:pPr>
-            <w:r>
-              <w:rPr>
-                <w:rFonts w:ascii="Calibri" w:hAnsi="Calibri"/>
-                <w:b w:val="0"/>
-                <w:i w:val="0"/>
-                <w:color w:val="23272B"/>
-                <w:sz w:val="19"/>
-                <w:rFonts w:ascii="Calibri" w:hAnsi="Calibri" w:cs="Calibri"/>
-              </w:rPr>
-              <w:t>RO water treatment systems  ·  sterilisation and autoclave equipment</w:t>
-            </w:r>
-          </w:p>
-        </w:tc>
-      </w:tr>
-    </w:tbl>
     <w:p>
       <w:pPr>
         <w:keepNext/>
@@ -3407,7 +2801,7 @@
           <w:sz w:val="18"/>
           <w:rFonts w:ascii="Calibri" w:hAnsi="Calibri" w:cs="Calibri"/>
         </w:rPr>
-        <w:t>Key course units: Information and Communication Technology, Computer OOP Principles, Software Engineering, Database Systems, Computer-Based Medical Systems, Embedded Systems, Biosignal Processing and Analysis, Medical Imaging, Biomedical Modelling and Simulation, Bioinformatics and Functional Genomics, Clinical Engineering, Research Methods, Principles of Management.</w:t>
+        <w:t>Research-relevant course units: Research Methods, Biomedical Modelling and Simulation, Biosignal Processing and Analysis, Bioinformatics and Functional Genomics, Database Systems and Software Engineering. I completed a full research project as part of the degree.</w:t>
       </w:r>
     </w:p>
     <w:p>

</xml_diff>